<commit_message>
docs(docs_chain): sync exports after HXC-1832..1838 (CLAUDE-3)
Co-Authored-By: Claude Opus 4.8 (1M context) <noreply@anthropic.com>
</commit_message>
<xml_diff>
--- a/docs/export/fixed.docx
+++ b/docs/export/fixed.docx
@@ -34,7 +34,7 @@
         <w:t xml:space="preserve"> </w:t>
       </w:r>
       <w:r>
-        <w:t xml:space="preserve">197</w:t>
+        <w:t xml:space="preserve">199</w:t>
       </w:r>
       <w:r>
         <w:t xml:space="preserve"> </w:t>
@@ -50,7 +50,7 @@
         <w:t xml:space="preserve"> </w:t>
       </w:r>
       <w:r>
-        <w:t xml:space="preserve">2026-06-14T18:36:45Z</w:t>
+        <w:t xml:space="preserve">2026-06-14T19:23:28Z</w:t>
       </w:r>
       <w:r>
         <w:t xml:space="preserve"> </w:t>
@@ -116,7 +116,7 @@
           <w:b/>
           <w:bCs/>
         </w:rPr>
-        <w:t xml:space="preserve">725</w:t>
+        <w:t xml:space="preserve">732</w:t>
       </w:r>
       <w:r>
         <w:t xml:space="preserve">.</w:t>
@@ -36957,6 +36957,405 @@
             </w:pPr>
             <w:r>
               <w:t xml:space="preserve">ad81091</w:t>
+            </w:r>
+          </w:p>
+        </w:tc>
+      </w:tr>
+      <w:tr>
+        <w:tc>
+          <w:tcPr/>
+          <w:p>
+            <w:pPr>
+              <w:pStyle w:val="Compact"/>
+            </w:pPr>
+            <w:r>
+              <w:t xml:space="preserve">HXC-1832</w:t>
+            </w:r>
+          </w:p>
+        </w:tc>
+        <w:tc>
+          <w:tcPr/>
+          <w:p>
+            <w:pPr>
+              <w:pStyle w:val="Compact"/>
+            </w:pPr>
+            <w:r>
+              <w:t xml:space="preserve">Bug</w:t>
+            </w:r>
+          </w:p>
+        </w:tc>
+        <w:tc>
+          <w:tcPr/>
+          <w:p>
+            <w:pPr>
+              <w:pStyle w:val="Compact"/>
+            </w:pPr>
+            <w:r>
+              <w:t xml:space="preserve">P2</w:t>
+            </w:r>
+          </w:p>
+        </w:tc>
+        <w:tc>
+          <w:tcPr/>
+          <w:p>
+            <w:pPr>
+              <w:pStyle w:val="Compact"/>
+            </w:pPr>
+            <w:r>
+              <w:t xml:space="preserve">retry: exponential/linear backoff overflows time.Duration -&gt; negative delay bypasses MaxDelay cap (hot loop)</w:t>
+            </w:r>
+          </w:p>
+        </w:tc>
+        <w:tc>
+          <w:tcPr/>
+          <w:p>
+            <w:pPr>
+              <w:pStyle w:val="Compact"/>
+            </w:pPr>
+            <w:r>
+              <w:t xml:space="preserve">4e6af81</w:t>
+            </w:r>
+          </w:p>
+        </w:tc>
+      </w:tr>
+      <w:tr>
+        <w:tc>
+          <w:tcPr/>
+          <w:p>
+            <w:pPr>
+              <w:pStyle w:val="Compact"/>
+            </w:pPr>
+            <w:r>
+              <w:t xml:space="preserve">HXC-1833</w:t>
+            </w:r>
+          </w:p>
+        </w:tc>
+        <w:tc>
+          <w:tcPr/>
+          <w:p>
+            <w:pPr>
+              <w:pStyle w:val="Compact"/>
+            </w:pPr>
+            <w:r>
+              <w:t xml:space="preserve">Task</w:t>
+            </w:r>
+          </w:p>
+        </w:tc>
+        <w:tc>
+          <w:tcPr/>
+          <w:p>
+            <w:pPr>
+              <w:pStyle w:val="Compact"/>
+            </w:pPr>
+            <w:r>
+              <w:t xml:space="preserve">P3</w:t>
+            </w:r>
+          </w:p>
+        </w:tc>
+        <w:tc>
+          <w:tcPr/>
+          <w:p>
+            <w:pPr>
+              <w:pStyle w:val="Compact"/>
+            </w:pPr>
+            <w:r>
+              <w:t xml:space="preserve">crypto: adversarial test, Ed25519/AES-GCM/PBKDF2 wrapper rejects tampered (no bug)</w:t>
+            </w:r>
+          </w:p>
+        </w:tc>
+        <w:tc>
+          <w:tcPr/>
+          <w:p>
+            <w:pPr>
+              <w:pStyle w:val="Compact"/>
+            </w:pPr>
+            <w:r>
+              <w:t xml:space="preserve">4e6af81</w:t>
+            </w:r>
+          </w:p>
+        </w:tc>
+      </w:tr>
+      <w:tr>
+        <w:tc>
+          <w:tcPr/>
+          <w:p>
+            <w:pPr>
+              <w:pStyle w:val="Compact"/>
+            </w:pPr>
+            <w:r>
+              <w:t xml:space="preserve">HXC-1834</w:t>
+            </w:r>
+          </w:p>
+        </w:tc>
+        <w:tc>
+          <w:tcPr/>
+          <w:p>
+            <w:pPr>
+              <w:pStyle w:val="Compact"/>
+            </w:pPr>
+            <w:r>
+              <w:t xml:space="preserve">Task</w:t>
+            </w:r>
+          </w:p>
+        </w:tc>
+        <w:tc>
+          <w:tcPr/>
+          <w:p>
+            <w:pPr>
+              <w:pStyle w:val="Compact"/>
+            </w:pPr>
+            <w:r>
+              <w:t xml:space="preserve">P3</w:t>
+            </w:r>
+          </w:p>
+        </w:tc>
+        <w:tc>
+          <w:tcPr/>
+          <w:p>
+            <w:pPr>
+              <w:pStyle w:val="Compact"/>
+            </w:pPr>
+            <w:r>
+              <w:t xml:space="preserve">workerpool: adversarial test, bounded pool correct (no bug)</w:t>
+            </w:r>
+          </w:p>
+        </w:tc>
+        <w:tc>
+          <w:tcPr/>
+          <w:p>
+            <w:pPr>
+              <w:pStyle w:val="Compact"/>
+            </w:pPr>
+            <w:r>
+              <w:t xml:space="preserve">4e6af81</w:t>
+            </w:r>
+          </w:p>
+        </w:tc>
+      </w:tr>
+      <w:tr>
+        <w:tc>
+          <w:tcPr/>
+          <w:p>
+            <w:pPr>
+              <w:pStyle w:val="Compact"/>
+            </w:pPr>
+            <w:r>
+              <w:t xml:space="preserve">HXC-1835</w:t>
+            </w:r>
+          </w:p>
+        </w:tc>
+        <w:tc>
+          <w:tcPr/>
+          <w:p>
+            <w:pPr>
+              <w:pStyle w:val="Compact"/>
+            </w:pPr>
+            <w:r>
+              <w:t xml:space="preserve">Bug</w:t>
+            </w:r>
+          </w:p>
+        </w:tc>
+        <w:tc>
+          <w:tcPr/>
+          <w:p>
+            <w:pPr>
+              <w:pStyle w:val="Compact"/>
+            </w:pPr>
+            <w:r>
+              <w:t xml:space="preserve">P1</w:t>
+            </w:r>
+          </w:p>
+        </w:tc>
+        <w:tc>
+          <w:tcPr/>
+          <w:p>
+            <w:pPr>
+              <w:pStyle w:val="Compact"/>
+            </w:pPr>
+            <w:r>
+              <w:t xml:space="preserve">tiersec: tierRank Sscanf admits malformed tier names -&gt; fail-open clearance grant</w:t>
+            </w:r>
+          </w:p>
+        </w:tc>
+        <w:tc>
+          <w:tcPr/>
+          <w:p>
+            <w:pPr>
+              <w:pStyle w:val="Compact"/>
+            </w:pPr>
+            <w:r>
+              <w:t xml:space="preserve">f898048</w:t>
+            </w:r>
+          </w:p>
+        </w:tc>
+      </w:tr>
+      <w:tr>
+        <w:tc>
+          <w:tcPr/>
+          <w:p>
+            <w:pPr>
+              <w:pStyle w:val="Compact"/>
+            </w:pPr>
+            <w:r>
+              <w:t xml:space="preserve">HXC-1836</w:t>
+            </w:r>
+          </w:p>
+        </w:tc>
+        <w:tc>
+          <w:tcPr/>
+          <w:p>
+            <w:pPr>
+              <w:pStyle w:val="Compact"/>
+            </w:pPr>
+            <w:r>
+              <w:t xml:space="preserve">Task</w:t>
+            </w:r>
+          </w:p>
+        </w:tc>
+        <w:tc>
+          <w:tcPr/>
+          <w:p>
+            <w:pPr>
+              <w:pStyle w:val="Compact"/>
+            </w:pPr>
+            <w:r>
+              <w:t xml:space="preserve">P3</w:t>
+            </w:r>
+          </w:p>
+        </w:tc>
+        <w:tc>
+          <w:tcPr/>
+          <w:p>
+            <w:pPr>
+              <w:pStyle w:val="Compact"/>
+            </w:pPr>
+            <w:r>
+              <w:t xml:space="preserve">tieredcache: adversarial test, LRU bound/eviction/recency correct (no bug)</w:t>
+            </w:r>
+          </w:p>
+        </w:tc>
+        <w:tc>
+          <w:tcPr/>
+          <w:p>
+            <w:pPr>
+              <w:pStyle w:val="Compact"/>
+            </w:pPr>
+            <w:r>
+              <w:t xml:space="preserve">f898048</w:t>
+            </w:r>
+          </w:p>
+        </w:tc>
+      </w:tr>
+      <w:tr>
+        <w:tc>
+          <w:tcPr/>
+          <w:p>
+            <w:pPr>
+              <w:pStyle w:val="Compact"/>
+            </w:pPr>
+            <w:r>
+              <w:t xml:space="preserve">HXC-1837</w:t>
+            </w:r>
+          </w:p>
+        </w:tc>
+        <w:tc>
+          <w:tcPr/>
+          <w:p>
+            <w:pPr>
+              <w:pStyle w:val="Compact"/>
+            </w:pPr>
+            <w:r>
+              <w:t xml:space="preserve">Task</w:t>
+            </w:r>
+          </w:p>
+        </w:tc>
+        <w:tc>
+          <w:tcPr/>
+          <w:p>
+            <w:pPr>
+              <w:pStyle w:val="Compact"/>
+            </w:pPr>
+            <w:r>
+              <w:t xml:space="preserve">P3</w:t>
+            </w:r>
+          </w:p>
+        </w:tc>
+        <w:tc>
+          <w:tcPr/>
+          <w:p>
+            <w:pPr>
+              <w:pStyle w:val="Compact"/>
+            </w:pPr>
+            <w:r>
+              <w:t xml:space="preserve">doublecrypt: adversarial test, mTLS-over-WireGuard tamper/auth enforced (no bug)</w:t>
+            </w:r>
+          </w:p>
+        </w:tc>
+        <w:tc>
+          <w:tcPr/>
+          <w:p>
+            <w:pPr>
+              <w:pStyle w:val="Compact"/>
+            </w:pPr>
+            <w:r>
+              <w:t xml:space="preserve">f898048</w:t>
+            </w:r>
+          </w:p>
+        </w:tc>
+      </w:tr>
+      <w:tr>
+        <w:tc>
+          <w:tcPr/>
+          <w:p>
+            <w:pPr>
+              <w:pStyle w:val="Compact"/>
+            </w:pPr>
+            <w:r>
+              <w:t xml:space="preserve">HXC-1838</w:t>
+            </w:r>
+          </w:p>
+        </w:tc>
+        <w:tc>
+          <w:tcPr/>
+          <w:p>
+            <w:pPr>
+              <w:pStyle w:val="Compact"/>
+            </w:pPr>
+            <w:r>
+              <w:t xml:space="preserve">Task</w:t>
+            </w:r>
+          </w:p>
+        </w:tc>
+        <w:tc>
+          <w:tcPr/>
+          <w:p>
+            <w:pPr>
+              <w:pStyle w:val="Compact"/>
+            </w:pPr>
+            <w:r>
+              <w:t xml:space="preserve">P3</w:t>
+            </w:r>
+          </w:p>
+        </w:tc>
+        <w:tc>
+          <w:tcPr/>
+          <w:p>
+            <w:pPr>
+              <w:pStyle w:val="Compact"/>
+            </w:pPr>
+            <w:r>
+              <w:t xml:space="preserve">covgate: adversarial test, threshold &gt;= boundary + NaN fail-closed (no bug)</w:t>
+            </w:r>
+          </w:p>
+        </w:tc>
+        <w:tc>
+          <w:tcPr/>
+          <w:p>
+            <w:pPr>
+              <w:pStyle w:val="Compact"/>
+            </w:pPr>
+            <w:r>
+              <w:t xml:space="preserve">f898048</w:t>
             </w:r>
           </w:p>
         </w:tc>

</xml_diff>

<commit_message>
docs(docs_chain): sync exports after HXC-1839..1858 (CLAUDE-3)
Co-Authored-By: Claude Opus 4.8 (1M context) <noreply@anthropic.com>
</commit_message>
<xml_diff>
--- a/docs/export/fixed.docx
+++ b/docs/export/fixed.docx
@@ -34,7 +34,7 @@
         <w:t xml:space="preserve"> </w:t>
       </w:r>
       <w:r>
-        <w:t xml:space="preserve">199</w:t>
+        <w:t xml:space="preserve">204</w:t>
       </w:r>
       <w:r>
         <w:t xml:space="preserve"> </w:t>
@@ -50,7 +50,7 @@
         <w:t xml:space="preserve"> </w:t>
       </w:r>
       <w:r>
-        <w:t xml:space="preserve">2026-06-14T19:23:28Z</w:t>
+        <w:t xml:space="preserve">2026-06-14T20:17:40Z</w:t>
       </w:r>
       <w:r>
         <w:t xml:space="preserve"> </w:t>
@@ -116,7 +116,7 @@
           <w:b/>
           <w:bCs/>
         </w:rPr>
-        <w:t xml:space="preserve">732</w:t>
+        <w:t xml:space="preserve">752</w:t>
       </w:r>
       <w:r>
         <w:t xml:space="preserve">.</w:t>
@@ -37356,6 +37356,1146 @@
             </w:pPr>
             <w:r>
               <w:t xml:space="preserve">f898048</w:t>
+            </w:r>
+          </w:p>
+        </w:tc>
+      </w:tr>
+      <w:tr>
+        <w:tc>
+          <w:tcPr/>
+          <w:p>
+            <w:pPr>
+              <w:pStyle w:val="Compact"/>
+            </w:pPr>
+            <w:r>
+              <w:t xml:space="preserve">HXC-1839</w:t>
+            </w:r>
+          </w:p>
+        </w:tc>
+        <w:tc>
+          <w:tcPr/>
+          <w:p>
+            <w:pPr>
+              <w:pStyle w:val="Compact"/>
+            </w:pPr>
+            <w:r>
+              <w:t xml:space="preserve">Bug</w:t>
+            </w:r>
+          </w:p>
+        </w:tc>
+        <w:tc>
+          <w:tcPr/>
+          <w:p>
+            <w:pPr>
+              <w:pStyle w:val="Compact"/>
+            </w:pPr>
+            <w:r>
+              <w:t xml:space="preserve">P1</w:t>
+            </w:r>
+          </w:p>
+        </w:tc>
+        <w:tc>
+          <w:tcPr/>
+          <w:p>
+            <w:pPr>
+              <w:pStyle w:val="Compact"/>
+            </w:pPr>
+            <w:r>
+              <w:t xml:space="preserve">qualitygate: NaN metric/threshold records no breach -&gt; CRITICAL gate PASSES on poisoned metric (fail-open, CLAUDE-1)</w:t>
+            </w:r>
+          </w:p>
+        </w:tc>
+        <w:tc>
+          <w:tcPr/>
+          <w:p>
+            <w:pPr>
+              <w:pStyle w:val="Compact"/>
+            </w:pPr>
+            <w:r>
+              <w:t xml:space="preserve">6866352</w:t>
+            </w:r>
+          </w:p>
+        </w:tc>
+      </w:tr>
+      <w:tr>
+        <w:tc>
+          <w:tcPr/>
+          <w:p>
+            <w:pPr>
+              <w:pStyle w:val="Compact"/>
+            </w:pPr>
+            <w:r>
+              <w:t xml:space="preserve">HXC-1840</w:t>
+            </w:r>
+          </w:p>
+        </w:tc>
+        <w:tc>
+          <w:tcPr/>
+          <w:p>
+            <w:pPr>
+              <w:pStyle w:val="Compact"/>
+            </w:pPr>
+            <w:r>
+              <w:t xml:space="preserve">Bug</w:t>
+            </w:r>
+          </w:p>
+        </w:tc>
+        <w:tc>
+          <w:tcPr/>
+          <w:p>
+            <w:pPr>
+              <w:pStyle w:val="Compact"/>
+            </w:pPr>
+            <w:r>
+              <w:t xml:space="preserve">P2</w:t>
+            </w:r>
+          </w:p>
+        </w:tc>
+        <w:tc>
+          <w:tcPr/>
+          <w:p>
+            <w:pPr>
+              <w:pStyle w:val="Compact"/>
+            </w:pPr>
+            <w:r>
+              <w:t xml:space="preserve">inference: 2 stale tests fail on main (encode retired internal/llm synthetic stub) -&gt; pkg suite RED</w:t>
+            </w:r>
+          </w:p>
+        </w:tc>
+        <w:tc>
+          <w:tcPr/>
+          <w:p>
+            <w:pPr>
+              <w:pStyle w:val="Compact"/>
+            </w:pPr>
+            <w:r>
+              <w:t xml:space="preserve">6866352</w:t>
+            </w:r>
+          </w:p>
+        </w:tc>
+      </w:tr>
+      <w:tr>
+        <w:tc>
+          <w:tcPr/>
+          <w:p>
+            <w:pPr>
+              <w:pStyle w:val="Compact"/>
+            </w:pPr>
+            <w:r>
+              <w:t xml:space="preserve">HXC-1841</w:t>
+            </w:r>
+          </w:p>
+        </w:tc>
+        <w:tc>
+          <w:tcPr/>
+          <w:p>
+            <w:pPr>
+              <w:pStyle w:val="Compact"/>
+            </w:pPr>
+            <w:r>
+              <w:t xml:space="preserve">Task</w:t>
+            </w:r>
+          </w:p>
+        </w:tc>
+        <w:tc>
+          <w:tcPr/>
+          <w:p>
+            <w:pPr>
+              <w:pStyle w:val="Compact"/>
+            </w:pPr>
+            <w:r>
+              <w:t xml:space="preserve">P3</w:t>
+            </w:r>
+          </w:p>
+        </w:tc>
+        <w:tc>
+          <w:tcPr/>
+          <w:p>
+            <w:pPr>
+              <w:pStyle w:val="Compact"/>
+            </w:pPr>
+            <w:r>
+              <w:t xml:space="preserve">pool: adversarial test, mutex-guarded pool no over-commit/double-handout (no bug)</w:t>
+            </w:r>
+          </w:p>
+        </w:tc>
+        <w:tc>
+          <w:tcPr/>
+          <w:p>
+            <w:pPr>
+              <w:pStyle w:val="Compact"/>
+            </w:pPr>
+            <w:r>
+              <w:t xml:space="preserve">6866352</w:t>
+            </w:r>
+          </w:p>
+        </w:tc>
+      </w:tr>
+      <w:tr>
+        <w:tc>
+          <w:tcPr/>
+          <w:p>
+            <w:pPr>
+              <w:pStyle w:val="Compact"/>
+            </w:pPr>
+            <w:r>
+              <w:t xml:space="preserve">HXC-1842</w:t>
+            </w:r>
+          </w:p>
+        </w:tc>
+        <w:tc>
+          <w:tcPr/>
+          <w:p>
+            <w:pPr>
+              <w:pStyle w:val="Compact"/>
+            </w:pPr>
+            <w:r>
+              <w:t xml:space="preserve">Task</w:t>
+            </w:r>
+          </w:p>
+        </w:tc>
+        <w:tc>
+          <w:tcPr/>
+          <w:p>
+            <w:pPr>
+              <w:pStyle w:val="Compact"/>
+            </w:pPr>
+            <w:r>
+              <w:t xml:space="preserve">P3</w:t>
+            </w:r>
+          </w:p>
+        </w:tc>
+        <w:tc>
+          <w:tcPr/>
+          <w:p>
+            <w:pPr>
+              <w:pStyle w:val="Compact"/>
+            </w:pPr>
+            <w:r>
+              <w:t xml:space="preserve">quantization: adversarial test, int-only VRAM estimate (no bug)</w:t>
+            </w:r>
+          </w:p>
+        </w:tc>
+        <w:tc>
+          <w:tcPr/>
+          <w:p>
+            <w:pPr>
+              <w:pStyle w:val="Compact"/>
+            </w:pPr>
+            <w:r>
+              <w:t xml:space="preserve">6866352</w:t>
+            </w:r>
+          </w:p>
+        </w:tc>
+      </w:tr>
+      <w:tr>
+        <w:tc>
+          <w:tcPr/>
+          <w:p>
+            <w:pPr>
+              <w:pStyle w:val="Compact"/>
+            </w:pPr>
+            <w:r>
+              <w:t xml:space="preserve">HXC-1843</w:t>
+            </w:r>
+          </w:p>
+        </w:tc>
+        <w:tc>
+          <w:tcPr/>
+          <w:p>
+            <w:pPr>
+              <w:pStyle w:val="Compact"/>
+            </w:pPr>
+            <w:r>
+              <w:t xml:space="preserve">Task</w:t>
+            </w:r>
+          </w:p>
+        </w:tc>
+        <w:tc>
+          <w:tcPr/>
+          <w:p>
+            <w:pPr>
+              <w:pStyle w:val="Compact"/>
+            </w:pPr>
+            <w:r>
+              <w:t xml:space="preserve">P3</w:t>
+            </w:r>
+          </w:p>
+        </w:tc>
+        <w:tc>
+          <w:tcPr/>
+          <w:p>
+            <w:pPr>
+              <w:pStyle w:val="Compact"/>
+            </w:pPr>
+            <w:r>
+              <w:t xml:space="preserve">raft: adversarial test, hashicorp/raft wrapper + local FSM safety pinned (no bug)</w:t>
+            </w:r>
+          </w:p>
+        </w:tc>
+        <w:tc>
+          <w:tcPr/>
+          <w:p>
+            <w:pPr>
+              <w:pStyle w:val="Compact"/>
+            </w:pPr>
+            <w:r>
+              <w:t xml:space="preserve">386489c</w:t>
+            </w:r>
+          </w:p>
+        </w:tc>
+      </w:tr>
+      <w:tr>
+        <w:tc>
+          <w:tcPr/>
+          <w:p>
+            <w:pPr>
+              <w:pStyle w:val="Compact"/>
+            </w:pPr>
+            <w:r>
+              <w:t xml:space="preserve">HXC-1844</w:t>
+            </w:r>
+          </w:p>
+        </w:tc>
+        <w:tc>
+          <w:tcPr/>
+          <w:p>
+            <w:pPr>
+              <w:pStyle w:val="Compact"/>
+            </w:pPr>
+            <w:r>
+              <w:t xml:space="preserve">Task</w:t>
+            </w:r>
+          </w:p>
+        </w:tc>
+        <w:tc>
+          <w:tcPr/>
+          <w:p>
+            <w:pPr>
+              <w:pStyle w:val="Compact"/>
+            </w:pPr>
+            <w:r>
+              <w:t xml:space="preserve">P3</w:t>
+            </w:r>
+          </w:p>
+        </w:tc>
+        <w:tc>
+          <w:tcPr/>
+          <w:p>
+            <w:pPr>
+              <w:pStyle w:val="Compact"/>
+            </w:pPr>
+            <w:r>
+              <w:t xml:space="preserve">device: adversarial test, deterministic classifier + real per-OS probe, CLAUDE-2 verified (no bug)</w:t>
+            </w:r>
+          </w:p>
+        </w:tc>
+        <w:tc>
+          <w:tcPr/>
+          <w:p>
+            <w:pPr>
+              <w:pStyle w:val="Compact"/>
+            </w:pPr>
+            <w:r>
+              <w:t xml:space="preserve">386489c</w:t>
+            </w:r>
+          </w:p>
+        </w:tc>
+      </w:tr>
+      <w:tr>
+        <w:tc>
+          <w:tcPr/>
+          <w:p>
+            <w:pPr>
+              <w:pStyle w:val="Compact"/>
+            </w:pPr>
+            <w:r>
+              <w:t xml:space="preserve">HXC-1845</w:t>
+            </w:r>
+          </w:p>
+        </w:tc>
+        <w:tc>
+          <w:tcPr/>
+          <w:p>
+            <w:pPr>
+              <w:pStyle w:val="Compact"/>
+            </w:pPr>
+            <w:r>
+              <w:t xml:space="preserve">Task</w:t>
+            </w:r>
+          </w:p>
+        </w:tc>
+        <w:tc>
+          <w:tcPr/>
+          <w:p>
+            <w:pPr>
+              <w:pStyle w:val="Compact"/>
+            </w:pPr>
+            <w:r>
+              <w:t xml:space="preserve">P3</w:t>
+            </w:r>
+          </w:p>
+        </w:tc>
+        <w:tc>
+          <w:tcPr/>
+          <w:p>
+            <w:pPr>
+              <w:pStyle w:val="Compact"/>
+            </w:pPr>
+            <w:r>
+              <w:t xml:space="preserve">dst: adversarial test, deterministic-simulation harness is genuinely deterministic (no bug)</w:t>
+            </w:r>
+          </w:p>
+        </w:tc>
+        <w:tc>
+          <w:tcPr/>
+          <w:p>
+            <w:pPr>
+              <w:pStyle w:val="Compact"/>
+            </w:pPr>
+            <w:r>
+              <w:t xml:space="preserve">386489c</w:t>
+            </w:r>
+          </w:p>
+        </w:tc>
+      </w:tr>
+      <w:tr>
+        <w:tc>
+          <w:tcPr/>
+          <w:p>
+            <w:pPr>
+              <w:pStyle w:val="Compact"/>
+            </w:pPr>
+            <w:r>
+              <w:t xml:space="preserve">HXC-1846</w:t>
+            </w:r>
+          </w:p>
+        </w:tc>
+        <w:tc>
+          <w:tcPr/>
+          <w:p>
+            <w:pPr>
+              <w:pStyle w:val="Compact"/>
+            </w:pPr>
+            <w:r>
+              <w:t xml:space="preserve">Task</w:t>
+            </w:r>
+          </w:p>
+        </w:tc>
+        <w:tc>
+          <w:tcPr/>
+          <w:p>
+            <w:pPr>
+              <w:pStyle w:val="Compact"/>
+            </w:pPr>
+            <w:r>
+              <w:t xml:space="preserve">P3</w:t>
+            </w:r>
+          </w:p>
+        </w:tc>
+        <w:tc>
+          <w:tcPr/>
+          <w:p>
+            <w:pPr>
+              <w:pStyle w:val="Compact"/>
+            </w:pPr>
+            <w:r>
+              <w:t xml:space="preserve">provider: adversarial test, pure HTTP adapter no selector/registry (no bug)</w:t>
+            </w:r>
+          </w:p>
+        </w:tc>
+        <w:tc>
+          <w:tcPr/>
+          <w:p>
+            <w:pPr>
+              <w:pStyle w:val="Compact"/>
+            </w:pPr>
+            <w:r>
+              <w:t xml:space="preserve">386489c</w:t>
+            </w:r>
+          </w:p>
+        </w:tc>
+      </w:tr>
+      <w:tr>
+        <w:tc>
+          <w:tcPr/>
+          <w:p>
+            <w:pPr>
+              <w:pStyle w:val="Compact"/>
+            </w:pPr>
+            <w:r>
+              <w:t xml:space="preserve">HXC-1847</w:t>
+            </w:r>
+          </w:p>
+        </w:tc>
+        <w:tc>
+          <w:tcPr/>
+          <w:p>
+            <w:pPr>
+              <w:pStyle w:val="Compact"/>
+            </w:pPr>
+            <w:r>
+              <w:t xml:space="preserve">Bug</w:t>
+            </w:r>
+          </w:p>
+        </w:tc>
+        <w:tc>
+          <w:tcPr/>
+          <w:p>
+            <w:pPr>
+              <w:pStyle w:val="Compact"/>
+            </w:pPr>
+            <w:r>
+              <w:t xml:space="preserve">P2</w:t>
+            </w:r>
+          </w:p>
+        </w:tc>
+        <w:tc>
+          <w:tcPr/>
+          <w:p>
+            <w:pPr>
+              <w:pStyle w:val="Compact"/>
+            </w:pPr>
+            <w:r>
+              <w:t xml:space="preserve">timefault: abs64(MinInt64) overflow misses max-skew detection -&gt; grants lease to faulty clock (split-brain)</w:t>
+            </w:r>
+          </w:p>
+        </w:tc>
+        <w:tc>
+          <w:tcPr/>
+          <w:p>
+            <w:pPr>
+              <w:pStyle w:val="Compact"/>
+            </w:pPr>
+            <w:r>
+              <w:t xml:space="preserve">1eabe72</w:t>
+            </w:r>
+          </w:p>
+        </w:tc>
+      </w:tr>
+      <w:tr>
+        <w:tc>
+          <w:tcPr/>
+          <w:p>
+            <w:pPr>
+              <w:pStyle w:val="Compact"/>
+            </w:pPr>
+            <w:r>
+              <w:t xml:space="preserve">HXC-1848</w:t>
+            </w:r>
+          </w:p>
+        </w:tc>
+        <w:tc>
+          <w:tcPr/>
+          <w:p>
+            <w:pPr>
+              <w:pStyle w:val="Compact"/>
+            </w:pPr>
+            <w:r>
+              <w:t xml:space="preserve">Task</w:t>
+            </w:r>
+          </w:p>
+        </w:tc>
+        <w:tc>
+          <w:tcPr/>
+          <w:p>
+            <w:pPr>
+              <w:pStyle w:val="Compact"/>
+            </w:pPr>
+            <w:r>
+              <w:t xml:space="preserve">P3</w:t>
+            </w:r>
+          </w:p>
+        </w:tc>
+        <w:tc>
+          <w:tcPr/>
+          <w:p>
+            <w:pPr>
+              <w:pStyle w:val="Compact"/>
+            </w:pPr>
+            <w:r>
+              <w:t xml:space="preserve">devicemap: adversarial concurrency test, pure stateless conversion (no bug)</w:t>
+            </w:r>
+          </w:p>
+        </w:tc>
+        <w:tc>
+          <w:tcPr/>
+          <w:p>
+            <w:pPr>
+              <w:pStyle w:val="Compact"/>
+            </w:pPr>
+            <w:r>
+              <w:t xml:space="preserve">1eabe72</w:t>
+            </w:r>
+          </w:p>
+        </w:tc>
+      </w:tr>
+      <w:tr>
+        <w:tc>
+          <w:tcPr/>
+          <w:p>
+            <w:pPr>
+              <w:pStyle w:val="Compact"/>
+            </w:pPr>
+            <w:r>
+              <w:t xml:space="preserve">HXC-1849</w:t>
+            </w:r>
+          </w:p>
+        </w:tc>
+        <w:tc>
+          <w:tcPr/>
+          <w:p>
+            <w:pPr>
+              <w:pStyle w:val="Compact"/>
+            </w:pPr>
+            <w:r>
+              <w:t xml:space="preserve">Task</w:t>
+            </w:r>
+          </w:p>
+        </w:tc>
+        <w:tc>
+          <w:tcPr/>
+          <w:p>
+            <w:pPr>
+              <w:pStyle w:val="Compact"/>
+            </w:pPr>
+            <w:r>
+              <w:t xml:space="preserve">P3</w:t>
+            </w:r>
+          </w:p>
+        </w:tc>
+        <w:tc>
+          <w:tcPr/>
+          <w:p>
+            <w:pPr>
+              <w:pStyle w:val="Compact"/>
+            </w:pPr>
+            <w:r>
+              <w:t xml:space="preserve">fedtopology: adversarial test, deterministic immutable topology (no bug)</w:t>
+            </w:r>
+          </w:p>
+        </w:tc>
+        <w:tc>
+          <w:tcPr/>
+          <w:p>
+            <w:pPr>
+              <w:pStyle w:val="Compact"/>
+            </w:pPr>
+            <w:r>
+              <w:t xml:space="preserve">1eabe72</w:t>
+            </w:r>
+          </w:p>
+        </w:tc>
+      </w:tr>
+      <w:tr>
+        <w:tc>
+          <w:tcPr/>
+          <w:p>
+            <w:pPr>
+              <w:pStyle w:val="Compact"/>
+            </w:pPr>
+            <w:r>
+              <w:t xml:space="preserve">HXC-1850</w:t>
+            </w:r>
+          </w:p>
+        </w:tc>
+        <w:tc>
+          <w:tcPr/>
+          <w:p>
+            <w:pPr>
+              <w:pStyle w:val="Compact"/>
+            </w:pPr>
+            <w:r>
+              <w:t xml:space="preserve">Task</w:t>
+            </w:r>
+          </w:p>
+        </w:tc>
+        <w:tc>
+          <w:tcPr/>
+          <w:p>
+            <w:pPr>
+              <w:pStyle w:val="Compact"/>
+            </w:pPr>
+            <w:r>
+              <w:t xml:space="preserve">P3</w:t>
+            </w:r>
+          </w:p>
+        </w:tc>
+        <w:tc>
+          <w:tcPr/>
+          <w:p>
+            <w:pPr>
+              <w:pStyle w:val="Compact"/>
+            </w:pPr>
+            <w:r>
+              <w:t xml:space="preserve">thermalwarm: adversarial test, duration-based warm-up boundary correct (no bug)</w:t>
+            </w:r>
+          </w:p>
+        </w:tc>
+        <w:tc>
+          <w:tcPr/>
+          <w:p>
+            <w:pPr>
+              <w:pStyle w:val="Compact"/>
+            </w:pPr>
+            <w:r>
+              <w:t xml:space="preserve">1eabe72</w:t>
+            </w:r>
+          </w:p>
+        </w:tc>
+      </w:tr>
+      <w:tr>
+        <w:tc>
+          <w:tcPr/>
+          <w:p>
+            <w:pPr>
+              <w:pStyle w:val="Compact"/>
+            </w:pPr>
+            <w:r>
+              <w:t xml:space="preserve">HXC-1851</w:t>
+            </w:r>
+          </w:p>
+        </w:tc>
+        <w:tc>
+          <w:tcPr/>
+          <w:p>
+            <w:pPr>
+              <w:pStyle w:val="Compact"/>
+            </w:pPr>
+            <w:r>
+              <w:t xml:space="preserve">Bug</w:t>
+            </w:r>
+          </w:p>
+        </w:tc>
+        <w:tc>
+          <w:tcPr/>
+          <w:p>
+            <w:pPr>
+              <w:pStyle w:val="Compact"/>
+            </w:pPr>
+            <w:r>
+              <w:t xml:space="preserve">P2</w:t>
+            </w:r>
+          </w:p>
+        </w:tc>
+        <w:tc>
+          <w:tcPr/>
+          <w:p>
+            <w:pPr>
+              <w:pStyle w:val="Compact"/>
+            </w:pPr>
+            <w:r>
+              <w:t xml:space="preserve">tracing: Span.Duration() ignores endTime -&gt; finished span duration grows with wall-clock (wrong latency)</w:t>
+            </w:r>
+          </w:p>
+        </w:tc>
+        <w:tc>
+          <w:tcPr/>
+          <w:p>
+            <w:pPr>
+              <w:pStyle w:val="Compact"/>
+            </w:pPr>
+            <w:r>
+              <w:t xml:space="preserve">204f871</w:t>
+            </w:r>
+          </w:p>
+        </w:tc>
+      </w:tr>
+      <w:tr>
+        <w:tc>
+          <w:tcPr/>
+          <w:p>
+            <w:pPr>
+              <w:pStyle w:val="Compact"/>
+            </w:pPr>
+            <w:r>
+              <w:t xml:space="preserve">HXC-1852</w:t>
+            </w:r>
+          </w:p>
+        </w:tc>
+        <w:tc>
+          <w:tcPr/>
+          <w:p>
+            <w:pPr>
+              <w:pStyle w:val="Compact"/>
+            </w:pPr>
+            <w:r>
+              <w:t xml:space="preserve">Bug</w:t>
+            </w:r>
+          </w:p>
+        </w:tc>
+        <w:tc>
+          <w:tcPr/>
+          <w:p>
+            <w:pPr>
+              <w:pStyle w:val="Compact"/>
+            </w:pPr>
+            <w:r>
+              <w:t xml:space="preserve">P2</w:t>
+            </w:r>
+          </w:p>
+        </w:tc>
+        <w:tc>
+          <w:tcPr/>
+          <w:p>
+            <w:pPr>
+              <w:pStyle w:val="Compact"/>
+            </w:pPr>
+            <w:r>
+              <w:t xml:space="preserve">agentprovision: ModeManager.Submit no duplicate-ID guard -&gt; double-provision + silent live-job eviction</w:t>
+            </w:r>
+          </w:p>
+        </w:tc>
+        <w:tc>
+          <w:tcPr/>
+          <w:p>
+            <w:pPr>
+              <w:pStyle w:val="Compact"/>
+            </w:pPr>
+            <w:r>
+              <w:t xml:space="preserve">204f871</w:t>
+            </w:r>
+          </w:p>
+        </w:tc>
+      </w:tr>
+      <w:tr>
+        <w:tc>
+          <w:tcPr/>
+          <w:p>
+            <w:pPr>
+              <w:pStyle w:val="Compact"/>
+            </w:pPr>
+            <w:r>
+              <w:t xml:space="preserve">HXC-1853</w:t>
+            </w:r>
+          </w:p>
+        </w:tc>
+        <w:tc>
+          <w:tcPr/>
+          <w:p>
+            <w:pPr>
+              <w:pStyle w:val="Compact"/>
+            </w:pPr>
+            <w:r>
+              <w:t xml:space="preserve">Task</w:t>
+            </w:r>
+          </w:p>
+        </w:tc>
+        <w:tc>
+          <w:tcPr/>
+          <w:p>
+            <w:pPr>
+              <w:pStyle w:val="Compact"/>
+            </w:pPr>
+            <w:r>
+              <w:t xml:space="preserve">P3</w:t>
+            </w:r>
+          </w:p>
+        </w:tc>
+        <w:tc>
+          <w:tcPr/>
+          <w:p>
+            <w:pPr>
+              <w:pStyle w:val="Compact"/>
+            </w:pPr>
+            <w:r>
+              <w:t xml:space="preserve">chaosexp: adversarial test, conservation + determinism (no bug)</w:t>
+            </w:r>
+          </w:p>
+        </w:tc>
+        <w:tc>
+          <w:tcPr/>
+          <w:p>
+            <w:pPr>
+              <w:pStyle w:val="Compact"/>
+            </w:pPr>
+            <w:r>
+              <w:t xml:space="preserve">204f871</w:t>
+            </w:r>
+          </w:p>
+        </w:tc>
+      </w:tr>
+      <w:tr>
+        <w:tc>
+          <w:tcPr/>
+          <w:p>
+            <w:pPr>
+              <w:pStyle w:val="Compact"/>
+            </w:pPr>
+            <w:r>
+              <w:t xml:space="preserve">HXC-1854</w:t>
+            </w:r>
+          </w:p>
+        </w:tc>
+        <w:tc>
+          <w:tcPr/>
+          <w:p>
+            <w:pPr>
+              <w:pStyle w:val="Compact"/>
+            </w:pPr>
+            <w:r>
+              <w:t xml:space="preserve">Task</w:t>
+            </w:r>
+          </w:p>
+        </w:tc>
+        <w:tc>
+          <w:tcPr/>
+          <w:p>
+            <w:pPr>
+              <w:pStyle w:val="Compact"/>
+            </w:pPr>
+            <w:r>
+              <w:t xml:space="preserve">P3</w:t>
+            </w:r>
+          </w:p>
+        </w:tc>
+        <w:tc>
+          <w:tcPr/>
+          <w:p>
+            <w:pPr>
+              <w:pStyle w:val="Compact"/>
+            </w:pPr>
+            <w:r>
+              <w:t xml:space="preserve">errors: adversarial test, Is/As wrap-chain + Wrap(nil)==nil (no bug)</w:t>
+            </w:r>
+          </w:p>
+        </w:tc>
+        <w:tc>
+          <w:tcPr/>
+          <w:p>
+            <w:pPr>
+              <w:pStyle w:val="Compact"/>
+            </w:pPr>
+            <w:r>
+              <w:t xml:space="preserve">204f871</w:t>
+            </w:r>
+          </w:p>
+        </w:tc>
+      </w:tr>
+      <w:tr>
+        <w:tc>
+          <w:tcPr/>
+          <w:p>
+            <w:pPr>
+              <w:pStyle w:val="Compact"/>
+            </w:pPr>
+            <w:r>
+              <w:t xml:space="preserve">HXC-1855</w:t>
+            </w:r>
+          </w:p>
+        </w:tc>
+        <w:tc>
+          <w:tcPr/>
+          <w:p>
+            <w:pPr>
+              <w:pStyle w:val="Compact"/>
+            </w:pPr>
+            <w:r>
+              <w:t xml:space="preserve">Bug</w:t>
+            </w:r>
+          </w:p>
+        </w:tc>
+        <w:tc>
+          <w:tcPr/>
+          <w:p>
+            <w:pPr>
+              <w:pStyle w:val="Compact"/>
+            </w:pPr>
+            <w:r>
+              <w:t xml:space="preserve">P1</w:t>
+            </w:r>
+          </w:p>
+        </w:tc>
+        <w:tc>
+          <w:tcPr/>
+          <w:p>
+            <w:pPr>
+              <w:pStyle w:val="Compact"/>
+            </w:pPr>
+            <w:r>
+              <w:t xml:space="preserve">swim: handleDead lacks self-target guard -&gt; node accepts death rumour about itself (self-denial of liveness)</w:t>
+            </w:r>
+          </w:p>
+        </w:tc>
+        <w:tc>
+          <w:tcPr/>
+          <w:p>
+            <w:pPr>
+              <w:pStyle w:val="Compact"/>
+            </w:pPr>
+            <w:r>
+              <w:t xml:space="preserve">442090c</w:t>
+            </w:r>
+          </w:p>
+        </w:tc>
+      </w:tr>
+      <w:tr>
+        <w:tc>
+          <w:tcPr/>
+          <w:p>
+            <w:pPr>
+              <w:pStyle w:val="Compact"/>
+            </w:pPr>
+            <w:r>
+              <w:t xml:space="preserve">HXC-1856</w:t>
+            </w:r>
+          </w:p>
+        </w:tc>
+        <w:tc>
+          <w:tcPr/>
+          <w:p>
+            <w:pPr>
+              <w:pStyle w:val="Compact"/>
+            </w:pPr>
+            <w:r>
+              <w:t xml:space="preserve">Bug</w:t>
+            </w:r>
+          </w:p>
+        </w:tc>
+        <w:tc>
+          <w:tcPr/>
+          <w:p>
+            <w:pPr>
+              <w:pStyle w:val="Compact"/>
+            </w:pPr>
+            <w:r>
+              <w:t xml:space="preserve">P2</w:t>
+            </w:r>
+          </w:p>
+        </w:tc>
+        <w:tc>
+          <w:tcPr/>
+          <w:p>
+            <w:pPr>
+              <w:pStyle w:val="Compact"/>
+            </w:pPr>
+            <w:r>
+              <w:t xml:space="preserve">build: Job.clone() aliases BuildArgs map despite documented deep-copy -&gt; snapshot mutation corrupts canonical job</w:t>
+            </w:r>
+          </w:p>
+        </w:tc>
+        <w:tc>
+          <w:tcPr/>
+          <w:p>
+            <w:pPr>
+              <w:pStyle w:val="Compact"/>
+            </w:pPr>
+            <w:r>
+              <w:t xml:space="preserve">442090c</w:t>
+            </w:r>
+          </w:p>
+        </w:tc>
+      </w:tr>
+      <w:tr>
+        <w:tc>
+          <w:tcPr/>
+          <w:p>
+            <w:pPr>
+              <w:pStyle w:val="Compact"/>
+            </w:pPr>
+            <w:r>
+              <w:t xml:space="preserve">HXC-1857</w:t>
+            </w:r>
+          </w:p>
+        </w:tc>
+        <w:tc>
+          <w:tcPr/>
+          <w:p>
+            <w:pPr>
+              <w:pStyle w:val="Compact"/>
+            </w:pPr>
+            <w:r>
+              <w:t xml:space="preserve">Task</w:t>
+            </w:r>
+          </w:p>
+        </w:tc>
+        <w:tc>
+          <w:tcPr/>
+          <w:p>
+            <w:pPr>
+              <w:pStyle w:val="Compact"/>
+            </w:pPr>
+            <w:r>
+              <w:t xml:space="preserve">P3</w:t>
+            </w:r>
+          </w:p>
+        </w:tc>
+        <w:tc>
+          <w:tcPr/>
+          <w:p>
+            <w:pPr>
+              <w:pStyle w:val="Compact"/>
+            </w:pPr>
+            <w:r>
+              <w:t xml:space="preserve">log: adversarial test, slog shared-mutex concurrent integrity (no bug)</w:t>
+            </w:r>
+          </w:p>
+        </w:tc>
+        <w:tc>
+          <w:tcPr/>
+          <w:p>
+            <w:pPr>
+              <w:pStyle w:val="Compact"/>
+            </w:pPr>
+            <w:r>
+              <w:t xml:space="preserve">442090c</w:t>
+            </w:r>
+          </w:p>
+        </w:tc>
+      </w:tr>
+      <w:tr>
+        <w:tc>
+          <w:tcPr/>
+          <w:p>
+            <w:pPr>
+              <w:pStyle w:val="Compact"/>
+            </w:pPr>
+            <w:r>
+              <w:t xml:space="preserve">HXC-1858</w:t>
+            </w:r>
+          </w:p>
+        </w:tc>
+        <w:tc>
+          <w:tcPr/>
+          <w:p>
+            <w:pPr>
+              <w:pStyle w:val="Compact"/>
+            </w:pPr>
+            <w:r>
+              <w:t xml:space="preserve">Task</w:t>
+            </w:r>
+          </w:p>
+        </w:tc>
+        <w:tc>
+          <w:tcPr/>
+          <w:p>
+            <w:pPr>
+              <w:pStyle w:val="Compact"/>
+            </w:pPr>
+            <w:r>
+              <w:t xml:space="preserve">P3</w:t>
+            </w:r>
+          </w:p>
+        </w:tc>
+        <w:tc>
+          <w:tcPr/>
+          <w:p>
+            <w:pPr>
+              <w:pStyle w:val="Compact"/>
+            </w:pPr>
+            <w:r>
+              <w:t xml:space="preserve">bootstrap: adversarial test, peer-rendezvous deterministic + no fail-open (no bug)</w:t>
+            </w:r>
+          </w:p>
+        </w:tc>
+        <w:tc>
+          <w:tcPr/>
+          <w:p>
+            <w:pPr>
+              <w:pStyle w:val="Compact"/>
+            </w:pPr>
+            <w:r>
+              <w:t xml:space="preserve">442090c</w:t>
             </w:r>
           </w:p>
         </w:tc>

</xml_diff>

<commit_message>
docs(docs_chain): sync exports after HXC-1872..1883 (CLAUDE-3)
Co-Authored-By: Claude Opus 4.8 (1M context) <noreply@anthropic.com>
</commit_message>
<xml_diff>
--- a/docs/export/fixed.docx
+++ b/docs/export/fixed.docx
@@ -34,7 +34,7 @@
         <w:t xml:space="preserve"> </w:t>
       </w:r>
       <w:r>
-        <w:t xml:space="preserve">204</w:t>
+        <w:t xml:space="preserve">211</w:t>
       </w:r>
       <w:r>
         <w:t xml:space="preserve"> </w:t>
@@ -50,7 +50,7 @@
         <w:t xml:space="preserve"> </w:t>
       </w:r>
       <w:r>
-        <w:t xml:space="preserve">2026-06-14T20:17:40Z</w:t>
+        <w:t xml:space="preserve">2026-06-16T15:17:22Z</w:t>
       </w:r>
       <w:r>
         <w:t xml:space="preserve"> </w:t>
@@ -116,7 +116,7 @@
           <w:b/>
           <w:bCs/>
         </w:rPr>
-        <w:t xml:space="preserve">752</w:t>
+        <w:t xml:space="preserve">777</w:t>
       </w:r>
       <w:r>
         <w:t xml:space="preserve">.</w:t>
@@ -38496,6 +38496,1443 @@
             </w:pPr>
             <w:r>
               <w:t xml:space="preserve">442090c</w:t>
+            </w:r>
+          </w:p>
+        </w:tc>
+      </w:tr>
+      <w:tr>
+        <w:tc>
+          <w:tcPr/>
+          <w:p>
+            <w:pPr>
+              <w:pStyle w:val="Compact"/>
+            </w:pPr>
+            <w:r>
+              <w:t xml:space="preserve">HXC-1859</w:t>
+            </w:r>
+          </w:p>
+        </w:tc>
+        <w:tc>
+          <w:tcPr/>
+          <w:p>
+            <w:pPr>
+              <w:pStyle w:val="Compact"/>
+            </w:pPr>
+            <w:r>
+              <w:t xml:space="preserve">Task</w:t>
+            </w:r>
+          </w:p>
+        </w:tc>
+        <w:tc>
+          <w:tcPr/>
+          <w:p>
+            <w:pPr>
+              <w:pStyle w:val="Compact"/>
+            </w:pPr>
+            <w:r>
+              <w:t xml:space="preserve">P3</w:t>
+            </w:r>
+          </w:p>
+        </w:tc>
+        <w:tc>
+          <w:tcPr/>
+          <w:p>
+            <w:pPr>
+              <w:pStyle w:val="Compact"/>
+            </w:pPr>
+            <w:r>
+              <w:t xml:space="preserve">wireguard: adversarial test, CLAUDE-2 darwin parity REAL (wireguard-go), teardown race-clean (no bug)</w:t>
+            </w:r>
+          </w:p>
+        </w:tc>
+        <w:tc>
+          <w:tcPr/>
+          <w:p>
+            <w:pPr>
+              <w:pStyle w:val="Compact"/>
+            </w:pPr>
+            <w:r>
+              <w:t xml:space="preserve">53bd7ff</w:t>
+            </w:r>
+          </w:p>
+        </w:tc>
+      </w:tr>
+      <w:tr>
+        <w:tc>
+          <w:tcPr/>
+          <w:p>
+            <w:pPr>
+              <w:pStyle w:val="Compact"/>
+            </w:pPr>
+            <w:r>
+              <w:t xml:space="preserve">HXC-1860</w:t>
+            </w:r>
+          </w:p>
+        </w:tc>
+        <w:tc>
+          <w:tcPr/>
+          <w:p>
+            <w:pPr>
+              <w:pStyle w:val="Compact"/>
+            </w:pPr>
+            <w:r>
+              <w:t xml:space="preserve">Task</w:t>
+            </w:r>
+          </w:p>
+        </w:tc>
+        <w:tc>
+          <w:tcPr/>
+          <w:p>
+            <w:pPr>
+              <w:pStyle w:val="Compact"/>
+            </w:pPr>
+            <w:r>
+              <w:t xml:space="preserve">P3</w:t>
+            </w:r>
+          </w:p>
+        </w:tc>
+        <w:tc>
+          <w:tcPr/>
+          <w:p>
+            <w:pPr>
+              <w:pStyle w:val="Compact"/>
+            </w:pPr>
+            <w:r>
+              <w:t xml:space="preserve">grafanadash: adversarial test, deterministic JSON + escaping safe (no bug)</w:t>
+            </w:r>
+          </w:p>
+        </w:tc>
+        <w:tc>
+          <w:tcPr/>
+          <w:p>
+            <w:pPr>
+              <w:pStyle w:val="Compact"/>
+            </w:pPr>
+            <w:r>
+              <w:t xml:space="preserve">53bd7ff</w:t>
+            </w:r>
+          </w:p>
+        </w:tc>
+      </w:tr>
+      <w:tr>
+        <w:tc>
+          <w:tcPr/>
+          <w:p>
+            <w:pPr>
+              <w:pStyle w:val="Compact"/>
+            </w:pPr>
+            <w:r>
+              <w:t xml:space="preserve">HXC-1861</w:t>
+            </w:r>
+          </w:p>
+        </w:tc>
+        <w:tc>
+          <w:tcPr/>
+          <w:p>
+            <w:pPr>
+              <w:pStyle w:val="Compact"/>
+            </w:pPr>
+            <w:r>
+              <w:t xml:space="preserve">Task</w:t>
+            </w:r>
+          </w:p>
+        </w:tc>
+        <w:tc>
+          <w:tcPr/>
+          <w:p>
+            <w:pPr>
+              <w:pStyle w:val="Compact"/>
+            </w:pPr>
+            <w:r>
+              <w:t xml:space="preserve">P3</w:t>
+            </w:r>
+          </w:p>
+        </w:tc>
+        <w:tc>
+          <w:tcPr/>
+          <w:p>
+            <w:pPr>
+              <w:pStyle w:val="Compact"/>
+            </w:pPr>
+            <w:r>
+              <w:t xml:space="preserve">helixtask: adversarial test, pure stateless decorator (no bug)</w:t>
+            </w:r>
+          </w:p>
+        </w:tc>
+        <w:tc>
+          <w:tcPr/>
+          <w:p>
+            <w:pPr>
+              <w:pStyle w:val="Compact"/>
+            </w:pPr>
+            <w:r>
+              <w:t xml:space="preserve">53bd7ff</w:t>
+            </w:r>
+          </w:p>
+        </w:tc>
+      </w:tr>
+      <w:tr>
+        <w:tc>
+          <w:tcPr/>
+          <w:p>
+            <w:pPr>
+              <w:pStyle w:val="Compact"/>
+            </w:pPr>
+            <w:r>
+              <w:t xml:space="preserve">HXC-1862</w:t>
+            </w:r>
+          </w:p>
+        </w:tc>
+        <w:tc>
+          <w:tcPr/>
+          <w:p>
+            <w:pPr>
+              <w:pStyle w:val="Compact"/>
+            </w:pPr>
+            <w:r>
+              <w:t xml:space="preserve">Task</w:t>
+            </w:r>
+          </w:p>
+        </w:tc>
+        <w:tc>
+          <w:tcPr/>
+          <w:p>
+            <w:pPr>
+              <w:pStyle w:val="Compact"/>
+            </w:pPr>
+            <w:r>
+              <w:t xml:space="preserve">P3</w:t>
+            </w:r>
+          </w:p>
+        </w:tc>
+        <w:tc>
+          <w:tcPr/>
+          <w:p>
+            <w:pPr>
+              <w:pStyle w:val="Compact"/>
+            </w:pPr>
+            <w:r>
+              <w:t xml:space="preserve">chutesaccount: adversarial test, read-only client no money-mutation surface (no bug)</w:t>
+            </w:r>
+          </w:p>
+        </w:tc>
+        <w:tc>
+          <w:tcPr/>
+          <w:p>
+            <w:pPr>
+              <w:pStyle w:val="Compact"/>
+            </w:pPr>
+            <w:r>
+              <w:t xml:space="preserve">53bd7ff</w:t>
+            </w:r>
+          </w:p>
+        </w:tc>
+      </w:tr>
+      <w:tr>
+        <w:tc>
+          <w:tcPr/>
+          <w:p>
+            <w:pPr>
+              <w:pStyle w:val="Compact"/>
+            </w:pPr>
+            <w:r>
+              <w:t xml:space="preserve">HXC-1863</w:t>
+            </w:r>
+          </w:p>
+        </w:tc>
+        <w:tc>
+          <w:tcPr/>
+          <w:p>
+            <w:pPr>
+              <w:pStyle w:val="Compact"/>
+            </w:pPr>
+            <w:r>
+              <w:t xml:space="preserve">Bug</w:t>
+            </w:r>
+          </w:p>
+        </w:tc>
+        <w:tc>
+          <w:tcPr/>
+          <w:p>
+            <w:pPr>
+              <w:pStyle w:val="Compact"/>
+            </w:pPr>
+            <w:r>
+              <w:t xml:space="preserve">P2</w:t>
+            </w:r>
+          </w:p>
+        </w:tc>
+        <w:tc>
+          <w:tcPr/>
+          <w:p>
+            <w:pPr>
+              <w:pStyle w:val="Compact"/>
+            </w:pPr>
+            <w:r>
+              <w:t xml:space="preserve">scheduler: Schedule/ScheduleOptimistic rank over map iteration -&gt; nondeterministic placement on score ties</w:t>
+            </w:r>
+          </w:p>
+        </w:tc>
+        <w:tc>
+          <w:tcPr/>
+          <w:p>
+            <w:pPr>
+              <w:pStyle w:val="Compact"/>
+            </w:pPr>
+            <w:r>
+              <w:t xml:space="preserve">8f9ff6c</w:t>
+            </w:r>
+          </w:p>
+        </w:tc>
+      </w:tr>
+      <w:tr>
+        <w:tc>
+          <w:tcPr/>
+          <w:p>
+            <w:pPr>
+              <w:pStyle w:val="Compact"/>
+            </w:pPr>
+            <w:r>
+              <w:t xml:space="preserve">HXC-1864</w:t>
+            </w:r>
+          </w:p>
+        </w:tc>
+        <w:tc>
+          <w:tcPr/>
+          <w:p>
+            <w:pPr>
+              <w:pStyle w:val="Compact"/>
+            </w:pPr>
+            <w:r>
+              <w:t xml:space="preserve">Bug</w:t>
+            </w:r>
+          </w:p>
+        </w:tc>
+        <w:tc>
+          <w:tcPr/>
+          <w:p>
+            <w:pPr>
+              <w:pStyle w:val="Compact"/>
+            </w:pPr>
+            <w:r>
+              <w:t xml:space="preserve">P2</w:t>
+            </w:r>
+          </w:p>
+        </w:tc>
+        <w:tc>
+          <w:tcPr/>
+          <w:p>
+            <w:pPr>
+              <w:pStyle w:val="Compact"/>
+            </w:pPr>
+            <w:r>
+              <w:t xml:space="preserve">infra: containerOrchestrator.Scale no negative-replicas guard -&gt; slice-bounds panic (process crash)</w:t>
+            </w:r>
+          </w:p>
+        </w:tc>
+        <w:tc>
+          <w:tcPr/>
+          <w:p>
+            <w:pPr>
+              <w:pStyle w:val="Compact"/>
+            </w:pPr>
+            <w:r>
+              <w:t xml:space="preserve">8f9ff6c</w:t>
+            </w:r>
+          </w:p>
+        </w:tc>
+      </w:tr>
+      <w:tr>
+        <w:tc>
+          <w:tcPr/>
+          <w:p>
+            <w:pPr>
+              <w:pStyle w:val="Compact"/>
+            </w:pPr>
+            <w:r>
+              <w:t xml:space="preserve">HXC-1865</w:t>
+            </w:r>
+          </w:p>
+        </w:tc>
+        <w:tc>
+          <w:tcPr/>
+          <w:p>
+            <w:pPr>
+              <w:pStyle w:val="Compact"/>
+            </w:pPr>
+            <w:r>
+              <w:t xml:space="preserve">Bug</w:t>
+            </w:r>
+          </w:p>
+        </w:tc>
+        <w:tc>
+          <w:tcPr/>
+          <w:p>
+            <w:pPr>
+              <w:pStyle w:val="Compact"/>
+            </w:pPr>
+            <w:r>
+              <w:t xml:space="preserve">P2</w:t>
+            </w:r>
+          </w:p>
+        </w:tc>
+        <w:tc>
+          <w:tcPr/>
+          <w:p>
+            <w:pPr>
+              <w:pStyle w:val="Compact"/>
+            </w:pPr>
+            <w:r>
+              <w:t xml:space="preserve">local: GPU.validate() lets NaN/Inf slip ordered guards -&gt; poisons TCO, pins card local forever</w:t>
+            </w:r>
+          </w:p>
+        </w:tc>
+        <w:tc>
+          <w:tcPr/>
+          <w:p>
+            <w:pPr>
+              <w:pStyle w:val="Compact"/>
+            </w:pPr>
+            <w:r>
+              <w:t xml:space="preserve">8f9ff6c</w:t>
+            </w:r>
+          </w:p>
+        </w:tc>
+      </w:tr>
+      <w:tr>
+        <w:tc>
+          <w:tcPr/>
+          <w:p>
+            <w:pPr>
+              <w:pStyle w:val="Compact"/>
+            </w:pPr>
+            <w:r>
+              <w:t xml:space="preserve">HXC-1866</w:t>
+            </w:r>
+          </w:p>
+        </w:tc>
+        <w:tc>
+          <w:tcPr/>
+          <w:p>
+            <w:pPr>
+              <w:pStyle w:val="Compact"/>
+            </w:pPr>
+            <w:r>
+              <w:t xml:space="preserve">Task</w:t>
+            </w:r>
+          </w:p>
+        </w:tc>
+        <w:tc>
+          <w:tcPr/>
+          <w:p>
+            <w:pPr>
+              <w:pStyle w:val="Compact"/>
+            </w:pPr>
+            <w:r>
+              <w:t xml:space="preserve">P3</w:t>
+            </w:r>
+          </w:p>
+        </w:tc>
+        <w:tc>
+          <w:tcPr/>
+          <w:p>
+            <w:pPr>
+              <w:pStyle w:val="Compact"/>
+            </w:pPr>
+            <w:r>
+              <w:t xml:space="preserve">phase7matrix: adversarial test, recompute + boundary correct, fail-closed (no bug)</w:t>
+            </w:r>
+          </w:p>
+        </w:tc>
+        <w:tc>
+          <w:tcPr/>
+          <w:p>
+            <w:pPr>
+              <w:pStyle w:val="Compact"/>
+            </w:pPr>
+            <w:r>
+              <w:t xml:space="preserve">8f9ff6c</w:t>
+            </w:r>
+          </w:p>
+        </w:tc>
+      </w:tr>
+      <w:tr>
+        <w:tc>
+          <w:tcPr/>
+          <w:p>
+            <w:pPr>
+              <w:pStyle w:val="Compact"/>
+            </w:pPr>
+            <w:r>
+              <w:t xml:space="preserve">HXC-1867</w:t>
+            </w:r>
+          </w:p>
+        </w:tc>
+        <w:tc>
+          <w:tcPr/>
+          <w:p>
+            <w:pPr>
+              <w:pStyle w:val="Compact"/>
+            </w:pPr>
+            <w:r>
+              <w:t xml:space="preserve">Bug</w:t>
+            </w:r>
+          </w:p>
+        </w:tc>
+        <w:tc>
+          <w:tcPr/>
+          <w:p>
+            <w:pPr>
+              <w:pStyle w:val="Compact"/>
+            </w:pPr>
+            <w:r>
+              <w:t xml:space="preserve">P2</w:t>
+            </w:r>
+          </w:p>
+        </w:tc>
+        <w:tc>
+          <w:tcPr/>
+          <w:p>
+            <w:pPr>
+              <w:pStyle w:val="Compact"/>
+            </w:pPr>
+            <w:r>
+              <w:t xml:space="preserve">context: Detach leaks parent Deadline() despite</w:t>
+            </w:r>
+            <w:r>
+              <w:t xml:space="preserve"> </w:t>
+            </w:r>
+            <w:r>
+              <w:t xml:space="preserve">‘never cancelled’</w:t>
+            </w:r>
+            <w:r>
+              <w:t xml:space="preserve"> </w:t>
+            </w:r>
+            <w:r>
+              <w:t xml:space="preserve">-&gt; self-contradictory fail-open</w:t>
+            </w:r>
+          </w:p>
+        </w:tc>
+        <w:tc>
+          <w:tcPr/>
+          <w:p>
+            <w:pPr>
+              <w:pStyle w:val="Compact"/>
+            </w:pPr>
+            <w:r>
+              <w:t xml:space="preserve">f098b4a</w:t>
+            </w:r>
+          </w:p>
+        </w:tc>
+      </w:tr>
+      <w:tr>
+        <w:tc>
+          <w:tcPr/>
+          <w:p>
+            <w:pPr>
+              <w:pStyle w:val="Compact"/>
+            </w:pPr>
+            <w:r>
+              <w:t xml:space="preserve">HXC-1868</w:t>
+            </w:r>
+          </w:p>
+        </w:tc>
+        <w:tc>
+          <w:tcPr/>
+          <w:p>
+            <w:pPr>
+              <w:pStyle w:val="Compact"/>
+            </w:pPr>
+            <w:r>
+              <w:t xml:space="preserve">Task</w:t>
+            </w:r>
+          </w:p>
+        </w:tc>
+        <w:tc>
+          <w:tcPr/>
+          <w:p>
+            <w:pPr>
+              <w:pStyle w:val="Compact"/>
+            </w:pPr>
+            <w:r>
+              <w:t xml:space="preserve">P3</w:t>
+            </w:r>
+          </w:p>
+        </w:tc>
+        <w:tc>
+          <w:tcPr/>
+          <w:p>
+            <w:pPr>
+              <w:pStyle w:val="Compact"/>
+            </w:pPr>
+            <w:r>
+              <w:t xml:space="preserve">benchmark: adversarial test, CoefficientOfVariation Bessel/zero-mean correct (no bug)</w:t>
+            </w:r>
+          </w:p>
+        </w:tc>
+        <w:tc>
+          <w:tcPr/>
+          <w:p>
+            <w:pPr>
+              <w:pStyle w:val="Compact"/>
+            </w:pPr>
+            <w:r>
+              <w:t xml:space="preserve">f098b4a</w:t>
+            </w:r>
+          </w:p>
+        </w:tc>
+      </w:tr>
+      <w:tr>
+        <w:tc>
+          <w:tcPr/>
+          <w:p>
+            <w:pPr>
+              <w:pStyle w:val="Compact"/>
+            </w:pPr>
+            <w:r>
+              <w:t xml:space="preserve">HXC-1869</w:t>
+            </w:r>
+          </w:p>
+        </w:tc>
+        <w:tc>
+          <w:tcPr/>
+          <w:p>
+            <w:pPr>
+              <w:pStyle w:val="Compact"/>
+            </w:pPr>
+            <w:r>
+              <w:t xml:space="preserve">Task</w:t>
+            </w:r>
+          </w:p>
+        </w:tc>
+        <w:tc>
+          <w:tcPr/>
+          <w:p>
+            <w:pPr>
+              <w:pStyle w:val="Compact"/>
+            </w:pPr>
+            <w:r>
+              <w:t xml:space="preserve">P3</w:t>
+            </w:r>
+          </w:p>
+        </w:tc>
+        <w:tc>
+          <w:tcPr/>
+          <w:p>
+            <w:pPr>
+              <w:pStyle w:val="Compact"/>
+            </w:pPr>
+            <w:r>
+              <w:t xml:space="preserve">compliancedoc: adversarial test, deterministic model card, no fabricated verdict (no bug)</w:t>
+            </w:r>
+          </w:p>
+        </w:tc>
+        <w:tc>
+          <w:tcPr/>
+          <w:p>
+            <w:pPr>
+              <w:pStyle w:val="Compact"/>
+            </w:pPr>
+            <w:r>
+              <w:t xml:space="preserve">f098b4a</w:t>
+            </w:r>
+          </w:p>
+        </w:tc>
+      </w:tr>
+      <w:tr>
+        <w:tc>
+          <w:tcPr/>
+          <w:p>
+            <w:pPr>
+              <w:pStyle w:val="Compact"/>
+            </w:pPr>
+            <w:r>
+              <w:t xml:space="preserve">HXC-1870</w:t>
+            </w:r>
+          </w:p>
+        </w:tc>
+        <w:tc>
+          <w:tcPr/>
+          <w:p>
+            <w:pPr>
+              <w:pStyle w:val="Compact"/>
+            </w:pPr>
+            <w:r>
+              <w:t xml:space="preserve">Task</w:t>
+            </w:r>
+          </w:p>
+        </w:tc>
+        <w:tc>
+          <w:tcPr/>
+          <w:p>
+            <w:pPr>
+              <w:pStyle w:val="Compact"/>
+            </w:pPr>
+            <w:r>
+              <w:t xml:space="preserve">P3</w:t>
+            </w:r>
+          </w:p>
+        </w:tc>
+        <w:tc>
+          <w:tcPr/>
+          <w:p>
+            <w:pPr>
+              <w:pStyle w:val="Compact"/>
+            </w:pPr>
+            <w:r>
+              <w:t xml:space="preserve">e2eebench: adversarial test, nearest-rank percentile + ML-KEM key-agreement guard (no bug)</w:t>
+            </w:r>
+          </w:p>
+        </w:tc>
+        <w:tc>
+          <w:tcPr/>
+          <w:p>
+            <w:pPr>
+              <w:pStyle w:val="Compact"/>
+            </w:pPr>
+            <w:r>
+              <w:t xml:space="preserve">f098b4a</w:t>
+            </w:r>
+          </w:p>
+        </w:tc>
+      </w:tr>
+      <w:tr>
+        <w:tc>
+          <w:tcPr/>
+          <w:p>
+            <w:pPr>
+              <w:pStyle w:val="Compact"/>
+            </w:pPr>
+            <w:r>
+              <w:t xml:space="preserve">HXC-1871</w:t>
+            </w:r>
+          </w:p>
+        </w:tc>
+        <w:tc>
+          <w:tcPr/>
+          <w:p>
+            <w:pPr>
+              <w:pStyle w:val="Compact"/>
+            </w:pPr>
+            <w:r>
+              <w:t xml:space="preserve">Task</w:t>
+            </w:r>
+          </w:p>
+        </w:tc>
+        <w:tc>
+          <w:tcPr/>
+          <w:p>
+            <w:pPr>
+              <w:pStyle w:val="Compact"/>
+            </w:pPr>
+            <w:r>
+              <w:t xml:space="preserve">P3</w:t>
+            </w:r>
+          </w:p>
+        </w:tc>
+        <w:tc>
+          <w:tcPr/>
+          <w:p>
+            <w:pPr>
+              <w:pStyle w:val="Compact"/>
+            </w:pPr>
+            <w:r>
+              <w:t xml:space="preserve">resources: adversarial test, CLAUDE-2 darwin parity VERIFIED REAL (no bug) — completes pkg/ 196/196</w:t>
+            </w:r>
+          </w:p>
+        </w:tc>
+        <w:tc>
+          <w:tcPr/>
+          <w:p>
+            <w:pPr>
+              <w:pStyle w:val="Compact"/>
+            </w:pPr>
+            <w:r>
+              <w:t xml:space="preserve">84b13ea</w:t>
+            </w:r>
+          </w:p>
+        </w:tc>
+      </w:tr>
+      <w:tr>
+        <w:tc>
+          <w:tcPr/>
+          <w:p>
+            <w:pPr>
+              <w:pStyle w:val="Compact"/>
+            </w:pPr>
+            <w:r>
+              <w:t xml:space="preserve">HXC-1872</w:t>
+            </w:r>
+          </w:p>
+        </w:tc>
+        <w:tc>
+          <w:tcPr/>
+          <w:p>
+            <w:pPr>
+              <w:pStyle w:val="Compact"/>
+            </w:pPr>
+            <w:r>
+              <w:t xml:space="preserve">Bug</w:t>
+            </w:r>
+          </w:p>
+        </w:tc>
+        <w:tc>
+          <w:tcPr/>
+          <w:p>
+            <w:pPr>
+              <w:pStyle w:val="Compact"/>
+            </w:pPr>
+            <w:r>
+              <w:t xml:space="preserve">P1</w:t>
+            </w:r>
+          </w:p>
+        </w:tc>
+        <w:tc>
+          <w:tcPr/>
+          <w:p>
+            <w:pPr>
+              <w:pStyle w:val="Compact"/>
+            </w:pPr>
+            <w:r>
+              <w:t xml:space="preserve">internal/node: UpdateNodeStatus mutates shared registry *Node pointer in place -&gt; data race (live in gRPC server)</w:t>
+            </w:r>
+          </w:p>
+        </w:tc>
+        <w:tc>
+          <w:tcPr/>
+          <w:p>
+            <w:pPr>
+              <w:pStyle w:val="Compact"/>
+            </w:pPr>
+            <w:r>
+              <w:t xml:space="preserve">556aa60</w:t>
+            </w:r>
+          </w:p>
+        </w:tc>
+      </w:tr>
+      <w:tr>
+        <w:tc>
+          <w:tcPr/>
+          <w:p>
+            <w:pPr>
+              <w:pStyle w:val="Compact"/>
+            </w:pPr>
+            <w:r>
+              <w:t xml:space="preserve">HXC-1873</w:t>
+            </w:r>
+          </w:p>
+        </w:tc>
+        <w:tc>
+          <w:tcPr/>
+          <w:p>
+            <w:pPr>
+              <w:pStyle w:val="Compact"/>
+            </w:pPr>
+            <w:r>
+              <w:t xml:space="preserve">Task</w:t>
+            </w:r>
+          </w:p>
+        </w:tc>
+        <w:tc>
+          <w:tcPr/>
+          <w:p>
+            <w:pPr>
+              <w:pStyle w:val="Compact"/>
+            </w:pPr>
+            <w:r>
+              <w:t xml:space="preserve">P3</w:t>
+            </w:r>
+          </w:p>
+        </w:tc>
+        <w:tc>
+          <w:tcPr/>
+          <w:p>
+            <w:pPr>
+              <w:pStyle w:val="Compact"/>
+            </w:pPr>
+            <w:r>
+              <w:t xml:space="preserve">internal/gpu: adversarial test, GPU allocator no over-commit + CLAUDE-2 probe REAL (no bug)</w:t>
+            </w:r>
+          </w:p>
+        </w:tc>
+        <w:tc>
+          <w:tcPr/>
+          <w:p>
+            <w:pPr>
+              <w:pStyle w:val="Compact"/>
+            </w:pPr>
+            <w:r>
+              <w:t xml:space="preserve">556aa60</w:t>
+            </w:r>
+          </w:p>
+        </w:tc>
+      </w:tr>
+      <w:tr>
+        <w:tc>
+          <w:tcPr/>
+          <w:p>
+            <w:pPr>
+              <w:pStyle w:val="Compact"/>
+            </w:pPr>
+            <w:r>
+              <w:t xml:space="preserve">HXC-1874</w:t>
+            </w:r>
+          </w:p>
+        </w:tc>
+        <w:tc>
+          <w:tcPr/>
+          <w:p>
+            <w:pPr>
+              <w:pStyle w:val="Compact"/>
+            </w:pPr>
+            <w:r>
+              <w:t xml:space="preserve">Task</w:t>
+            </w:r>
+          </w:p>
+        </w:tc>
+        <w:tc>
+          <w:tcPr/>
+          <w:p>
+            <w:pPr>
+              <w:pStyle w:val="Compact"/>
+            </w:pPr>
+            <w:r>
+              <w:t xml:space="preserve">P3</w:t>
+            </w:r>
+          </w:p>
+        </w:tc>
+        <w:tc>
+          <w:tcPr/>
+          <w:p>
+            <w:pPr>
+              <w:pStyle w:val="Compact"/>
+            </w:pPr>
+            <w:r>
+              <w:t xml:space="preserve">internal/gateway: adversarial test, authorize fail-CLOSED (no bug)</w:t>
+            </w:r>
+          </w:p>
+        </w:tc>
+        <w:tc>
+          <w:tcPr/>
+          <w:p>
+            <w:pPr>
+              <w:pStyle w:val="Compact"/>
+            </w:pPr>
+            <w:r>
+              <w:t xml:space="preserve">556aa60</w:t>
+            </w:r>
+          </w:p>
+        </w:tc>
+      </w:tr>
+      <w:tr>
+        <w:tc>
+          <w:tcPr/>
+          <w:p>
+            <w:pPr>
+              <w:pStyle w:val="Compact"/>
+            </w:pPr>
+            <w:r>
+              <w:t xml:space="preserve">HXC-1875</w:t>
+            </w:r>
+          </w:p>
+        </w:tc>
+        <w:tc>
+          <w:tcPr/>
+          <w:p>
+            <w:pPr>
+              <w:pStyle w:val="Compact"/>
+            </w:pPr>
+            <w:r>
+              <w:t xml:space="preserve">Task</w:t>
+            </w:r>
+          </w:p>
+        </w:tc>
+        <w:tc>
+          <w:tcPr/>
+          <w:p>
+            <w:pPr>
+              <w:pStyle w:val="Compact"/>
+            </w:pPr>
+            <w:r>
+              <w:t xml:space="preserve">P3</w:t>
+            </w:r>
+          </w:p>
+        </w:tc>
+        <w:tc>
+          <w:tcPr/>
+          <w:p>
+            <w:pPr>
+              <w:pStyle w:val="Compact"/>
+            </w:pPr>
+            <w:r>
+              <w:t xml:space="preserve">internal/security: adversarial test, identity/authz/policy all fail-CLOSED (no bug)</w:t>
+            </w:r>
+          </w:p>
+        </w:tc>
+        <w:tc>
+          <w:tcPr/>
+          <w:p>
+            <w:pPr>
+              <w:pStyle w:val="Compact"/>
+            </w:pPr>
+            <w:r>
+              <w:t xml:space="preserve">556aa60</w:t>
+            </w:r>
+          </w:p>
+        </w:tc>
+      </w:tr>
+      <w:tr>
+        <w:tc>
+          <w:tcPr/>
+          <w:p>
+            <w:pPr>
+              <w:pStyle w:val="Compact"/>
+            </w:pPr>
+            <w:r>
+              <w:t xml:space="preserve">HXC-1876</w:t>
+            </w:r>
+          </w:p>
+        </w:tc>
+        <w:tc>
+          <w:tcPr/>
+          <w:p>
+            <w:pPr>
+              <w:pStyle w:val="Compact"/>
+            </w:pPr>
+            <w:r>
+              <w:t xml:space="preserve">Bug</w:t>
+            </w:r>
+          </w:p>
+        </w:tc>
+        <w:tc>
+          <w:tcPr/>
+          <w:p>
+            <w:pPr>
+              <w:pStyle w:val="Compact"/>
+            </w:pPr>
+            <w:r>
+              <w:t xml:space="preserve">P1</w:t>
+            </w:r>
+          </w:p>
+        </w:tc>
+        <w:tc>
+          <w:tcPr/>
+          <w:p>
+            <w:pPr>
+              <w:pStyle w:val="Compact"/>
+            </w:pPr>
+            <w:r>
+              <w:t xml:space="preserve">internal/policy: scheduling rego permits non-numeric node.health -&gt; remote fail-open (schedules unhealthy node)</w:t>
+            </w:r>
+          </w:p>
+        </w:tc>
+        <w:tc>
+          <w:tcPr/>
+          <w:p>
+            <w:pPr>
+              <w:pStyle w:val="Compact"/>
+            </w:pPr>
+            <w:r>
+              <w:t xml:space="preserve">b02141e</w:t>
+            </w:r>
+          </w:p>
+        </w:tc>
+      </w:tr>
+      <w:tr>
+        <w:tc>
+          <w:tcPr/>
+          <w:p>
+            <w:pPr>
+              <w:pStyle w:val="Compact"/>
+            </w:pPr>
+            <w:r>
+              <w:t xml:space="preserve">HXC-1877</w:t>
+            </w:r>
+          </w:p>
+        </w:tc>
+        <w:tc>
+          <w:tcPr/>
+          <w:p>
+            <w:pPr>
+              <w:pStyle w:val="Compact"/>
+            </w:pPr>
+            <w:r>
+              <w:t xml:space="preserve">Bug</w:t>
+            </w:r>
+          </w:p>
+        </w:tc>
+        <w:tc>
+          <w:tcPr/>
+          <w:p>
+            <w:pPr>
+              <w:pStyle w:val="Compact"/>
+            </w:pPr>
+            <w:r>
+              <w:t xml:space="preserve">P2</w:t>
+            </w:r>
+          </w:p>
+        </w:tc>
+        <w:tc>
+          <w:tcPr/>
+          <w:p>
+            <w:pPr>
+              <w:pStyle w:val="Compact"/>
+            </w:pPr>
+            <w:r>
+              <w:t xml:space="preserve">internal/messaging: Queue.Enqueue releases lock before send -&gt; send-on-closed panic racing Close (teardown race)</w:t>
+            </w:r>
+          </w:p>
+        </w:tc>
+        <w:tc>
+          <w:tcPr/>
+          <w:p>
+            <w:pPr>
+              <w:pStyle w:val="Compact"/>
+            </w:pPr>
+            <w:r>
+              <w:t xml:space="preserve">b02141e</w:t>
+            </w:r>
+          </w:p>
+        </w:tc>
+      </w:tr>
+      <w:tr>
+        <w:tc>
+          <w:tcPr/>
+          <w:p>
+            <w:pPr>
+              <w:pStyle w:val="Compact"/>
+            </w:pPr>
+            <w:r>
+              <w:t xml:space="preserve">HXC-1878</w:t>
+            </w:r>
+          </w:p>
+        </w:tc>
+        <w:tc>
+          <w:tcPr/>
+          <w:p>
+            <w:pPr>
+              <w:pStyle w:val="Compact"/>
+            </w:pPr>
+            <w:r>
+              <w:t xml:space="preserve">Task</w:t>
+            </w:r>
+          </w:p>
+        </w:tc>
+        <w:tc>
+          <w:tcPr/>
+          <w:p>
+            <w:pPr>
+              <w:pStyle w:val="Compact"/>
+            </w:pPr>
+            <w:r>
+              <w:t xml:space="preserve">P3</w:t>
+            </w:r>
+          </w:p>
+        </w:tc>
+        <w:tc>
+          <w:tcPr/>
+          <w:p>
+            <w:pPr>
+              <w:pStyle w:val="Compact"/>
+            </w:pPr>
+            <w:r>
+              <w:t xml:space="preserve">internal/scheduler: adversarial test, gRPC ScheduleJob serialized no over-commit (no bug)</w:t>
+            </w:r>
+          </w:p>
+        </w:tc>
+        <w:tc>
+          <w:tcPr/>
+          <w:p>
+            <w:pPr>
+              <w:pStyle w:val="Compact"/>
+            </w:pPr>
+            <w:r>
+              <w:t xml:space="preserve">b02141e</w:t>
+            </w:r>
+          </w:p>
+        </w:tc>
+      </w:tr>
+      <w:tr>
+        <w:tc>
+          <w:tcPr/>
+          <w:p>
+            <w:pPr>
+              <w:pStyle w:val="Compact"/>
+            </w:pPr>
+            <w:r>
+              <w:t xml:space="preserve">HXC-1879</w:t>
+            </w:r>
+          </w:p>
+        </w:tc>
+        <w:tc>
+          <w:tcPr/>
+          <w:p>
+            <w:pPr>
+              <w:pStyle w:val="Compact"/>
+            </w:pPr>
+            <w:r>
+              <w:t xml:space="preserve">Task</w:t>
+            </w:r>
+          </w:p>
+        </w:tc>
+        <w:tc>
+          <w:tcPr/>
+          <w:p>
+            <w:pPr>
+              <w:pStyle w:val="Compact"/>
+            </w:pPr>
+            <w:r>
+              <w:t xml:space="preserve">P3</w:t>
+            </w:r>
+          </w:p>
+        </w:tc>
+        <w:tc>
+          <w:tcPr/>
+          <w:p>
+            <w:pPr>
+              <w:pStyle w:val="Compact"/>
+            </w:pPr>
+            <w:r>
+              <w:t xml:space="preserve">internal/llm: adversarial test, Manager RWMutex-guarded + fail-closed inference (no bug)</w:t>
+            </w:r>
+          </w:p>
+        </w:tc>
+        <w:tc>
+          <w:tcPr/>
+          <w:p>
+            <w:pPr>
+              <w:pStyle w:val="Compact"/>
+            </w:pPr>
+            <w:r>
+              <w:t xml:space="preserve">b02141e</w:t>
+            </w:r>
+          </w:p>
+        </w:tc>
+      </w:tr>
+      <w:tr>
+        <w:tc>
+          <w:tcPr/>
+          <w:p>
+            <w:pPr>
+              <w:pStyle w:val="Compact"/>
+            </w:pPr>
+            <w:r>
+              <w:t xml:space="preserve">HXC-1880</w:t>
+            </w:r>
+          </w:p>
+        </w:tc>
+        <w:tc>
+          <w:tcPr/>
+          <w:p>
+            <w:pPr>
+              <w:pStyle w:val="Compact"/>
+            </w:pPr>
+            <w:r>
+              <w:t xml:space="preserve">Bug</w:t>
+            </w:r>
+          </w:p>
+        </w:tc>
+        <w:tc>
+          <w:tcPr/>
+          <w:p>
+            <w:pPr>
+              <w:pStyle w:val="Compact"/>
+            </w:pPr>
+            <w:r>
+              <w:t xml:space="preserve">P2</w:t>
+            </w:r>
+          </w:p>
+        </w:tc>
+        <w:tc>
+          <w:tcPr/>
+          <w:p>
+            <w:pPr>
+              <w:pStyle w:val="Compact"/>
+            </w:pPr>
+            <w:r>
+              <w:t xml:space="preserve">internal/build: SubmitBuild stores spec.BuildArgs by reference -&gt; caller mutation races worker read (shared-pointer alias)</w:t>
+            </w:r>
+          </w:p>
+        </w:tc>
+        <w:tc>
+          <w:tcPr/>
+          <w:p>
+            <w:pPr>
+              <w:pStyle w:val="Compact"/>
+            </w:pPr>
+            <w:r>
+              <w:t xml:space="preserve">6327fc3</w:t>
+            </w:r>
+          </w:p>
+        </w:tc>
+      </w:tr>
+      <w:tr>
+        <w:tc>
+          <w:tcPr/>
+          <w:p>
+            <w:pPr>
+              <w:pStyle w:val="Compact"/>
+            </w:pPr>
+            <w:r>
+              <w:t xml:space="preserve">HXC-1881</w:t>
+            </w:r>
+          </w:p>
+        </w:tc>
+        <w:tc>
+          <w:tcPr/>
+          <w:p>
+            <w:pPr>
+              <w:pStyle w:val="Compact"/>
+            </w:pPr>
+            <w:r>
+              <w:t xml:space="preserve">Bug</w:t>
+            </w:r>
+          </w:p>
+        </w:tc>
+        <w:tc>
+          <w:tcPr/>
+          <w:p>
+            <w:pPr>
+              <w:pStyle w:val="Compact"/>
+            </w:pPr>
+            <w:r>
+              <w:t xml:space="preserve">P2</w:t>
+            </w:r>
+          </w:p>
+        </w:tc>
+        <w:tc>
+          <w:tcPr/>
+          <w:p>
+            <w:pPr>
+              <w:pStyle w:val="Compact"/>
+            </w:pPr>
+            <w:r>
+              <w:t xml:space="preserve">internal/federation: scoreCell NaN score breaks cell-selection total order -&gt; malformed cell admitted as Chosen</w:t>
+            </w:r>
+          </w:p>
+        </w:tc>
+        <w:tc>
+          <w:tcPr/>
+          <w:p>
+            <w:pPr>
+              <w:pStyle w:val="Compact"/>
+            </w:pPr>
+            <w:r>
+              <w:t xml:space="preserve">6327fc3</w:t>
+            </w:r>
+          </w:p>
+        </w:tc>
+      </w:tr>
+      <w:tr>
+        <w:tc>
+          <w:tcPr/>
+          <w:p>
+            <w:pPr>
+              <w:pStyle w:val="Compact"/>
+            </w:pPr>
+            <w:r>
+              <w:t xml:space="preserve">HXC-1882</w:t>
+            </w:r>
+          </w:p>
+        </w:tc>
+        <w:tc>
+          <w:tcPr/>
+          <w:p>
+            <w:pPr>
+              <w:pStyle w:val="Compact"/>
+            </w:pPr>
+            <w:r>
+              <w:t xml:space="preserve">Bug</w:t>
+            </w:r>
+          </w:p>
+        </w:tc>
+        <w:tc>
+          <w:tcPr/>
+          <w:p>
+            <w:pPr>
+              <w:pStyle w:val="Compact"/>
+            </w:pPr>
+            <w:r>
+              <w:t xml:space="preserve">P1</w:t>
+            </w:r>
+          </w:p>
+        </w:tc>
+        <w:tc>
+          <w:tcPr/>
+          <w:p>
+            <w:pPr>
+              <w:pStyle w:val="Compact"/>
+            </w:pPr>
+            <w:r>
+              <w:t xml:space="preserve">internal/health: aggregate switch has no default -&gt; malformed/unknown status folds to HEALTHY (fail-open readiness/liveness)</w:t>
+            </w:r>
+          </w:p>
+        </w:tc>
+        <w:tc>
+          <w:tcPr/>
+          <w:p>
+            <w:pPr>
+              <w:pStyle w:val="Compact"/>
+            </w:pPr>
+            <w:r>
+              <w:t xml:space="preserve">6327fc3</w:t>
+            </w:r>
+          </w:p>
+        </w:tc>
+      </w:tr>
+      <w:tr>
+        <w:tc>
+          <w:tcPr/>
+          <w:p>
+            <w:pPr>
+              <w:pStyle w:val="Compact"/>
+            </w:pPr>
+            <w:r>
+              <w:t xml:space="preserve">HXC-1883</w:t>
+            </w:r>
+          </w:p>
+        </w:tc>
+        <w:tc>
+          <w:tcPr/>
+          <w:p>
+            <w:pPr>
+              <w:pStyle w:val="Compact"/>
+            </w:pPr>
+            <w:r>
+              <w:t xml:space="preserve">Task</w:t>
+            </w:r>
+          </w:p>
+        </w:tc>
+        <w:tc>
+          <w:tcPr/>
+          <w:p>
+            <w:pPr>
+              <w:pStyle w:val="Compact"/>
+            </w:pPr>
+            <w:r>
+              <w:t xml:space="preserve">P3</w:t>
+            </w:r>
+          </w:p>
+        </w:tc>
+        <w:tc>
+          <w:tcPr/>
+          <w:p>
+            <w:pPr>
+              <w:pStyle w:val="Compact"/>
+            </w:pPr>
+            <w:r>
+              <w:t xml:space="preserve">internal/console: adversarial test, Registrar stateless no shared-pointer race (no bug)</w:t>
+            </w:r>
+          </w:p>
+        </w:tc>
+        <w:tc>
+          <w:tcPr/>
+          <w:p>
+            <w:pPr>
+              <w:pStyle w:val="Compact"/>
+            </w:pPr>
+            <w:r>
+              <w:t xml:space="preserve">6327fc3</w:t>
             </w:r>
           </w:p>
         </w:tc>

</xml_diff>

<commit_message>
docs: plan + docs_chain sync — 44 bugs, internal/ COMPLETE, cmd/ started (CLAUDE-3)
Co-Authored-By: Claude Opus 4.8 (1M context) <noreply@anthropic.com>
</commit_message>
<xml_diff>
--- a/docs/export/fixed.docx
+++ b/docs/export/fixed.docx
@@ -34,7 +34,7 @@
         <w:t xml:space="preserve"> </w:t>
       </w:r>
       <w:r>
-        <w:t xml:space="preserve">211</w:t>
+        <w:t xml:space="preserve">215</w:t>
       </w:r>
       <w:r>
         <w:t xml:space="preserve"> </w:t>
@@ -50,7 +50,7 @@
         <w:t xml:space="preserve"> </w:t>
       </w:r>
       <w:r>
-        <w:t xml:space="preserve">2026-06-16T15:17:22Z</w:t>
+        <w:t xml:space="preserve">2026-06-16T15:54:28Z</w:t>
       </w:r>
       <w:r>
         <w:t xml:space="preserve"> </w:t>
@@ -116,7 +116,7 @@
           <w:b/>
           <w:bCs/>
         </w:rPr>
-        <w:t xml:space="preserve">777</w:t>
+        <w:t xml:space="preserve">790</w:t>
       </w:r>
       <w:r>
         <w:t xml:space="preserve">.</w:t>
@@ -39933,6 +39933,747 @@
             </w:pPr>
             <w:r>
               <w:t xml:space="preserve">6327fc3</w:t>
+            </w:r>
+          </w:p>
+        </w:tc>
+      </w:tr>
+      <w:tr>
+        <w:tc>
+          <w:tcPr/>
+          <w:p>
+            <w:pPr>
+              <w:pStyle w:val="Compact"/>
+            </w:pPr>
+            <w:r>
+              <w:t xml:space="preserve">HXC-1884</w:t>
+            </w:r>
+          </w:p>
+        </w:tc>
+        <w:tc>
+          <w:tcPr/>
+          <w:p>
+            <w:pPr>
+              <w:pStyle w:val="Compact"/>
+            </w:pPr>
+            <w:r>
+              <w:t xml:space="preserve">Task</w:t>
+            </w:r>
+          </w:p>
+        </w:tc>
+        <w:tc>
+          <w:tcPr/>
+          <w:p>
+            <w:pPr>
+              <w:pStyle w:val="Compact"/>
+            </w:pPr>
+            <w:r>
+              <w:t xml:space="preserve">P3</w:t>
+            </w:r>
+          </w:p>
+        </w:tc>
+        <w:tc>
+          <w:tcPr/>
+          <w:p>
+            <w:pPr>
+              <w:pStyle w:val="Compact"/>
+            </w:pPr>
+            <w:r>
+              <w:t xml:space="preserve">internal/schema: adversarial test, structural verifier rejects malformed + deterministic migrations (no bug)</w:t>
+            </w:r>
+          </w:p>
+        </w:tc>
+        <w:tc>
+          <w:tcPr/>
+          <w:p>
+            <w:pPr>
+              <w:pStyle w:val="Compact"/>
+            </w:pPr>
+            <w:r>
+              <w:t xml:space="preserve">bca8e8c</w:t>
+            </w:r>
+          </w:p>
+        </w:tc>
+      </w:tr>
+      <w:tr>
+        <w:tc>
+          <w:tcPr/>
+          <w:p>
+            <w:pPr>
+              <w:pStyle w:val="Compact"/>
+            </w:pPr>
+            <w:r>
+              <w:t xml:space="preserve">HXC-1885</w:t>
+            </w:r>
+          </w:p>
+        </w:tc>
+        <w:tc>
+          <w:tcPr/>
+          <w:p>
+            <w:pPr>
+              <w:pStyle w:val="Compact"/>
+            </w:pPr>
+            <w:r>
+              <w:t xml:space="preserve">Task</w:t>
+            </w:r>
+          </w:p>
+        </w:tc>
+        <w:tc>
+          <w:tcPr/>
+          <w:p>
+            <w:pPr>
+              <w:pStyle w:val="Compact"/>
+            </w:pPr>
+            <w:r>
+              <w:t xml:space="preserve">P3</w:t>
+            </w:r>
+          </w:p>
+        </w:tc>
+        <w:tc>
+          <w:tcPr/>
+          <w:p>
+            <w:pPr>
+              <w:pStyle w:val="Compact"/>
+            </w:pPr>
+            <w:r>
+              <w:t xml:space="preserve">internal/backup: adversarial test, round-trip byte-identical + correct argv (no bug); 2 latent atomicity risks</w:t>
+            </w:r>
+          </w:p>
+        </w:tc>
+        <w:tc>
+          <w:tcPr/>
+          <w:p>
+            <w:pPr>
+              <w:pStyle w:val="Compact"/>
+            </w:pPr>
+            <w:r>
+              <w:t xml:space="preserve">bca8e8c</w:t>
+            </w:r>
+          </w:p>
+        </w:tc>
+      </w:tr>
+      <w:tr>
+        <w:tc>
+          <w:tcPr/>
+          <w:p>
+            <w:pPr>
+              <w:pStyle w:val="Compact"/>
+            </w:pPr>
+            <w:r>
+              <w:t xml:space="preserve">HXC-1886</w:t>
+            </w:r>
+          </w:p>
+        </w:tc>
+        <w:tc>
+          <w:tcPr/>
+          <w:p>
+            <w:pPr>
+              <w:pStyle w:val="Compact"/>
+            </w:pPr>
+            <w:r>
+              <w:t xml:space="preserve">Task</w:t>
+            </w:r>
+          </w:p>
+        </w:tc>
+        <w:tc>
+          <w:tcPr/>
+          <w:p>
+            <w:pPr>
+              <w:pStyle w:val="Compact"/>
+            </w:pPr>
+            <w:r>
+              <w:t xml:space="preserve">P3</w:t>
+            </w:r>
+          </w:p>
+        </w:tc>
+        <w:tc>
+          <w:tcPr/>
+          <w:p>
+            <w:pPr>
+              <w:pStyle w:val="Compact"/>
+            </w:pPr>
+            <w:r>
+              <w:t xml:space="preserve">internal/trust: adversarial test, unknown node untrusted by default, NaN fails closed (no bug)</w:t>
+            </w:r>
+          </w:p>
+        </w:tc>
+        <w:tc>
+          <w:tcPr/>
+          <w:p>
+            <w:pPr>
+              <w:pStyle w:val="Compact"/>
+            </w:pPr>
+            <w:r>
+              <w:t xml:space="preserve">bca8e8c</w:t>
+            </w:r>
+          </w:p>
+        </w:tc>
+      </w:tr>
+      <w:tr>
+        <w:tc>
+          <w:tcPr/>
+          <w:p>
+            <w:pPr>
+              <w:pStyle w:val="Compact"/>
+            </w:pPr>
+            <w:r>
+              <w:t xml:space="preserve">HXC-1887</w:t>
+            </w:r>
+          </w:p>
+        </w:tc>
+        <w:tc>
+          <w:tcPr/>
+          <w:p>
+            <w:pPr>
+              <w:pStyle w:val="Compact"/>
+            </w:pPr>
+            <w:r>
+              <w:t xml:space="preserve">Task</w:t>
+            </w:r>
+          </w:p>
+        </w:tc>
+        <w:tc>
+          <w:tcPr/>
+          <w:p>
+            <w:pPr>
+              <w:pStyle w:val="Compact"/>
+            </w:pPr>
+            <w:r>
+              <w:t xml:space="preserve">P3</w:t>
+            </w:r>
+          </w:p>
+        </w:tc>
+        <w:tc>
+          <w:tcPr/>
+          <w:p>
+            <w:pPr>
+              <w:pStyle w:val="Compact"/>
+            </w:pPr>
+            <w:r>
+              <w:t xml:space="preserve">internal/advisory: adversarial test, distributed-lock service mutual exclusion + fail-open (no bug)</w:t>
+            </w:r>
+          </w:p>
+        </w:tc>
+        <w:tc>
+          <w:tcPr/>
+          <w:p>
+            <w:pPr>
+              <w:pStyle w:val="Compact"/>
+            </w:pPr>
+            <w:r>
+              <w:t xml:space="preserve">bca8e8c</w:t>
+            </w:r>
+          </w:p>
+        </w:tc>
+      </w:tr>
+      <w:tr>
+        <w:tc>
+          <w:tcPr/>
+          <w:p>
+            <w:pPr>
+              <w:pStyle w:val="Compact"/>
+            </w:pPr>
+            <w:r>
+              <w:t xml:space="preserve">HXC-1888</w:t>
+            </w:r>
+          </w:p>
+        </w:tc>
+        <w:tc>
+          <w:tcPr/>
+          <w:p>
+            <w:pPr>
+              <w:pStyle w:val="Compact"/>
+            </w:pPr>
+            <w:r>
+              <w:t xml:space="preserve">Bug</w:t>
+            </w:r>
+          </w:p>
+        </w:tc>
+        <w:tc>
+          <w:tcPr/>
+          <w:p>
+            <w:pPr>
+              <w:pStyle w:val="Compact"/>
+            </w:pPr>
+            <w:r>
+              <w:t xml:space="preserve">P2</w:t>
+            </w:r>
+          </w:p>
+        </w:tc>
+        <w:tc>
+          <w:tcPr/>
+          <w:p>
+            <w:pPr>
+              <w:pStyle w:val="Compact"/>
+            </w:pPr>
+            <w:r>
+              <w:t xml:space="preserve">internal/costbroker: NaN price slips budget cap -&gt; admitted, selected, poisons cumulative spend to NaN (cap bypass)</w:t>
+            </w:r>
+          </w:p>
+        </w:tc>
+        <w:tc>
+          <w:tcPr/>
+          <w:p>
+            <w:pPr>
+              <w:pStyle w:val="Compact"/>
+            </w:pPr>
+            <w:r>
+              <w:t xml:space="preserve">0655c39</w:t>
+            </w:r>
+          </w:p>
+        </w:tc>
+      </w:tr>
+      <w:tr>
+        <w:tc>
+          <w:tcPr/>
+          <w:p>
+            <w:pPr>
+              <w:pStyle w:val="Compact"/>
+            </w:pPr>
+            <w:r>
+              <w:t xml:space="preserve">HXC-1889</w:t>
+            </w:r>
+          </w:p>
+        </w:tc>
+        <w:tc>
+          <w:tcPr/>
+          <w:p>
+            <w:pPr>
+              <w:pStyle w:val="Compact"/>
+            </w:pPr>
+            <w:r>
+              <w:t xml:space="preserve">Task</w:t>
+            </w:r>
+          </w:p>
+        </w:tc>
+        <w:tc>
+          <w:tcPr/>
+          <w:p>
+            <w:pPr>
+              <w:pStyle w:val="Compact"/>
+            </w:pPr>
+            <w:r>
+              <w:t xml:space="preserve">P3</w:t>
+            </w:r>
+          </w:p>
+        </w:tc>
+        <w:tc>
+          <w:tcPr/>
+          <w:p>
+            <w:pPr>
+              <w:pStyle w:val="Compact"/>
+            </w:pPr>
+            <w:r>
+              <w:t xml:space="preserve">internal/session: adversarial test, gRPC server stateless, Manager deep-copy+lock (no bug)</w:t>
+            </w:r>
+          </w:p>
+        </w:tc>
+        <w:tc>
+          <w:tcPr/>
+          <w:p>
+            <w:pPr>
+              <w:pStyle w:val="Compact"/>
+            </w:pPr>
+            <w:r>
+              <w:t xml:space="preserve">0655c39</w:t>
+            </w:r>
+          </w:p>
+        </w:tc>
+      </w:tr>
+      <w:tr>
+        <w:tc>
+          <w:tcPr/>
+          <w:p>
+            <w:pPr>
+              <w:pStyle w:val="Compact"/>
+            </w:pPr>
+            <w:r>
+              <w:t xml:space="preserve">HXC-1890</w:t>
+            </w:r>
+          </w:p>
+        </w:tc>
+        <w:tc>
+          <w:tcPr/>
+          <w:p>
+            <w:pPr>
+              <w:pStyle w:val="Compact"/>
+            </w:pPr>
+            <w:r>
+              <w:t xml:space="preserve">Task</w:t>
+            </w:r>
+          </w:p>
+        </w:tc>
+        <w:tc>
+          <w:tcPr/>
+          <w:p>
+            <w:pPr>
+              <w:pStyle w:val="Compact"/>
+            </w:pPr>
+            <w:r>
+              <w:t xml:space="preserve">P3</w:t>
+            </w:r>
+          </w:p>
+        </w:tc>
+        <w:tc>
+          <w:tcPr/>
+          <w:p>
+            <w:pPr>
+              <w:pStyle w:val="Compact"/>
+            </w:pPr>
+            <w:r>
+              <w:t xml:space="preserve">internal/verifier: adversarial test, VerifyResult fail-CLOSED on zero/unknown trust + tamper (no bug)</w:t>
+            </w:r>
+          </w:p>
+        </w:tc>
+        <w:tc>
+          <w:tcPr/>
+          <w:p>
+            <w:pPr>
+              <w:pStyle w:val="Compact"/>
+            </w:pPr>
+            <w:r>
+              <w:t xml:space="preserve">0655c39</w:t>
+            </w:r>
+          </w:p>
+        </w:tc>
+      </w:tr>
+      <w:tr>
+        <w:tc>
+          <w:tcPr/>
+          <w:p>
+            <w:pPr>
+              <w:pStyle w:val="Compact"/>
+            </w:pPr>
+            <w:r>
+              <w:t xml:space="preserve">HXC-1891</w:t>
+            </w:r>
+          </w:p>
+        </w:tc>
+        <w:tc>
+          <w:tcPr/>
+          <w:p>
+            <w:pPr>
+              <w:pStyle w:val="Compact"/>
+            </w:pPr>
+            <w:r>
+              <w:t xml:space="preserve">Task</w:t>
+            </w:r>
+          </w:p>
+        </w:tc>
+        <w:tc>
+          <w:tcPr/>
+          <w:p>
+            <w:pPr>
+              <w:pStyle w:val="Compact"/>
+            </w:pPr>
+            <w:r>
+              <w:t xml:space="preserve">P3</w:t>
+            </w:r>
+          </w:p>
+        </w:tc>
+        <w:tc>
+          <w:tcPr/>
+          <w:p>
+            <w:pPr>
+              <w:pStyle w:val="Compact"/>
+            </w:pPr>
+            <w:r>
+              <w:t xml:space="preserve">internal/chaos: adversarial test, single-use sequential runner, canary guard strict (no bug)</w:t>
+            </w:r>
+          </w:p>
+        </w:tc>
+        <w:tc>
+          <w:tcPr/>
+          <w:p>
+            <w:pPr>
+              <w:pStyle w:val="Compact"/>
+            </w:pPr>
+            <w:r>
+              <w:t xml:space="preserve">0655c39</w:t>
+            </w:r>
+          </w:p>
+        </w:tc>
+      </w:tr>
+      <w:tr>
+        <w:tc>
+          <w:tcPr/>
+          <w:p>
+            <w:pPr>
+              <w:pStyle w:val="Compact"/>
+            </w:pPr>
+            <w:r>
+              <w:t xml:space="preserve">HXC-1892</w:t>
+            </w:r>
+          </w:p>
+        </w:tc>
+        <w:tc>
+          <w:tcPr/>
+          <w:p>
+            <w:pPr>
+              <w:pStyle w:val="Compact"/>
+            </w:pPr>
+            <w:r>
+              <w:t xml:space="preserve">Bug</w:t>
+            </w:r>
+          </w:p>
+        </w:tc>
+        <w:tc>
+          <w:tcPr/>
+          <w:p>
+            <w:pPr>
+              <w:pStyle w:val="Compact"/>
+            </w:pPr>
+            <w:r>
+              <w:t xml:space="preserve">P2</w:t>
+            </w:r>
+          </w:p>
+        </w:tc>
+        <w:tc>
+          <w:tcPr/>
+          <w:p>
+            <w:pPr>
+              <w:pStyle w:val="Compact"/>
+            </w:pPr>
+            <w:r>
+              <w:t xml:space="preserve">cmd/htmux: streamSession 2 goroutines write same websocket.Conn w/o mutex -&gt; concurrent-write panic</w:t>
+            </w:r>
+          </w:p>
+        </w:tc>
+        <w:tc>
+          <w:tcPr/>
+          <w:p>
+            <w:pPr>
+              <w:pStyle w:val="Compact"/>
+            </w:pPr>
+            <w:r>
+              <w:t xml:space="preserve">0300e6d</w:t>
+            </w:r>
+          </w:p>
+        </w:tc>
+      </w:tr>
+      <w:tr>
+        <w:tc>
+          <w:tcPr/>
+          <w:p>
+            <w:pPr>
+              <w:pStyle w:val="Compact"/>
+            </w:pPr>
+            <w:r>
+              <w:t xml:space="preserve">HXC-1893</w:t>
+            </w:r>
+          </w:p>
+        </w:tc>
+        <w:tc>
+          <w:tcPr/>
+          <w:p>
+            <w:pPr>
+              <w:pStyle w:val="Compact"/>
+            </w:pPr>
+            <w:r>
+              <w:t xml:space="preserve">Task</w:t>
+            </w:r>
+          </w:p>
+        </w:tc>
+        <w:tc>
+          <w:tcPr/>
+          <w:p>
+            <w:pPr>
+              <w:pStyle w:val="Compact"/>
+            </w:pPr>
+            <w:r>
+              <w:t xml:space="preserve">P3</w:t>
+            </w:r>
+          </w:p>
+        </w:tc>
+        <w:tc>
+          <w:tcPr/>
+          <w:p>
+            <w:pPr>
+              <w:pStyle w:val="Compact"/>
+            </w:pPr>
+            <w:r>
+              <w:t xml:space="preserve">internal/wireguard: adversarial test, mesh RWMutex-guarded + dual key-validation (no bug) — internal/ COMPLETE</w:t>
+            </w:r>
+          </w:p>
+        </w:tc>
+        <w:tc>
+          <w:tcPr/>
+          <w:p>
+            <w:pPr>
+              <w:pStyle w:val="Compact"/>
+            </w:pPr>
+            <w:r>
+              <w:t xml:space="preserve">0300e6d</w:t>
+            </w:r>
+          </w:p>
+        </w:tc>
+      </w:tr>
+      <w:tr>
+        <w:tc>
+          <w:tcPr/>
+          <w:p>
+            <w:pPr>
+              <w:pStyle w:val="Compact"/>
+            </w:pPr>
+            <w:r>
+              <w:t xml:space="preserve">HXC-1894</w:t>
+            </w:r>
+          </w:p>
+        </w:tc>
+        <w:tc>
+          <w:tcPr/>
+          <w:p>
+            <w:pPr>
+              <w:pStyle w:val="Compact"/>
+            </w:pPr>
+            <w:r>
+              <w:t xml:space="preserve">Task</w:t>
+            </w:r>
+          </w:p>
+        </w:tc>
+        <w:tc>
+          <w:tcPr/>
+          <w:p>
+            <w:pPr>
+              <w:pStyle w:val="Compact"/>
+            </w:pPr>
+            <w:r>
+              <w:t xml:space="preserve">P3</w:t>
+            </w:r>
+          </w:p>
+        </w:tc>
+        <w:tc>
+          <w:tcPr/>
+          <w:p>
+            <w:pPr>
+              <w:pStyle w:val="Compact"/>
+            </w:pPr>
+            <w:r>
+              <w:t xml:space="preserve">cmd/helix-raftd: adversarial test, leader-gate 421 + validation defense-in-depth (no bug)</w:t>
+            </w:r>
+          </w:p>
+        </w:tc>
+        <w:tc>
+          <w:tcPr/>
+          <w:p>
+            <w:pPr>
+              <w:pStyle w:val="Compact"/>
+            </w:pPr>
+            <w:r>
+              <w:t xml:space="preserve">0300e6d</w:t>
+            </w:r>
+          </w:p>
+        </w:tc>
+      </w:tr>
+      <w:tr>
+        <w:tc>
+          <w:tcPr/>
+          <w:p>
+            <w:pPr>
+              <w:pStyle w:val="Compact"/>
+            </w:pPr>
+            <w:r>
+              <w:t xml:space="preserve">HXC-1895</w:t>
+            </w:r>
+          </w:p>
+        </w:tc>
+        <w:tc>
+          <w:tcPr/>
+          <w:p>
+            <w:pPr>
+              <w:pStyle w:val="Compact"/>
+            </w:pPr>
+            <w:r>
+              <w:t xml:space="preserve">Task</w:t>
+            </w:r>
+          </w:p>
+        </w:tc>
+        <w:tc>
+          <w:tcPr/>
+          <w:p>
+            <w:pPr>
+              <w:pStyle w:val="Compact"/>
+            </w:pPr>
+            <w:r>
+              <w:t xml:space="preserve">P3</w:t>
+            </w:r>
+          </w:p>
+        </w:tc>
+        <w:tc>
+          <w:tcPr/>
+          <w:p>
+            <w:pPr>
+              <w:pStyle w:val="Compact"/>
+            </w:pPr>
+            <w:r>
+              <w:t xml:space="preserve">cmd/helix_infra: adversarial test, CLI arg parsers check err before value (no bug)</w:t>
+            </w:r>
+          </w:p>
+        </w:tc>
+        <w:tc>
+          <w:tcPr/>
+          <w:p>
+            <w:pPr>
+              <w:pStyle w:val="Compact"/>
+            </w:pPr>
+            <w:r>
+              <w:t xml:space="preserve">0300e6d</w:t>
+            </w:r>
+          </w:p>
+        </w:tc>
+      </w:tr>
+      <w:tr>
+        <w:tc>
+          <w:tcPr/>
+          <w:p>
+            <w:pPr>
+              <w:pStyle w:val="Compact"/>
+            </w:pPr>
+            <w:r>
+              <w:t xml:space="preserve">HXC-1896</w:t>
+            </w:r>
+          </w:p>
+        </w:tc>
+        <w:tc>
+          <w:tcPr/>
+          <w:p>
+            <w:pPr>
+              <w:pStyle w:val="Compact"/>
+            </w:pPr>
+            <w:r>
+              <w:t xml:space="preserve">Bug</w:t>
+            </w:r>
+          </w:p>
+        </w:tc>
+        <w:tc>
+          <w:tcPr/>
+          <w:p>
+            <w:pPr>
+              <w:pStyle w:val="Compact"/>
+            </w:pPr>
+            <w:r>
+              <w:t xml:space="preserve">P2</w:t>
+            </w:r>
+          </w:p>
+        </w:tc>
+        <w:tc>
+          <w:tcPr/>
+          <w:p>
+            <w:pPr>
+              <w:pStyle w:val="Compact"/>
+            </w:pPr>
+            <w:r>
+              <w:t xml:space="preserve">cmd/helix-session: runBridge 2 goroutines write same websocket.Conn w/o mutex -&gt; concurrent-write panic (server-side)</w:t>
+            </w:r>
+          </w:p>
+        </w:tc>
+        <w:tc>
+          <w:tcPr/>
+          <w:p>
+            <w:pPr>
+              <w:pStyle w:val="Compact"/>
+            </w:pPr>
+            <w:r>
+              <w:t xml:space="preserve">c01735e</w:t>
             </w:r>
           </w:p>
         </w:tc>

</xml_diff>

<commit_message>
docs: plan + docs_chain sync — 45 bugs, pkg+internal+cmd swept, whole-tree go test GREEN (260 pkg)
Co-Authored-By: Claude Opus 4.8 (1M context) <noreply@anthropic.com>
</commit_message>
<xml_diff>
--- a/docs/export/fixed.docx
+++ b/docs/export/fixed.docx
@@ -34,7 +34,7 @@
         <w:t xml:space="preserve"> </w:t>
       </w:r>
       <w:r>
-        <w:t xml:space="preserve">215</w:t>
+        <w:t xml:space="preserve">217</w:t>
       </w:r>
       <w:r>
         <w:t xml:space="preserve"> </w:t>
@@ -50,7 +50,7 @@
         <w:t xml:space="preserve"> </w:t>
       </w:r>
       <w:r>
-        <w:t xml:space="preserve">2026-06-16T15:54:28Z</w:t>
+        <w:t xml:space="preserve">2026-06-16T16:10:17Z</w:t>
       </w:r>
       <w:r>
         <w:t xml:space="preserve"> </w:t>
@@ -116,7 +116,7 @@
           <w:b/>
           <w:bCs/>
         </w:rPr>
-        <w:t xml:space="preserve">790</w:t>
+        <w:t xml:space="preserve">798</w:t>
       </w:r>
       <w:r>
         <w:t xml:space="preserve">.</w:t>
@@ -40674,6 +40674,462 @@
             </w:pPr>
             <w:r>
               <w:t xml:space="preserve">c01735e</w:t>
+            </w:r>
+          </w:p>
+        </w:tc>
+      </w:tr>
+      <w:tr>
+        <w:tc>
+          <w:tcPr/>
+          <w:p>
+            <w:pPr>
+              <w:pStyle w:val="Compact"/>
+            </w:pPr>
+            <w:r>
+              <w:t xml:space="preserve">HXC-1897</w:t>
+            </w:r>
+          </w:p>
+        </w:tc>
+        <w:tc>
+          <w:tcPr/>
+          <w:p>
+            <w:pPr>
+              <w:pStyle w:val="Compact"/>
+            </w:pPr>
+            <w:r>
+              <w:t xml:space="preserve">Task</w:t>
+            </w:r>
+          </w:p>
+        </w:tc>
+        <w:tc>
+          <w:tcPr/>
+          <w:p>
+            <w:pPr>
+              <w:pStyle w:val="Compact"/>
+            </w:pPr>
+            <w:r>
+              <w:t xml:space="preserve">P3</w:t>
+            </w:r>
+          </w:p>
+        </w:tc>
+        <w:tc>
+          <w:tcPr/>
+          <w:p>
+            <w:pPr>
+              <w:pStyle w:val="Compact"/>
+            </w:pPr>
+            <w:r>
+              <w:t xml:space="preserve">cmd/helix-agent: adversarial test, validation fail-closed + teardown no-panic (no bug)</w:t>
+            </w:r>
+          </w:p>
+        </w:tc>
+        <w:tc>
+          <w:tcPr/>
+          <w:p>
+            <w:pPr>
+              <w:pStyle w:val="Compact"/>
+            </w:pPr>
+            <w:r>
+              <w:t xml:space="preserve">d991593</w:t>
+            </w:r>
+          </w:p>
+        </w:tc>
+      </w:tr>
+      <w:tr>
+        <w:tc>
+          <w:tcPr/>
+          <w:p>
+            <w:pPr>
+              <w:pStyle w:val="Compact"/>
+            </w:pPr>
+            <w:r>
+              <w:t xml:space="preserve">HXC-1898</w:t>
+            </w:r>
+          </w:p>
+        </w:tc>
+        <w:tc>
+          <w:tcPr/>
+          <w:p>
+            <w:pPr>
+              <w:pStyle w:val="Compact"/>
+            </w:pPr>
+            <w:r>
+              <w:t xml:space="preserve">Task</w:t>
+            </w:r>
+          </w:p>
+        </w:tc>
+        <w:tc>
+          <w:tcPr/>
+          <w:p>
+            <w:pPr>
+              <w:pStyle w:val="Compact"/>
+            </w:pPr>
+            <w:r>
+              <w:t xml:space="preserve">P3</w:t>
+            </w:r>
+          </w:p>
+        </w:tc>
+        <w:tc>
+          <w:tcPr/>
+          <w:p>
+            <w:pPr>
+              <w:pStyle w:val="Compact"/>
+            </w:pPr>
+            <w:r>
+              <w:t xml:space="preserve">cmd/helix-policy: adversarial test, HTTP handler fail-CLOSED + HXC-1876 pinned at HTTP layer (no bug)</w:t>
+            </w:r>
+          </w:p>
+        </w:tc>
+        <w:tc>
+          <w:tcPr/>
+          <w:p>
+            <w:pPr>
+              <w:pStyle w:val="Compact"/>
+            </w:pPr>
+            <w:r>
+              <w:t xml:space="preserve">d991593</w:t>
+            </w:r>
+          </w:p>
+        </w:tc>
+      </w:tr>
+      <w:tr>
+        <w:tc>
+          <w:tcPr/>
+          <w:p>
+            <w:pPr>
+              <w:pStyle w:val="Compact"/>
+            </w:pPr>
+            <w:r>
+              <w:t xml:space="preserve">HXC-1899</w:t>
+            </w:r>
+          </w:p>
+        </w:tc>
+        <w:tc>
+          <w:tcPr/>
+          <w:p>
+            <w:pPr>
+              <w:pStyle w:val="Compact"/>
+            </w:pPr>
+            <w:r>
+              <w:t xml:space="preserve">Task</w:t>
+            </w:r>
+          </w:p>
+        </w:tc>
+        <w:tc>
+          <w:tcPr/>
+          <w:p>
+            <w:pPr>
+              <w:pStyle w:val="Compact"/>
+            </w:pPr>
+            <w:r>
+              <w:t xml:space="preserve">P3</w:t>
+            </w:r>
+          </w:p>
+        </w:tc>
+        <w:tc>
+          <w:tcPr/>
+          <w:p>
+            <w:pPr>
+              <w:pStyle w:val="Compact"/>
+            </w:pPr>
+            <w:r>
+              <w:t xml:space="preserve">cmd/hxc-registry: adversarial test, enum validation + atomicity + numeric NextHXCID (no bug)</w:t>
+            </w:r>
+          </w:p>
+        </w:tc>
+        <w:tc>
+          <w:tcPr/>
+          <w:p>
+            <w:pPr>
+              <w:pStyle w:val="Compact"/>
+            </w:pPr>
+            <w:r>
+              <w:t xml:space="preserve">d991593</w:t>
+            </w:r>
+          </w:p>
+        </w:tc>
+      </w:tr>
+      <w:tr>
+        <w:tc>
+          <w:tcPr/>
+          <w:p>
+            <w:pPr>
+              <w:pStyle w:val="Compact"/>
+            </w:pPr>
+            <w:r>
+              <w:t xml:space="preserve">HXC-1900</w:t>
+            </w:r>
+          </w:p>
+        </w:tc>
+        <w:tc>
+          <w:tcPr/>
+          <w:p>
+            <w:pPr>
+              <w:pStyle w:val="Compact"/>
+            </w:pPr>
+            <w:r>
+              <w:t xml:space="preserve">Task</w:t>
+            </w:r>
+          </w:p>
+        </w:tc>
+        <w:tc>
+          <w:tcPr/>
+          <w:p>
+            <w:pPr>
+              <w:pStyle w:val="Compact"/>
+            </w:pPr>
+            <w:r>
+              <w:t xml:space="preserve">P3</w:t>
+            </w:r>
+          </w:p>
+        </w:tc>
+        <w:tc>
+          <w:tcPr/>
+          <w:p>
+            <w:pPr>
+              <w:pStyle w:val="Compact"/>
+            </w:pPr>
+            <w:r>
+              <w:t xml:space="preserve">cmd/helix-setup: adversarial test, config validation + YAML injection-safe + deterministic gen (no bug)</w:t>
+            </w:r>
+          </w:p>
+        </w:tc>
+        <w:tc>
+          <w:tcPr/>
+          <w:p>
+            <w:pPr>
+              <w:pStyle w:val="Compact"/>
+            </w:pPr>
+            <w:r>
+              <w:t xml:space="preserve">d991593</w:t>
+            </w:r>
+          </w:p>
+        </w:tc>
+      </w:tr>
+      <w:tr>
+        <w:tc>
+          <w:tcPr/>
+          <w:p>
+            <w:pPr>
+              <w:pStyle w:val="Compact"/>
+            </w:pPr>
+            <w:r>
+              <w:t xml:space="preserve">HXC-1901</w:t>
+            </w:r>
+          </w:p>
+        </w:tc>
+        <w:tc>
+          <w:tcPr/>
+          <w:p>
+            <w:pPr>
+              <w:pStyle w:val="Compact"/>
+            </w:pPr>
+            <w:r>
+              <w:t xml:space="preserve">Bug</w:t>
+            </w:r>
+          </w:p>
+        </w:tc>
+        <w:tc>
+          <w:tcPr/>
+          <w:p>
+            <w:pPr>
+              <w:pStyle w:val="Compact"/>
+            </w:pPr>
+            <w:r>
+              <w:t xml:space="preserve">P1</w:t>
+            </w:r>
+          </w:p>
+        </w:tc>
+        <w:tc>
+          <w:tcPr/>
+          <w:p>
+            <w:pPr>
+              <w:pStyle w:val="Compact"/>
+            </w:pPr>
+            <w:r>
+              <w:t xml:space="preserve">cmd/helix-test: RunChallenge reports PASS+exit0 when evidence capture FAILS (CLAUDE-1 PASS-bluff in the QA harness)</w:t>
+            </w:r>
+          </w:p>
+        </w:tc>
+        <w:tc>
+          <w:tcPr/>
+          <w:p>
+            <w:pPr>
+              <w:pStyle w:val="Compact"/>
+            </w:pPr>
+            <w:r>
+              <w:t xml:space="preserve">0fcdfe0</w:t>
+            </w:r>
+          </w:p>
+        </w:tc>
+      </w:tr>
+      <w:tr>
+        <w:tc>
+          <w:tcPr/>
+          <w:p>
+            <w:pPr>
+              <w:pStyle w:val="Compact"/>
+            </w:pPr>
+            <w:r>
+              <w:t xml:space="preserve">HXC-1902</w:t>
+            </w:r>
+          </w:p>
+        </w:tc>
+        <w:tc>
+          <w:tcPr/>
+          <w:p>
+            <w:pPr>
+              <w:pStyle w:val="Compact"/>
+            </w:pPr>
+            <w:r>
+              <w:t xml:space="preserve">Task</w:t>
+            </w:r>
+          </w:p>
+        </w:tc>
+        <w:tc>
+          <w:tcPr/>
+          <w:p>
+            <w:pPr>
+              <w:pStyle w:val="Compact"/>
+            </w:pPr>
+            <w:r>
+              <w:t xml:space="preserve">P3</w:t>
+            </w:r>
+          </w:p>
+        </w:tc>
+        <w:tc>
+          <w:tcPr/>
+          <w:p>
+            <w:pPr>
+              <w:pStyle w:val="Compact"/>
+            </w:pPr>
+            <w:r>
+              <w:t xml:space="preserve">cmd/helix-health: adversarial test, /readyz /livez map non-Healthy -&gt; 503 (no bug)</w:t>
+            </w:r>
+          </w:p>
+        </w:tc>
+        <w:tc>
+          <w:tcPr/>
+          <w:p>
+            <w:pPr>
+              <w:pStyle w:val="Compact"/>
+            </w:pPr>
+            <w:r>
+              <w:t xml:space="preserve">0fcdfe0</w:t>
+            </w:r>
+          </w:p>
+        </w:tc>
+      </w:tr>
+      <w:tr>
+        <w:tc>
+          <w:tcPr/>
+          <w:p>
+            <w:pPr>
+              <w:pStyle w:val="Compact"/>
+            </w:pPr>
+            <w:r>
+              <w:t xml:space="preserve">HXC-1903</w:t>
+            </w:r>
+          </w:p>
+        </w:tc>
+        <w:tc>
+          <w:tcPr/>
+          <w:p>
+            <w:pPr>
+              <w:pStyle w:val="Compact"/>
+            </w:pPr>
+            <w:r>
+              <w:t xml:space="preserve">Task</w:t>
+            </w:r>
+          </w:p>
+        </w:tc>
+        <w:tc>
+          <w:tcPr/>
+          <w:p>
+            <w:pPr>
+              <w:pStyle w:val="Compact"/>
+            </w:pPr>
+            <w:r>
+              <w:t xml:space="preserve">P3</w:t>
+            </w:r>
+          </w:p>
+        </w:tc>
+        <w:tc>
+          <w:tcPr/>
+          <w:p>
+            <w:pPr>
+              <w:pStyle w:val="Compact"/>
+            </w:pPr>
+            <w:r>
+              <w:t xml:space="preserve">cmd/helix-raftctl: adversarial test, non-2xx/garbage response -&gt; exit 1 (no fail-open) (no bug)</w:t>
+            </w:r>
+          </w:p>
+        </w:tc>
+        <w:tc>
+          <w:tcPr/>
+          <w:p>
+            <w:pPr>
+              <w:pStyle w:val="Compact"/>
+            </w:pPr>
+            <w:r>
+              <w:t xml:space="preserve">0fcdfe0</w:t>
+            </w:r>
+          </w:p>
+        </w:tc>
+      </w:tr>
+      <w:tr>
+        <w:tc>
+          <w:tcPr/>
+          <w:p>
+            <w:pPr>
+              <w:pStyle w:val="Compact"/>
+            </w:pPr>
+            <w:r>
+              <w:t xml:space="preserve">HXC-1904</w:t>
+            </w:r>
+          </w:p>
+        </w:tc>
+        <w:tc>
+          <w:tcPr/>
+          <w:p>
+            <w:pPr>
+              <w:pStyle w:val="Compact"/>
+            </w:pPr>
+            <w:r>
+              <w:t xml:space="preserve">Task</w:t>
+            </w:r>
+          </w:p>
+        </w:tc>
+        <w:tc>
+          <w:tcPr/>
+          <w:p>
+            <w:pPr>
+              <w:pStyle w:val="Compact"/>
+            </w:pPr>
+            <w:r>
+              <w:t xml:space="preserve">P3</w:t>
+            </w:r>
+          </w:p>
+        </w:tc>
+        <w:tc>
+          <w:tcPr/>
+          <w:p>
+            <w:pPr>
+              <w:pStyle w:val="Compact"/>
+            </w:pPr>
+            <w:r>
+              <w:t xml:space="preserve">cmd/helixd: adversarial test, config fail-closed + clean shutdown + race-clean (no bug)</w:t>
+            </w:r>
+          </w:p>
+        </w:tc>
+        <w:tc>
+          <w:tcPr/>
+          <w:p>
+            <w:pPr>
+              <w:pStyle w:val="Compact"/>
+            </w:pPr>
+            <w:r>
+              <w:t xml:space="preserve">0fcdfe0</w:t>
             </w:r>
           </w:p>
         </w:tc>

</xml_diff>

<commit_message>
docs: docs_chain sync for HXC-1905 (fixed/issues exports md->docx/html/pdf) + registry commit ref
CLAUDE-3 docs-chain mechanical sync. Evidence: qa-results/docs_chain/20260616T192859Z.

Co-Authored-By: Claude Opus 4.8 (1M context) <noreply@anthropic.com>
</commit_message>
<xml_diff>
--- a/docs/export/fixed.docx
+++ b/docs/export/fixed.docx
@@ -34,7 +34,7 @@
         <w:t xml:space="preserve"> </w:t>
       </w:r>
       <w:r>
-        <w:t xml:space="preserve">217</w:t>
+        <w:t xml:space="preserve">218</w:t>
       </w:r>
       <w:r>
         <w:t xml:space="preserve"> </w:t>
@@ -50,7 +50,7 @@
         <w:t xml:space="preserve"> </w:t>
       </w:r>
       <w:r>
-        <w:t xml:space="preserve">2026-06-16T16:10:17Z</w:t>
+        <w:t xml:space="preserve">2026-06-16T19:27:30Z</w:t>
       </w:r>
       <w:r>
         <w:t xml:space="preserve"> </w:t>
@@ -116,7 +116,7 @@
           <w:b/>
           <w:bCs/>
         </w:rPr>
-        <w:t xml:space="preserve">798</w:t>
+        <w:t xml:space="preserve">799</w:t>
       </w:r>
       <w:r>
         <w:t xml:space="preserve">.</w:t>
@@ -41131,6 +41131,60 @@
             <w:r>
               <w:t xml:space="preserve">0fcdfe0</w:t>
             </w:r>
+          </w:p>
+        </w:tc>
+      </w:tr>
+      <w:tr>
+        <w:tc>
+          <w:tcPr/>
+          <w:p>
+            <w:pPr>
+              <w:pStyle w:val="Compact"/>
+            </w:pPr>
+            <w:r>
+              <w:t xml:space="preserve">HXC-1905</w:t>
+            </w:r>
+          </w:p>
+        </w:tc>
+        <w:tc>
+          <w:tcPr/>
+          <w:p>
+            <w:pPr>
+              <w:pStyle w:val="Compact"/>
+            </w:pPr>
+            <w:r>
+              <w:t xml:space="preserve">Bug</w:t>
+            </w:r>
+          </w:p>
+        </w:tc>
+        <w:tc>
+          <w:tcPr/>
+          <w:p>
+            <w:pPr>
+              <w:pStyle w:val="Compact"/>
+            </w:pPr>
+            <w:r>
+              <w:t xml:space="preserve">P1</w:t>
+            </w:r>
+          </w:p>
+        </w:tc>
+        <w:tc>
+          <w:tcPr/>
+          <w:p>
+            <w:pPr>
+              <w:pStyle w:val="Compact"/>
+            </w:pPr>
+            <w:r>
+              <w:t xml:space="preserve">WIRED hardenings: health fail-closed, metrics NaN-drop, swim saturating incarnation, backup atomic write, session Reap</w:t>
+            </w:r>
+          </w:p>
+        </w:tc>
+        <w:tc>
+          <w:tcPr/>
+          <w:p>
+            <w:pPr>
+              <w:pStyle w:val="Compact"/>
+            </w:pPr>
           </w:p>
         </w:tc>
       </w:tr>

</xml_diff>

<commit_message>
docs: docs_chain export sync for HXC-1906/1907 (CLAUDE-3)
Co-Authored-By: Claude Opus 4.8 (1M context) <noreply@anthropic.com>
</commit_message>
<xml_diff>
--- a/docs/export/fixed.docx
+++ b/docs/export/fixed.docx
@@ -34,7 +34,7 @@
         <w:t xml:space="preserve"> </w:t>
       </w:r>
       <w:r>
-        <w:t xml:space="preserve">218</w:t>
+        <w:t xml:space="preserve">219</w:t>
       </w:r>
       <w:r>
         <w:t xml:space="preserve"> </w:t>
@@ -50,7 +50,7 @@
         <w:t xml:space="preserve"> </w:t>
       </w:r>
       <w:r>
-        <w:t xml:space="preserve">2026-06-16T19:27:30Z</w:t>
+        <w:t xml:space="preserve">2026-06-16T20:09:49Z</w:t>
       </w:r>
       <w:r>
         <w:t xml:space="preserve"> </w:t>
@@ -116,7 +116,7 @@
           <w:b/>
           <w:bCs/>
         </w:rPr>
-        <w:t xml:space="preserve">799</w:t>
+        <w:t xml:space="preserve">801</w:t>
       </w:r>
       <w:r>
         <w:t xml:space="preserve">.</w:t>
@@ -41176,6 +41176,117 @@
             </w:pPr>
             <w:r>
               <w:t xml:space="preserve">WIRED hardenings: health fail-closed, metrics NaN-drop, swim saturating incarnation, backup atomic write, session Reap</w:t>
+            </w:r>
+          </w:p>
+        </w:tc>
+        <w:tc>
+          <w:tcPr/>
+          <w:p>
+            <w:pPr>
+              <w:pStyle w:val="Compact"/>
+            </w:pPr>
+            <w:r>
+              <w:t xml:space="preserve">efd380d</w:t>
+            </w:r>
+          </w:p>
+        </w:tc>
+      </w:tr>
+      <w:tr>
+        <w:tc>
+          <w:tcPr/>
+          <w:p>
+            <w:pPr>
+              <w:pStyle w:val="Compact"/>
+            </w:pPr>
+            <w:r>
+              <w:t xml:space="preserve">HXC-1906</w:t>
+            </w:r>
+          </w:p>
+        </w:tc>
+        <w:tc>
+          <w:tcPr/>
+          <w:p>
+            <w:pPr>
+              <w:pStyle w:val="Compact"/>
+            </w:pPr>
+            <w:r>
+              <w:t xml:space="preserve">Bug</w:t>
+            </w:r>
+          </w:p>
+        </w:tc>
+        <w:tc>
+          <w:tcPr/>
+          <w:p>
+            <w:pPr>
+              <w:pStyle w:val="Compact"/>
+            </w:pPr>
+            <w:r>
+              <w:t xml:space="preserve">P1</w:t>
+            </w:r>
+          </w:p>
+        </w:tc>
+        <w:tc>
+          <w:tcPr/>
+          <w:p>
+            <w:pPr>
+              <w:pStyle w:val="Compact"/>
+            </w:pPr>
+            <w:r>
+              <w:t xml:space="preserve">ratelimit UserLimiter: NaN refill rate bypasses the rate-limit cap (fail-open)</w:t>
+            </w:r>
+          </w:p>
+        </w:tc>
+        <w:tc>
+          <w:tcPr/>
+          <w:p>
+            <w:pPr>
+              <w:pStyle w:val="Compact"/>
+            </w:pPr>
+          </w:p>
+        </w:tc>
+      </w:tr>
+      <w:tr>
+        <w:tc>
+          <w:tcPr/>
+          <w:p>
+            <w:pPr>
+              <w:pStyle w:val="Compact"/>
+            </w:pPr>
+            <w:r>
+              <w:t xml:space="preserve">HXC-1907</w:t>
+            </w:r>
+          </w:p>
+        </w:tc>
+        <w:tc>
+          <w:tcPr/>
+          <w:p>
+            <w:pPr>
+              <w:pStyle w:val="Compact"/>
+            </w:pPr>
+            <w:r>
+              <w:t xml:space="preserve">Task</w:t>
+            </w:r>
+          </w:p>
+        </w:tc>
+        <w:tc>
+          <w:tcPr/>
+          <w:p>
+            <w:pPr>
+              <w:pStyle w:val="Compact"/>
+            </w:pPr>
+            <w:r>
+              <w:t xml:space="preserve">P2</w:t>
+            </w:r>
+          </w:p>
+        </w:tc>
+        <w:tc>
+          <w:tcPr/>
+          <w:p>
+            <w:pPr>
+              <w:pStyle w:val="Compact"/>
+            </w:pPr>
+            <w:r>
+              <w:t xml:space="preserve">Adversarial coverage sweep: semaphore/lru/bursthysteresis/gpuattest/modelintegrity/redundantexec (no prod bug; contracts pinned)</w:t>
             </w:r>
           </w:p>
         </w:tc>

</xml_diff>

<commit_message>
docs: docs_chain export sync for HXC-1908/1909 (CLAUDE-3)
Co-Authored-By: Claude Opus 4.8 (1M context) <noreply@anthropic.com>
</commit_message>
<xml_diff>
--- a/docs/export/fixed.docx
+++ b/docs/export/fixed.docx
@@ -34,7 +34,7 @@
         <w:t xml:space="preserve"> </w:t>
       </w:r>
       <w:r>
-        <w:t xml:space="preserve">219</w:t>
+        <w:t xml:space="preserve">220</w:t>
       </w:r>
       <w:r>
         <w:t xml:space="preserve"> </w:t>
@@ -50,7 +50,7 @@
         <w:t xml:space="preserve"> </w:t>
       </w:r>
       <w:r>
-        <w:t xml:space="preserve">2026-06-16T20:09:49Z</w:t>
+        <w:t xml:space="preserve">2026-06-16T20:36:13Z</w:t>
       </w:r>
       <w:r>
         <w:t xml:space="preserve"> </w:t>
@@ -116,7 +116,7 @@
           <w:b/>
           <w:bCs/>
         </w:rPr>
-        <w:t xml:space="preserve">801</w:t>
+        <w:t xml:space="preserve">803</w:t>
       </w:r>
       <w:r>
         <w:t xml:space="preserve">.</w:t>
@@ -41287,6 +41287,114 @@
             </w:pPr>
             <w:r>
               <w:t xml:space="preserve">Adversarial coverage sweep: semaphore/lru/bursthysteresis/gpuattest/modelintegrity/redundantexec (no prod bug; contracts pinned)</w:t>
+            </w:r>
+          </w:p>
+        </w:tc>
+        <w:tc>
+          <w:tcPr/>
+          <w:p>
+            <w:pPr>
+              <w:pStyle w:val="Compact"/>
+            </w:pPr>
+          </w:p>
+        </w:tc>
+      </w:tr>
+      <w:tr>
+        <w:tc>
+          <w:tcPr/>
+          <w:p>
+            <w:pPr>
+              <w:pStyle w:val="Compact"/>
+            </w:pPr>
+            <w:r>
+              <w:t xml:space="preserve">HXC-1908</w:t>
+            </w:r>
+          </w:p>
+        </w:tc>
+        <w:tc>
+          <w:tcPr/>
+          <w:p>
+            <w:pPr>
+              <w:pStyle w:val="Compact"/>
+            </w:pPr>
+            <w:r>
+              <w:t xml:space="preserve">Bug</w:t>
+            </w:r>
+          </w:p>
+        </w:tc>
+        <w:tc>
+          <w:tcPr/>
+          <w:p>
+            <w:pPr>
+              <w:pStyle w:val="Compact"/>
+            </w:pPr>
+            <w:r>
+              <w:t xml:space="preserve">P1</w:t>
+            </w:r>
+          </w:p>
+        </w:tc>
+        <w:tc>
+          <w:tcPr/>
+          <w:p>
+            <w:pPr>
+              <w:pStyle w:val="Compact"/>
+            </w:pPr>
+            <w:r>
+              <w:t xml:space="preserve">build/cache DiskCache: path-traversal key + collision + empty-digest-targets-root (content-integrity/security)</w:t>
+            </w:r>
+          </w:p>
+        </w:tc>
+        <w:tc>
+          <w:tcPr/>
+          <w:p>
+            <w:pPr>
+              <w:pStyle w:val="Compact"/>
+            </w:pPr>
+          </w:p>
+        </w:tc>
+      </w:tr>
+      <w:tr>
+        <w:tc>
+          <w:tcPr/>
+          <w:p>
+            <w:pPr>
+              <w:pStyle w:val="Compact"/>
+            </w:pPr>
+            <w:r>
+              <w:t xml:space="preserve">HXC-1909</w:t>
+            </w:r>
+          </w:p>
+        </w:tc>
+        <w:tc>
+          <w:tcPr/>
+          <w:p>
+            <w:pPr>
+              <w:pStyle w:val="Compact"/>
+            </w:pPr>
+            <w:r>
+              <w:t xml:space="preserve">Task</w:t>
+            </w:r>
+          </w:p>
+        </w:tc>
+        <w:tc>
+          <w:tcPr/>
+          <w:p>
+            <w:pPr>
+              <w:pStyle w:val="Compact"/>
+            </w:pPr>
+            <w:r>
+              <w:t xml:space="preserve">P2</w:t>
+            </w:r>
+          </w:p>
+        </w:tc>
+        <w:tc>
+          <w:tcPr/>
+          <w:p>
+            <w:pPr>
+              <w:pStyle w:val="Compact"/>
+            </w:pPr>
+            <w:r>
+              <w:t xml:space="preserve">Adversarial coverage sweep waves 3-4: crdt/merkle, provider/{chutes,aws,ionet}, session/backends (no prod bug; mutation-proven)</w:t>
             </w:r>
           </w:p>
         </w:tc>

</xml_diff>

<commit_message>
docs: docs_chain export sync for HXC-1910/1911/1912 (CLAUDE-3)
Co-Authored-By: Claude Opus 4.8 (1M context) <noreply@anthropic.com>
</commit_message>
<xml_diff>
--- a/docs/export/fixed.docx
+++ b/docs/export/fixed.docx
@@ -34,7 +34,7 @@
         <w:t xml:space="preserve"> </w:t>
       </w:r>
       <w:r>
-        <w:t xml:space="preserve">220</w:t>
+        <w:t xml:space="preserve">221</w:t>
       </w:r>
       <w:r>
         <w:t xml:space="preserve"> </w:t>
@@ -50,7 +50,7 @@
         <w:t xml:space="preserve"> </w:t>
       </w:r>
       <w:r>
-        <w:t xml:space="preserve">2026-06-16T20:36:13Z</w:t>
+        <w:t xml:space="preserve">2026-06-16T20:51:13Z</w:t>
       </w:r>
       <w:r>
         <w:t xml:space="preserve"> </w:t>
@@ -116,7 +116,7 @@
           <w:b/>
           <w:bCs/>
         </w:rPr>
-        <w:t xml:space="preserve">803</w:t>
+        <w:t xml:space="preserve">806</w:t>
       </w:r>
       <w:r>
         <w:t xml:space="preserve">.</w:t>
@@ -41395,6 +41395,168 @@
             </w:pPr>
             <w:r>
               <w:t xml:space="preserve">Adversarial coverage sweep waves 3-4: crdt/merkle, provider/{chutes,aws,ionet}, session/backends (no prod bug; mutation-proven)</w:t>
+            </w:r>
+          </w:p>
+        </w:tc>
+        <w:tc>
+          <w:tcPr/>
+          <w:p>
+            <w:pPr>
+              <w:pStyle w:val="Compact"/>
+            </w:pPr>
+          </w:p>
+        </w:tc>
+      </w:tr>
+      <w:tr>
+        <w:tc>
+          <w:tcPr/>
+          <w:p>
+            <w:pPr>
+              <w:pStyle w:val="Compact"/>
+            </w:pPr>
+            <w:r>
+              <w:t xml:space="preserve">HXC-1910</w:t>
+            </w:r>
+          </w:p>
+        </w:tc>
+        <w:tc>
+          <w:tcPr/>
+          <w:p>
+            <w:pPr>
+              <w:pStyle w:val="Compact"/>
+            </w:pPr>
+            <w:r>
+              <w:t xml:space="preserve">Bug</w:t>
+            </w:r>
+          </w:p>
+        </w:tc>
+        <w:tc>
+          <w:tcPr/>
+          <w:p>
+            <w:pPr>
+              <w:pStyle w:val="Compact"/>
+            </w:pPr>
+            <w:r>
+              <w:t xml:space="preserve">P1</w:t>
+            </w:r>
+          </w:p>
+        </w:tc>
+        <w:tc>
+          <w:tcPr/>
+          <w:p>
+            <w:pPr>
+              <w:pStyle w:val="Compact"/>
+            </w:pPr>
+            <w:r>
+              <w:t xml:space="preserve">testing/dst determinism bluff: KillNode reschedule order non-deterministic for fixed seed (map-iteration leak)</w:t>
+            </w:r>
+          </w:p>
+        </w:tc>
+        <w:tc>
+          <w:tcPr/>
+          <w:p>
+            <w:pPr>
+              <w:pStyle w:val="Compact"/>
+            </w:pPr>
+          </w:p>
+        </w:tc>
+      </w:tr>
+      <w:tr>
+        <w:tc>
+          <w:tcPr/>
+          <w:p>
+            <w:pPr>
+              <w:pStyle w:val="Compact"/>
+            </w:pPr>
+            <w:r>
+              <w:t xml:space="preserve">HXC-1911</w:t>
+            </w:r>
+          </w:p>
+        </w:tc>
+        <w:tc>
+          <w:tcPr/>
+          <w:p>
+            <w:pPr>
+              <w:pStyle w:val="Compact"/>
+            </w:pPr>
+            <w:r>
+              <w:t xml:space="preserve">Bug</w:t>
+            </w:r>
+          </w:p>
+        </w:tc>
+        <w:tc>
+          <w:tcPr/>
+          <w:p>
+            <w:pPr>
+              <w:pStyle w:val="Compact"/>
+            </w:pPr>
+            <w:r>
+              <w:t xml:space="preserve">P1</w:t>
+            </w:r>
+          </w:p>
+        </w:tc>
+        <w:tc>
+          <w:tcPr/>
+          <w:p>
+            <w:pPr>
+              <w:pStyle w:val="Compact"/>
+            </w:pPr>
+            <w:r>
+              <w:t xml:space="preserve">provider/runpod: duplicate worker-ID bypasses Capacity quota -&gt; leaks billable workers (fail-open)</w:t>
+            </w:r>
+          </w:p>
+        </w:tc>
+        <w:tc>
+          <w:tcPr/>
+          <w:p>
+            <w:pPr>
+              <w:pStyle w:val="Compact"/>
+            </w:pPr>
+          </w:p>
+        </w:tc>
+      </w:tr>
+      <w:tr>
+        <w:tc>
+          <w:tcPr/>
+          <w:p>
+            <w:pPr>
+              <w:pStyle w:val="Compact"/>
+            </w:pPr>
+            <w:r>
+              <w:t xml:space="preserve">HXC-1912</w:t>
+            </w:r>
+          </w:p>
+        </w:tc>
+        <w:tc>
+          <w:tcPr/>
+          <w:p>
+            <w:pPr>
+              <w:pStyle w:val="Compact"/>
+            </w:pPr>
+            <w:r>
+              <w:t xml:space="preserve">Task</w:t>
+            </w:r>
+          </w:p>
+        </w:tc>
+        <w:tc>
+          <w:tcPr/>
+          <w:p>
+            <w:pPr>
+              <w:pStyle w:val="Compact"/>
+            </w:pPr>
+            <w:r>
+              <w:t xml:space="preserve">P2</w:t>
+            </w:r>
+          </w:p>
+        </w:tc>
+        <w:tc>
+          <w:tcPr/>
+          <w:p>
+            <w:pPr>
+              <w:pStyle w:val="Compact"/>
+            </w:pPr>
+            <w:r>
+              <w:t xml:space="preserve">Adversarial coverage: pkg/tofu TOFU verifier (no bug; 5 mutation-proven contracts)</w:t>
             </w:r>
           </w:p>
         </w:tc>

</xml_diff>

<commit_message>
docs: docs_chain export sync for HXC-1913 (CLAUDE-3)
Co-Authored-By: Claude Opus 4.8 (1M context) <noreply@anthropic.com>
</commit_message>
<xml_diff>
--- a/docs/export/fixed.docx
+++ b/docs/export/fixed.docx
@@ -34,7 +34,7 @@
         <w:t xml:space="preserve"> </w:t>
       </w:r>
       <w:r>
-        <w:t xml:space="preserve">221</w:t>
+        <w:t xml:space="preserve">222</w:t>
       </w:r>
       <w:r>
         <w:t xml:space="preserve"> </w:t>
@@ -50,7 +50,7 @@
         <w:t xml:space="preserve"> </w:t>
       </w:r>
       <w:r>
-        <w:t xml:space="preserve">2026-06-16T20:51:13Z</w:t>
+        <w:t xml:space="preserve">2026-06-16T20:58:34Z</w:t>
       </w:r>
       <w:r>
         <w:t xml:space="preserve"> </w:t>
@@ -116,7 +116,7 @@
           <w:b/>
           <w:bCs/>
         </w:rPr>
-        <w:t xml:space="preserve">806</w:t>
+        <w:t xml:space="preserve">807</w:t>
       </w:r>
       <w:r>
         <w:t xml:space="preserve">.</w:t>
@@ -41557,6 +41557,60 @@
             </w:pPr>
             <w:r>
               <w:t xml:space="preserve">Adversarial coverage: pkg/tofu TOFU verifier (no bug; 5 mutation-proven contracts)</w:t>
+            </w:r>
+          </w:p>
+        </w:tc>
+        <w:tc>
+          <w:tcPr/>
+          <w:p>
+            <w:pPr>
+              <w:pStyle w:val="Compact"/>
+            </w:pPr>
+          </w:p>
+        </w:tc>
+      </w:tr>
+      <w:tr>
+        <w:tc>
+          <w:tcPr/>
+          <w:p>
+            <w:pPr>
+              <w:pStyle w:val="Compact"/>
+            </w:pPr>
+            <w:r>
+              <w:t xml:space="preserve">HXC-1913</w:t>
+            </w:r>
+          </w:p>
+        </w:tc>
+        <w:tc>
+          <w:tcPr/>
+          <w:p>
+            <w:pPr>
+              <w:pStyle w:val="Compact"/>
+            </w:pPr>
+            <w:r>
+              <w:t xml:space="preserve">Task</w:t>
+            </w:r>
+          </w:p>
+        </w:tc>
+        <w:tc>
+          <w:tcPr/>
+          <w:p>
+            <w:pPr>
+              <w:pStyle w:val="Compact"/>
+            </w:pPr>
+            <w:r>
+              <w:t xml:space="preserve">P2</w:t>
+            </w:r>
+          </w:p>
+        </w:tc>
+        <w:tc>
+          <w:tcPr/>
+          <w:p>
+            <w:pPr>
+              <w:pStyle w:val="Compact"/>
+            </w:pPr>
+            <w:r>
+              <w:t xml:space="preserve">Adversarial coverage wave 6: testing/{scenario,sessionfsm,turmoil} (no bug; determinism verified real)</w:t>
             </w:r>
           </w:p>
         </w:tc>

</xml_diff>

<commit_message>
docs: docs_chain export sync for HXC-1914/1915 (CLAUDE-3)
Co-Authored-By: Claude Opus 4.8 (1M context) <noreply@anthropic.com>
</commit_message>
<xml_diff>
--- a/docs/export/fixed.docx
+++ b/docs/export/fixed.docx
@@ -34,7 +34,7 @@
         <w:t xml:space="preserve"> </w:t>
       </w:r>
       <w:r>
-        <w:t xml:space="preserve">222</w:t>
+        <w:t xml:space="preserve">223</w:t>
       </w:r>
       <w:r>
         <w:t xml:space="preserve"> </w:t>
@@ -50,7 +50,7 @@
         <w:t xml:space="preserve"> </w:t>
       </w:r>
       <w:r>
-        <w:t xml:space="preserve">2026-06-16T20:58:34Z</w:t>
+        <w:t xml:space="preserve">2026-06-16T21:05:32Z</w:t>
       </w:r>
       <w:r>
         <w:t xml:space="preserve"> </w:t>
@@ -116,7 +116,7 @@
           <w:b/>
           <w:bCs/>
         </w:rPr>
-        <w:t xml:space="preserve">807</w:t>
+        <w:t xml:space="preserve">809</w:t>
       </w:r>
       <w:r>
         <w:t xml:space="preserve">.</w:t>
@@ -41611,6 +41611,114 @@
             </w:pPr>
             <w:r>
               <w:t xml:space="preserve">Adversarial coverage wave 6: testing/{scenario,sessionfsm,turmoil} (no bug; determinism verified real)</w:t>
+            </w:r>
+          </w:p>
+        </w:tc>
+        <w:tc>
+          <w:tcPr/>
+          <w:p>
+            <w:pPr>
+              <w:pStyle w:val="Compact"/>
+            </w:pPr>
+          </w:p>
+        </w:tc>
+      </w:tr>
+      <w:tr>
+        <w:tc>
+          <w:tcPr/>
+          <w:p>
+            <w:pPr>
+              <w:pStyle w:val="Compact"/>
+            </w:pPr>
+            <w:r>
+              <w:t xml:space="preserve">HXC-1914</w:t>
+            </w:r>
+          </w:p>
+        </w:tc>
+        <w:tc>
+          <w:tcPr/>
+          <w:p>
+            <w:pPr>
+              <w:pStyle w:val="Compact"/>
+            </w:pPr>
+            <w:r>
+              <w:t xml:space="preserve">Bug</w:t>
+            </w:r>
+          </w:p>
+        </w:tc>
+        <w:tc>
+          <w:tcPr/>
+          <w:p>
+            <w:pPr>
+              <w:pStyle w:val="Compact"/>
+            </w:pPr>
+            <w:r>
+              <w:t xml:space="preserve">P2</w:t>
+            </w:r>
+          </w:p>
+        </w:tc>
+        <w:tc>
+          <w:tcPr/>
+          <w:p>
+            <w:pPr>
+              <w:pStyle w:val="Compact"/>
+            </w:pPr>
+            <w:r>
+              <w:t xml:space="preserve">testing/dstcompress: BatchSchedule doc falsely claimed FIFO same-timestamp dispatch (doc-sync fix)</w:t>
+            </w:r>
+          </w:p>
+        </w:tc>
+        <w:tc>
+          <w:tcPr/>
+          <w:p>
+            <w:pPr>
+              <w:pStyle w:val="Compact"/>
+            </w:pPr>
+          </w:p>
+        </w:tc>
+      </w:tr>
+      <w:tr>
+        <w:tc>
+          <w:tcPr/>
+          <w:p>
+            <w:pPr>
+              <w:pStyle w:val="Compact"/>
+            </w:pPr>
+            <w:r>
+              <w:t xml:space="preserve">HXC-1915</w:t>
+            </w:r>
+          </w:p>
+        </w:tc>
+        <w:tc>
+          <w:tcPr/>
+          <w:p>
+            <w:pPr>
+              <w:pStyle w:val="Compact"/>
+            </w:pPr>
+            <w:r>
+              <w:t xml:space="preserve">Task</w:t>
+            </w:r>
+          </w:p>
+        </w:tc>
+        <w:tc>
+          <w:tcPr/>
+          <w:p>
+            <w:pPr>
+              <w:pStyle w:val="Compact"/>
+            </w:pPr>
+            <w:r>
+              <w:t xml:space="preserve">P2</w:t>
+            </w:r>
+          </w:p>
+        </w:tc>
+        <w:tc>
+          <w:tcPr/>
+          <w:p>
+            <w:pPr>
+              <w:pStyle w:val="Compact"/>
+            </w:pPr>
+            <w:r>
+              <w:t xml:space="preserve">Adversarial coverage wave 7: testing/{dstworkload,dstscale} (no bug; determinism verified real)</w:t>
             </w:r>
           </w:p>
         </w:tc>

</xml_diff>

<commit_message>
docs: docs_chain export sync for HXC-1916/1917/1918 (CLAUDE-3)
Co-Authored-By: Claude Opus 4.8 (1M context) <noreply@anthropic.com>
</commit_message>
<xml_diff>
--- a/docs/export/fixed.docx
+++ b/docs/export/fixed.docx
@@ -34,7 +34,7 @@
         <w:t xml:space="preserve"> </w:t>
       </w:r>
       <w:r>
-        <w:t xml:space="preserve">223</w:t>
+        <w:t xml:space="preserve">224</w:t>
       </w:r>
       <w:r>
         <w:t xml:space="preserve"> </w:t>
@@ -50,7 +50,7 @@
         <w:t xml:space="preserve"> </w:t>
       </w:r>
       <w:r>
-        <w:t xml:space="preserve">2026-06-16T21:05:32Z</w:t>
+        <w:t xml:space="preserve">2026-06-16T21:12:37Z</w:t>
       </w:r>
       <w:r>
         <w:t xml:space="preserve"> </w:t>
@@ -116,7 +116,7 @@
           <w:b/>
           <w:bCs/>
         </w:rPr>
-        <w:t xml:space="preserve">809</w:t>
+        <w:t xml:space="preserve">812</w:t>
       </w:r>
       <w:r>
         <w:t xml:space="preserve">.</w:t>
@@ -41719,6 +41719,168 @@
             </w:pPr>
             <w:r>
               <w:t xml:space="preserve">Adversarial coverage wave 7: testing/{dstworkload,dstscale} (no bug; determinism verified real)</w:t>
+            </w:r>
+          </w:p>
+        </w:tc>
+        <w:tc>
+          <w:tcPr/>
+          <w:p>
+            <w:pPr>
+              <w:pStyle w:val="Compact"/>
+            </w:pPr>
+          </w:p>
+        </w:tc>
+      </w:tr>
+      <w:tr>
+        <w:tc>
+          <w:tcPr/>
+          <w:p>
+            <w:pPr>
+              <w:pStyle w:val="Compact"/>
+            </w:pPr>
+            <w:r>
+              <w:t xml:space="preserve">HXC-1916</w:t>
+            </w:r>
+          </w:p>
+        </w:tc>
+        <w:tc>
+          <w:tcPr/>
+          <w:p>
+            <w:pPr>
+              <w:pStyle w:val="Compact"/>
+            </w:pPr>
+            <w:r>
+              <w:t xml:space="preserve">Bug</w:t>
+            </w:r>
+          </w:p>
+        </w:tc>
+        <w:tc>
+          <w:tcPr/>
+          <w:p>
+            <w:pPr>
+              <w:pStyle w:val="Compact"/>
+            </w:pPr>
+            <w:r>
+              <w:t xml:space="preserve">P1</w:t>
+            </w:r>
+          </w:p>
+        </w:tc>
+        <w:tc>
+          <w:tcPr/>
+          <w:p>
+            <w:pPr>
+              <w:pStyle w:val="Compact"/>
+            </w:pPr>
+            <w:r>
+              <w:t xml:space="preserve">testing/snapshot: name path-escape — Create/Delete outside baseDir (invisible snapshot + arbitrary file delete)</w:t>
+            </w:r>
+          </w:p>
+        </w:tc>
+        <w:tc>
+          <w:tcPr/>
+          <w:p>
+            <w:pPr>
+              <w:pStyle w:val="Compact"/>
+            </w:pPr>
+          </w:p>
+        </w:tc>
+      </w:tr>
+      <w:tr>
+        <w:tc>
+          <w:tcPr/>
+          <w:p>
+            <w:pPr>
+              <w:pStyle w:val="Compact"/>
+            </w:pPr>
+            <w:r>
+              <w:t xml:space="preserve">HXC-1917</w:t>
+            </w:r>
+          </w:p>
+        </w:tc>
+        <w:tc>
+          <w:tcPr/>
+          <w:p>
+            <w:pPr>
+              <w:pStyle w:val="Compact"/>
+            </w:pPr>
+            <w:r>
+              <w:t xml:space="preserve">Bug</w:t>
+            </w:r>
+          </w:p>
+        </w:tc>
+        <w:tc>
+          <w:tcPr/>
+          <w:p>
+            <w:pPr>
+              <w:pStyle w:val="Compact"/>
+            </w:pPr>
+            <w:r>
+              <w:t xml:space="preserve">P0</w:t>
+            </w:r>
+          </w:p>
+        </w:tc>
+        <w:tc>
+          <w:tcPr/>
+          <w:p>
+            <w:pPr>
+              <w:pStyle w:val="Compact"/>
+            </w:pPr>
+            <w:r>
+              <w:t xml:space="preserve">testing/regression: NaN/Inf sample silently bluffs NO-CHANGE — regression detector hides real regressions (CLAUDE-1)</w:t>
+            </w:r>
+          </w:p>
+        </w:tc>
+        <w:tc>
+          <w:tcPr/>
+          <w:p>
+            <w:pPr>
+              <w:pStyle w:val="Compact"/>
+            </w:pPr>
+          </w:p>
+        </w:tc>
+      </w:tr>
+      <w:tr>
+        <w:tc>
+          <w:tcPr/>
+          <w:p>
+            <w:pPr>
+              <w:pStyle w:val="Compact"/>
+            </w:pPr>
+            <w:r>
+              <w:t xml:space="preserve">HXC-1918</w:t>
+            </w:r>
+          </w:p>
+        </w:tc>
+        <w:tc>
+          <w:tcPr/>
+          <w:p>
+            <w:pPr>
+              <w:pStyle w:val="Compact"/>
+            </w:pPr>
+            <w:r>
+              <w:t xml:space="preserve">Bug</w:t>
+            </w:r>
+          </w:p>
+        </w:tc>
+        <w:tc>
+          <w:tcPr/>
+          <w:p>
+            <w:pPr>
+              <w:pStyle w:val="Compact"/>
+            </w:pPr>
+            <w:r>
+              <w:t xml:space="preserve">P1</w:t>
+            </w:r>
+          </w:p>
+        </w:tc>
+        <w:tc>
+          <w:tcPr/>
+          <w:p>
+            <w:pPr>
+              <w:pStyle w:val="Compact"/>
+            </w:pPr>
+            <w:r>
+              <w:t xml:space="preserve">testing/chaos: ActiveFaults() only reported NodeCrash — every other applied fault silently dropped (no-op bluff)</w:t>
             </w:r>
           </w:p>
         </w:tc>

</xml_diff>

<commit_message>
docs: docs_chain export sync for HXC-1919..1922 (CLAUDE-3)
Co-Authored-By: Claude Opus 4.8 (1M context) <noreply@anthropic.com>
</commit_message>
<xml_diff>
--- a/docs/export/fixed.docx
+++ b/docs/export/fixed.docx
@@ -34,7 +34,7 @@
         <w:t xml:space="preserve"> </w:t>
       </w:r>
       <w:r>
-        <w:t xml:space="preserve">224</w:t>
+        <w:t xml:space="preserve">225</w:t>
       </w:r>
       <w:r>
         <w:t xml:space="preserve"> </w:t>
@@ -50,7 +50,7 @@
         <w:t xml:space="preserve"> </w:t>
       </w:r>
       <w:r>
-        <w:t xml:space="preserve">2026-06-16T21:12:37Z</w:t>
+        <w:t xml:space="preserve">2026-06-16T21:19:29Z</w:t>
       </w:r>
       <w:r>
         <w:t xml:space="preserve"> </w:t>
@@ -116,7 +116,7 @@
           <w:b/>
           <w:bCs/>
         </w:rPr>
-        <w:t xml:space="preserve">812</w:t>
+        <w:t xml:space="preserve">816</w:t>
       </w:r>
       <w:r>
         <w:t xml:space="preserve">.</w:t>
@@ -41881,6 +41881,222 @@
             </w:pPr>
             <w:r>
               <w:t xml:space="preserve">testing/chaos: ActiveFaults() only reported NodeCrash — every other applied fault silently dropped (no-op bluff)</w:t>
+            </w:r>
+          </w:p>
+        </w:tc>
+        <w:tc>
+          <w:tcPr/>
+          <w:p>
+            <w:pPr>
+              <w:pStyle w:val="Compact"/>
+            </w:pPr>
+          </w:p>
+        </w:tc>
+      </w:tr>
+      <w:tr>
+        <w:tc>
+          <w:tcPr/>
+          <w:p>
+            <w:pPr>
+              <w:pStyle w:val="Compact"/>
+            </w:pPr>
+            <w:r>
+              <w:t xml:space="preserve">HXC-1919</w:t>
+            </w:r>
+          </w:p>
+        </w:tc>
+        <w:tc>
+          <w:tcPr/>
+          <w:p>
+            <w:pPr>
+              <w:pStyle w:val="Compact"/>
+            </w:pPr>
+            <w:r>
+              <w:t xml:space="preserve">Bug</w:t>
+            </w:r>
+          </w:p>
+        </w:tc>
+        <w:tc>
+          <w:tcPr/>
+          <w:p>
+            <w:pPr>
+              <w:pStyle w:val="Compact"/>
+            </w:pPr>
+            <w:r>
+              <w:t xml:space="preserve">P1</w:t>
+            </w:r>
+          </w:p>
+        </w:tc>
+        <w:tc>
+          <w:tcPr/>
+          <w:p>
+            <w:pPr>
+              <w:pStyle w:val="Compact"/>
+            </w:pPr>
+            <w:r>
+              <w:t xml:space="preserve">testing/runner: a panicking suite crashes the whole runner (no recover) -&gt; all results lost</w:t>
+            </w:r>
+          </w:p>
+        </w:tc>
+        <w:tc>
+          <w:tcPr/>
+          <w:p>
+            <w:pPr>
+              <w:pStyle w:val="Compact"/>
+            </w:pPr>
+          </w:p>
+        </w:tc>
+      </w:tr>
+      <w:tr>
+        <w:tc>
+          <w:tcPr/>
+          <w:p>
+            <w:pPr>
+              <w:pStyle w:val="Compact"/>
+            </w:pPr>
+            <w:r>
+              <w:t xml:space="preserve">HXC-1920</w:t>
+            </w:r>
+          </w:p>
+        </w:tc>
+        <w:tc>
+          <w:tcPr/>
+          <w:p>
+            <w:pPr>
+              <w:pStyle w:val="Compact"/>
+            </w:pPr>
+            <w:r>
+              <w:t xml:space="preserve">Bug</w:t>
+            </w:r>
+          </w:p>
+        </w:tc>
+        <w:tc>
+          <w:tcPr/>
+          <w:p>
+            <w:pPr>
+              <w:pStyle w:val="Compact"/>
+            </w:pPr>
+            <w:r>
+              <w:t xml:space="preserve">P1</w:t>
+            </w:r>
+          </w:p>
+        </w:tc>
+        <w:tc>
+          <w:tcPr/>
+          <w:p>
+            <w:pPr>
+              <w:pStyle w:val="Compact"/>
+            </w:pPr>
+            <w:r>
+              <w:t xml:space="preserve">testing/evidence: Artifact() name path-escape — anti-bluff evidence sink writable outside base / collidable</w:t>
+            </w:r>
+          </w:p>
+        </w:tc>
+        <w:tc>
+          <w:tcPr/>
+          <w:p>
+            <w:pPr>
+              <w:pStyle w:val="Compact"/>
+            </w:pPr>
+          </w:p>
+        </w:tc>
+      </w:tr>
+      <w:tr>
+        <w:tc>
+          <w:tcPr/>
+          <w:p>
+            <w:pPr>
+              <w:pStyle w:val="Compact"/>
+            </w:pPr>
+            <w:r>
+              <w:t xml:space="preserve">HXC-1921</w:t>
+            </w:r>
+          </w:p>
+        </w:tc>
+        <w:tc>
+          <w:tcPr/>
+          <w:p>
+            <w:pPr>
+              <w:pStyle w:val="Compact"/>
+            </w:pPr>
+            <w:r>
+              <w:t xml:space="preserve">Bug</w:t>
+            </w:r>
+          </w:p>
+        </w:tc>
+        <w:tc>
+          <w:tcPr/>
+          <w:p>
+            <w:pPr>
+              <w:pStyle w:val="Compact"/>
+            </w:pPr>
+            <w:r>
+              <w:t xml:space="preserve">P2</w:t>
+            </w:r>
+          </w:p>
+        </w:tc>
+        <w:tc>
+          <w:tcPr/>
+          <w:p>
+            <w:pPr>
+              <w:pStyle w:val="Compact"/>
+            </w:pPr>
+            <w:r>
+              <w:t xml:space="preserve">testing/device: Pool.provisionAndTrack leaks an already-provisioned device when Claim fails</w:t>
+            </w:r>
+          </w:p>
+        </w:tc>
+        <w:tc>
+          <w:tcPr/>
+          <w:p>
+            <w:pPr>
+              <w:pStyle w:val="Compact"/>
+            </w:pPr>
+          </w:p>
+        </w:tc>
+      </w:tr>
+      <w:tr>
+        <w:tc>
+          <w:tcPr/>
+          <w:p>
+            <w:pPr>
+              <w:pStyle w:val="Compact"/>
+            </w:pPr>
+            <w:r>
+              <w:t xml:space="preserve">HXC-1922</w:t>
+            </w:r>
+          </w:p>
+        </w:tc>
+        <w:tc>
+          <w:tcPr/>
+          <w:p>
+            <w:pPr>
+              <w:pStyle w:val="Compact"/>
+            </w:pPr>
+            <w:r>
+              <w:t xml:space="preserve">Task</w:t>
+            </w:r>
+          </w:p>
+        </w:tc>
+        <w:tc>
+          <w:tcPr/>
+          <w:p>
+            <w:pPr>
+              <w:pStyle w:val="Compact"/>
+            </w:pPr>
+            <w:r>
+              <w:t xml:space="preserve">P2</w:t>
+            </w:r>
+          </w:p>
+        </w:tc>
+        <w:tc>
+          <w:tcPr/>
+          <w:p>
+            <w:pPr>
+              <w:pStyle w:val="Compact"/>
+            </w:pPr>
+            <w:r>
+              <w:t xml:space="preserve">Adversarial coverage: testing/instance lifecycle FSM (no bug; mutation-proven)</w:t>
             </w:r>
           </w:p>
         </w:tc>

</xml_diff>

<commit_message>
docs: docs_chain export sync for HXC-1923 (CLAUDE-3)
Co-Authored-By: Claude Opus 4.8 (1M context) <noreply@anthropic.com>
</commit_message>
<xml_diff>
--- a/docs/export/fixed.docx
+++ b/docs/export/fixed.docx
@@ -34,7 +34,7 @@
         <w:t xml:space="preserve"> </w:t>
       </w:r>
       <w:r>
-        <w:t xml:space="preserve">225</w:t>
+        <w:t xml:space="preserve">226</w:t>
       </w:r>
       <w:r>
         <w:t xml:space="preserve"> </w:t>
@@ -50,7 +50,7 @@
         <w:t xml:space="preserve"> </w:t>
       </w:r>
       <w:r>
-        <w:t xml:space="preserve">2026-06-16T21:19:29Z</w:t>
+        <w:t xml:space="preserve">2026-06-16T21:30:28Z</w:t>
       </w:r>
       <w:r>
         <w:t xml:space="preserve"> </w:t>
@@ -116,7 +116,7 @@
           <w:b/>
           <w:bCs/>
         </w:rPr>
-        <w:t xml:space="preserve">816</w:t>
+        <w:t xml:space="preserve">817</w:t>
       </w:r>
       <w:r>
         <w:t xml:space="preserve">.</w:t>
@@ -42097,6 +42097,60 @@
             </w:pPr>
             <w:r>
               <w:t xml:space="preserve">Adversarial coverage: testing/instance lifecycle FSM (no bug; mutation-proven)</w:t>
+            </w:r>
+          </w:p>
+        </w:tc>
+        <w:tc>
+          <w:tcPr/>
+          <w:p>
+            <w:pPr>
+              <w:pStyle w:val="Compact"/>
+            </w:pPr>
+          </w:p>
+        </w:tc>
+      </w:tr>
+      <w:tr>
+        <w:tc>
+          <w:tcPr/>
+          <w:p>
+            <w:pPr>
+              <w:pStyle w:val="Compact"/>
+            </w:pPr>
+            <w:r>
+              <w:t xml:space="preserve">HXC-1923</w:t>
+            </w:r>
+          </w:p>
+        </w:tc>
+        <w:tc>
+          <w:tcPr/>
+          <w:p>
+            <w:pPr>
+              <w:pStyle w:val="Compact"/>
+            </w:pPr>
+            <w:r>
+              <w:t xml:space="preserve">Task</w:t>
+            </w:r>
+          </w:p>
+        </w:tc>
+        <w:tc>
+          <w:tcPr/>
+          <w:p>
+            <w:pPr>
+              <w:pStyle w:val="Compact"/>
+            </w:pPr>
+            <w:r>
+              <w:t xml:space="preserve">P2</w:t>
+            </w:r>
+          </w:p>
+        </w:tc>
+        <w:tc>
+          <w:tcPr/>
+          <w:p>
+            <w:pPr>
+              <w:pStyle w:val="Compact"/>
+            </w:pPr>
+            <w:r>
+              <w:t xml:space="preserve">Adversarial coverage wave 10: cmd/{helix-security,e2ee-proxy,helix-scheduler} (no bug; thin wiring fail-closed)</w:t>
             </w:r>
           </w:p>
         </w:tc>

</xml_diff>

<commit_message>
docs: docs_chain export sync for HXC-1924/1925 (CLAUDE-3)
Co-Authored-By: Claude Opus 4.8 (1M context) <noreply@anthropic.com>
</commit_message>
<xml_diff>
--- a/docs/export/fixed.docx
+++ b/docs/export/fixed.docx
@@ -34,7 +34,7 @@
         <w:t xml:space="preserve"> </w:t>
       </w:r>
       <w:r>
-        <w:t xml:space="preserve">226</w:t>
+        <w:t xml:space="preserve">227</w:t>
       </w:r>
       <w:r>
         <w:t xml:space="preserve"> </w:t>
@@ -50,7 +50,7 @@
         <w:t xml:space="preserve"> </w:t>
       </w:r>
       <w:r>
-        <w:t xml:space="preserve">2026-06-16T21:30:28Z</w:t>
+        <w:t xml:space="preserve">2026-06-16T21:38:35Z</w:t>
       </w:r>
       <w:r>
         <w:t xml:space="preserve"> </w:t>
@@ -116,7 +116,7 @@
           <w:b/>
           <w:bCs/>
         </w:rPr>
-        <w:t xml:space="preserve">817</w:t>
+        <w:t xml:space="preserve">819</w:t>
       </w:r>
       <w:r>
         <w:t xml:space="preserve">.</w:t>
@@ -42151,6 +42151,114 @@
             </w:pPr>
             <w:r>
               <w:t xml:space="preserve">Adversarial coverage wave 10: cmd/{helix-security,e2ee-proxy,helix-scheduler} (no bug; thin wiring fail-closed)</w:t>
+            </w:r>
+          </w:p>
+        </w:tc>
+        <w:tc>
+          <w:tcPr/>
+          <w:p>
+            <w:pPr>
+              <w:pStyle w:val="Compact"/>
+            </w:pPr>
+          </w:p>
+        </w:tc>
+      </w:tr>
+      <w:tr>
+        <w:tc>
+          <w:tcPr/>
+          <w:p>
+            <w:pPr>
+              <w:pStyle w:val="Compact"/>
+            </w:pPr>
+            <w:r>
+              <w:t xml:space="preserve">HXC-1924</w:t>
+            </w:r>
+          </w:p>
+        </w:tc>
+        <w:tc>
+          <w:tcPr/>
+          <w:p>
+            <w:pPr>
+              <w:pStyle w:val="Compact"/>
+            </w:pPr>
+            <w:r>
+              <w:t xml:space="preserve">Bug</w:t>
+            </w:r>
+          </w:p>
+        </w:tc>
+        <w:tc>
+          <w:tcPr/>
+          <w:p>
+            <w:pPr>
+              <w:pStyle w:val="Compact"/>
+            </w:pPr>
+            <w:r>
+              <w:t xml:space="preserve">P1</w:t>
+            </w:r>
+          </w:p>
+        </w:tc>
+        <w:tc>
+          <w:tcPr/>
+          <w:p>
+            <w:pPr>
+              <w:pStyle w:val="Compact"/>
+            </w:pPr>
+            <w:r>
+              <w:t xml:space="preserve">Slowloris/G112 hardening: 5 HTTP servers lacked a read timeout (helix-gateway, helix-llm, helix-policy, internal/gateway x2)</w:t>
+            </w:r>
+          </w:p>
+        </w:tc>
+        <w:tc>
+          <w:tcPr/>
+          <w:p>
+            <w:pPr>
+              <w:pStyle w:val="Compact"/>
+            </w:pPr>
+          </w:p>
+        </w:tc>
+      </w:tr>
+      <w:tr>
+        <w:tc>
+          <w:tcPr/>
+          <w:p>
+            <w:pPr>
+              <w:pStyle w:val="Compact"/>
+            </w:pPr>
+            <w:r>
+              <w:t xml:space="preserve">HXC-1925</w:t>
+            </w:r>
+          </w:p>
+        </w:tc>
+        <w:tc>
+          <w:tcPr/>
+          <w:p>
+            <w:pPr>
+              <w:pStyle w:val="Compact"/>
+            </w:pPr>
+            <w:r>
+              <w:t xml:space="preserve">Task</w:t>
+            </w:r>
+          </w:p>
+        </w:tc>
+        <w:tc>
+          <w:tcPr/>
+          <w:p>
+            <w:pPr>
+              <w:pStyle w:val="Compact"/>
+            </w:pPr>
+            <w:r>
+              <w:t xml:space="preserve">P2</w:t>
+            </w:r>
+          </w:p>
+        </w:tc>
+        <w:tc>
+          <w:tcPr/>
+          <w:p>
+            <w:pPr>
+              <w:pStyle w:val="Compact"/>
+            </w:pPr>
+            <w:r>
+              <w:t xml:space="preserve">Adversarial coverage wave 11: cmd/{gpu-pool-manager,helix-node} (no bug; selection + validation correct)</w:t>
             </w:r>
           </w:p>
         </w:tc>

</xml_diff>

<commit_message>
docs: docs_chain export sync for HXC-1926/1927 (CLAUDE-3)
Co-Authored-By: Claude Opus 4.8 (1M context) <noreply@anthropic.com>
</commit_message>
<xml_diff>
--- a/docs/export/fixed.docx
+++ b/docs/export/fixed.docx
@@ -34,7 +34,7 @@
         <w:t xml:space="preserve"> </w:t>
       </w:r>
       <w:r>
-        <w:t xml:space="preserve">227</w:t>
+        <w:t xml:space="preserve">228</w:t>
       </w:r>
       <w:r>
         <w:t xml:space="preserve"> </w:t>
@@ -50,7 +50,7 @@
         <w:t xml:space="preserve"> </w:t>
       </w:r>
       <w:r>
-        <w:t xml:space="preserve">2026-06-16T21:38:35Z</w:t>
+        <w:t xml:space="preserve">2026-06-16T21:48:08Z</w:t>
       </w:r>
       <w:r>
         <w:t xml:space="preserve"> </w:t>
@@ -116,7 +116,7 @@
           <w:b/>
           <w:bCs/>
         </w:rPr>
-        <w:t xml:space="preserve">819</w:t>
+        <w:t xml:space="preserve">821</w:t>
       </w:r>
       <w:r>
         <w:t xml:space="preserve">.</w:t>
@@ -42259,6 +42259,126 @@
             </w:pPr>
             <w:r>
               <w:t xml:space="preserve">Adversarial coverage wave 11: cmd/{gpu-pool-manager,helix-node} (no bug; selection + validation correct)</w:t>
+            </w:r>
+          </w:p>
+        </w:tc>
+        <w:tc>
+          <w:tcPr/>
+          <w:p>
+            <w:pPr>
+              <w:pStyle w:val="Compact"/>
+            </w:pPr>
+          </w:p>
+        </w:tc>
+      </w:tr>
+      <w:tr>
+        <w:tc>
+          <w:tcPr/>
+          <w:p>
+            <w:pPr>
+              <w:pStyle w:val="Compact"/>
+            </w:pPr>
+            <w:r>
+              <w:t xml:space="preserve">HXC-1926</w:t>
+            </w:r>
+          </w:p>
+        </w:tc>
+        <w:tc>
+          <w:tcPr/>
+          <w:p>
+            <w:pPr>
+              <w:pStyle w:val="Compact"/>
+            </w:pPr>
+            <w:r>
+              <w:t xml:space="preserve">Bug</w:t>
+            </w:r>
+          </w:p>
+        </w:tc>
+        <w:tc>
+          <w:tcPr/>
+          <w:p>
+            <w:pPr>
+              <w:pStyle w:val="Compact"/>
+            </w:pPr>
+            <w:r>
+              <w:t xml:space="preserve">P2</w:t>
+            </w:r>
+          </w:p>
+        </w:tc>
+        <w:tc>
+          <w:tcPr/>
+          <w:p>
+            <w:pPr>
+              <w:pStyle w:val="Compact"/>
+            </w:pPr>
+            <w:r>
+              <w:t xml:space="preserve">helixctl: unknown</w:t>
+            </w:r>
+            <w:r>
+              <w:t xml:space="preserve"> </w:t>
+            </w:r>
+            <w:r>
+              <w:t xml:space="preserve">‘build’</w:t>
+            </w:r>
+            <w:r>
+              <w:t xml:space="preserve"> </w:t>
+            </w:r>
+            <w:r>
+              <w:t xml:space="preserve">subcommand silently prints help and exits 0 (silent-failure footgun)</w:t>
+            </w:r>
+          </w:p>
+        </w:tc>
+        <w:tc>
+          <w:tcPr/>
+          <w:p>
+            <w:pPr>
+              <w:pStyle w:val="Compact"/>
+            </w:pPr>
+          </w:p>
+        </w:tc>
+      </w:tr>
+      <w:tr>
+        <w:tc>
+          <w:tcPr/>
+          <w:p>
+            <w:pPr>
+              <w:pStyle w:val="Compact"/>
+            </w:pPr>
+            <w:r>
+              <w:t xml:space="preserve">HXC-1927</w:t>
+            </w:r>
+          </w:p>
+        </w:tc>
+        <w:tc>
+          <w:tcPr/>
+          <w:p>
+            <w:pPr>
+              <w:pStyle w:val="Compact"/>
+            </w:pPr>
+            <w:r>
+              <w:t xml:space="preserve">Task</w:t>
+            </w:r>
+          </w:p>
+        </w:tc>
+        <w:tc>
+          <w:tcPr/>
+          <w:p>
+            <w:pPr>
+              <w:pStyle w:val="Compact"/>
+            </w:pPr>
+            <w:r>
+              <w:t xml:space="preserve">P2</w:t>
+            </w:r>
+          </w:p>
+        </w:tc>
+        <w:tc>
+          <w:tcPr/>
+          <w:p>
+            <w:pPr>
+              <w:pStyle w:val="Compact"/>
+            </w:pPr>
+            <w:r>
+              <w:t xml:space="preserve">Adversarial coverage wave 12: cmd/{helix-build,helix-snapshot} (no bug; thin wiring fail-closed)</w:t>
             </w:r>
           </w:p>
         </w:tc>

</xml_diff>

<commit_message>
docs: docs_chain export sync for HXC-1928/1929/1930 (CLAUDE-3)
Co-Authored-By: Claude Opus 4.8 (1M context) <noreply@anthropic.com>
</commit_message>
<xml_diff>
--- a/docs/export/fixed.docx
+++ b/docs/export/fixed.docx
@@ -34,7 +34,7 @@
         <w:t xml:space="preserve"> </w:t>
       </w:r>
       <w:r>
-        <w:t xml:space="preserve">228</w:t>
+        <w:t xml:space="preserve">229</w:t>
       </w:r>
       <w:r>
         <w:t xml:space="preserve"> </w:t>
@@ -50,7 +50,7 @@
         <w:t xml:space="preserve"> </w:t>
       </w:r>
       <w:r>
-        <w:t xml:space="preserve">2026-06-16T21:48:08Z</w:t>
+        <w:t xml:space="preserve">2026-06-16T21:54:51Z</w:t>
       </w:r>
       <w:r>
         <w:t xml:space="preserve"> </w:t>
@@ -116,7 +116,7 @@
           <w:b/>
           <w:bCs/>
         </w:rPr>
-        <w:t xml:space="preserve">821</w:t>
+        <w:t xml:space="preserve">824</w:t>
       </w:r>
       <w:r>
         <w:t xml:space="preserve">.</w:t>
@@ -42379,6 +42379,168 @@
             </w:pPr>
             <w:r>
               <w:t xml:space="preserve">Adversarial coverage wave 12: cmd/{helix-build,helix-snapshot} (no bug; thin wiring fail-closed)</w:t>
+            </w:r>
+          </w:p>
+        </w:tc>
+        <w:tc>
+          <w:tcPr/>
+          <w:p>
+            <w:pPr>
+              <w:pStyle w:val="Compact"/>
+            </w:pPr>
+          </w:p>
+        </w:tc>
+      </w:tr>
+      <w:tr>
+        <w:tc>
+          <w:tcPr/>
+          <w:p>
+            <w:pPr>
+              <w:pStyle w:val="Compact"/>
+            </w:pPr>
+            <w:r>
+              <w:t xml:space="preserve">HXC-1928</w:t>
+            </w:r>
+          </w:p>
+        </w:tc>
+        <w:tc>
+          <w:tcPr/>
+          <w:p>
+            <w:pPr>
+              <w:pStyle w:val="Compact"/>
+            </w:pPr>
+            <w:r>
+              <w:t xml:space="preserve">Bug</w:t>
+            </w:r>
+          </w:p>
+        </w:tc>
+        <w:tc>
+          <w:tcPr/>
+          <w:p>
+            <w:pPr>
+              <w:pStyle w:val="Compact"/>
+            </w:pPr>
+            <w:r>
+              <w:t xml:space="preserve">P1</w:t>
+            </w:r>
+          </w:p>
+        </w:tc>
+        <w:tc>
+          <w:tcPr/>
+          <w:p>
+            <w:pPr>
+              <w:pStyle w:val="Compact"/>
+            </w:pPr>
+            <w:r>
+              <w:t xml:space="preserve">cmd/burst-controller: NaN/Inf utilization sample bypasses burst-control guards (class-d numeric)</w:t>
+            </w:r>
+          </w:p>
+        </w:tc>
+        <w:tc>
+          <w:tcPr/>
+          <w:p>
+            <w:pPr>
+              <w:pStyle w:val="Compact"/>
+            </w:pPr>
+          </w:p>
+        </w:tc>
+      </w:tr>
+      <w:tr>
+        <w:tc>
+          <w:tcPr/>
+          <w:p>
+            <w:pPr>
+              <w:pStyle w:val="Compact"/>
+            </w:pPr>
+            <w:r>
+              <w:t xml:space="preserve">HXC-1929</w:t>
+            </w:r>
+          </w:p>
+        </w:tc>
+        <w:tc>
+          <w:tcPr/>
+          <w:p>
+            <w:pPr>
+              <w:pStyle w:val="Compact"/>
+            </w:pPr>
+            <w:r>
+              <w:t xml:space="preserve">Bug</w:t>
+            </w:r>
+          </w:p>
+        </w:tc>
+        <w:tc>
+          <w:tcPr/>
+          <w:p>
+            <w:pPr>
+              <w:pStyle w:val="Compact"/>
+            </w:pPr>
+            <w:r>
+              <w:t xml:space="preserve">P0</w:t>
+            </w:r>
+          </w:p>
+        </w:tc>
+        <w:tc>
+          <w:tcPr/>
+          <w:p>
+            <w:pPr>
+              <w:pStyle w:val="Compact"/>
+            </w:pPr>
+            <w:r>
+              <w:t xml:space="preserve">cmd/helix-gate: covgate anti-bluff audit FAILS OPEN on empty package path (PASS-bluff in the anti-bluff gate)</w:t>
+            </w:r>
+          </w:p>
+        </w:tc>
+        <w:tc>
+          <w:tcPr/>
+          <w:p>
+            <w:pPr>
+              <w:pStyle w:val="Compact"/>
+            </w:pPr>
+          </w:p>
+        </w:tc>
+      </w:tr>
+      <w:tr>
+        <w:tc>
+          <w:tcPr/>
+          <w:p>
+            <w:pPr>
+              <w:pStyle w:val="Compact"/>
+            </w:pPr>
+            <w:r>
+              <w:t xml:space="preserve">HXC-1930</w:t>
+            </w:r>
+          </w:p>
+        </w:tc>
+        <w:tc>
+          <w:tcPr/>
+          <w:p>
+            <w:pPr>
+              <w:pStyle w:val="Compact"/>
+            </w:pPr>
+            <w:r>
+              <w:t xml:space="preserve">Task</w:t>
+            </w:r>
+          </w:p>
+        </w:tc>
+        <w:tc>
+          <w:tcPr/>
+          <w:p>
+            <w:pPr>
+              <w:pStyle w:val="Compact"/>
+            </w:pPr>
+            <w:r>
+              <w:t xml:space="preserve">P2</w:t>
+            </w:r>
+          </w:p>
+        </w:tc>
+        <w:tc>
+          <w:tcPr/>
+          <w:p>
+            <w:pPr>
+              <w:pStyle w:val="Compact"/>
+            </w:pPr>
+            <w:r>
+              <w:t xml:space="preserve">Adversarial coverage wave 13: cmd/helix-advisory (no bug; thin gRPC wiring)</w:t>
             </w:r>
           </w:p>
         </w:tc>

</xml_diff>

<commit_message>
docs: docs_chain export sync for HXC-1931/1932 (CLAUDE-3)
Co-Authored-By: Claude Opus 4.8 (1M context) <noreply@anthropic.com>
</commit_message>
<xml_diff>
--- a/docs/export/fixed.docx
+++ b/docs/export/fixed.docx
@@ -34,7 +34,7 @@
         <w:t xml:space="preserve"> </w:t>
       </w:r>
       <w:r>
-        <w:t xml:space="preserve">229</w:t>
+        <w:t xml:space="preserve">230</w:t>
       </w:r>
       <w:r>
         <w:t xml:space="preserve"> </w:t>
@@ -50,7 +50,7 @@
         <w:t xml:space="preserve"> </w:t>
       </w:r>
       <w:r>
-        <w:t xml:space="preserve">2026-06-16T21:54:51Z</w:t>
+        <w:t xml:space="preserve">2026-06-16T21:59:50Z</w:t>
       </w:r>
       <w:r>
         <w:t xml:space="preserve"> </w:t>
@@ -116,7 +116,7 @@
           <w:b/>
           <w:bCs/>
         </w:rPr>
-        <w:t xml:space="preserve">824</w:t>
+        <w:t xml:space="preserve">826</w:t>
       </w:r>
       <w:r>
         <w:t xml:space="preserve">.</w:t>
@@ -42541,6 +42541,126 @@
             </w:pPr>
             <w:r>
               <w:t xml:space="preserve">Adversarial coverage wave 13: cmd/helix-advisory (no bug; thin gRPC wiring)</w:t>
+            </w:r>
+          </w:p>
+        </w:tc>
+        <w:tc>
+          <w:tcPr/>
+          <w:p>
+            <w:pPr>
+              <w:pStyle w:val="Compact"/>
+            </w:pPr>
+          </w:p>
+        </w:tc>
+      </w:tr>
+      <w:tr>
+        <w:tc>
+          <w:tcPr/>
+          <w:p>
+            <w:pPr>
+              <w:pStyle w:val="Compact"/>
+            </w:pPr>
+            <w:r>
+              <w:t xml:space="preserve">HXC-1931</w:t>
+            </w:r>
+          </w:p>
+        </w:tc>
+        <w:tc>
+          <w:tcPr/>
+          <w:p>
+            <w:pPr>
+              <w:pStyle w:val="Compact"/>
+            </w:pPr>
+            <w:r>
+              <w:t xml:space="preserve">Bug</w:t>
+            </w:r>
+          </w:p>
+        </w:tc>
+        <w:tc>
+          <w:tcPr/>
+          <w:p>
+            <w:pPr>
+              <w:pStyle w:val="Compact"/>
+            </w:pPr>
+            <w:r>
+              <w:t xml:space="preserve">P0</w:t>
+            </w:r>
+          </w:p>
+        </w:tc>
+        <w:tc>
+          <w:tcPr/>
+          <w:p>
+            <w:pPr>
+              <w:pStyle w:val="Compact"/>
+            </w:pPr>
+            <w:r>
+              <w:t xml:space="preserve">cmd/dst-sim: Gate with seeds&lt;=0 vacuously reports</w:t>
+            </w:r>
+            <w:r>
+              <w:t xml:space="preserve"> </w:t>
+            </w:r>
+            <w:r>
+              <w:t xml:space="preserve">‘OK: all seeds linearizable’</w:t>
+            </w:r>
+            <w:r>
+              <w:t xml:space="preserve"> </w:t>
+            </w:r>
+            <w:r>
+              <w:t xml:space="preserve">exit 0 (CI gate PASS-bluff)</w:t>
+            </w:r>
+          </w:p>
+        </w:tc>
+        <w:tc>
+          <w:tcPr/>
+          <w:p>
+            <w:pPr>
+              <w:pStyle w:val="Compact"/>
+            </w:pPr>
+          </w:p>
+        </w:tc>
+      </w:tr>
+      <w:tr>
+        <w:tc>
+          <w:tcPr/>
+          <w:p>
+            <w:pPr>
+              <w:pStyle w:val="Compact"/>
+            </w:pPr>
+            <w:r>
+              <w:t xml:space="preserve">HXC-1932</w:t>
+            </w:r>
+          </w:p>
+        </w:tc>
+        <w:tc>
+          <w:tcPr/>
+          <w:p>
+            <w:pPr>
+              <w:pStyle w:val="Compact"/>
+            </w:pPr>
+            <w:r>
+              <w:t xml:space="preserve">Task</w:t>
+            </w:r>
+          </w:p>
+        </w:tc>
+        <w:tc>
+          <w:tcPr/>
+          <w:p>
+            <w:pPr>
+              <w:pStyle w:val="Compact"/>
+            </w:pPr>
+            <w:r>
+              <w:t xml:space="preserve">P2</w:t>
+            </w:r>
+          </w:p>
+        </w:tc>
+        <w:tc>
+          <w:tcPr/>
+          <w:p>
+            <w:pPr>
+              <w:pStyle w:val="Compact"/>
+            </w:pPr>
+            <w:r>
+              <w:t xml:space="preserve">Adversarial coverage: cmd/raftkv-demo KV (no bug; sink-side fidelity + determinism pinned)</w:t>
             </w:r>
           </w:p>
         </w:tc>

</xml_diff>

<commit_message>
docs: docs_chain export sync for HXC-1933/1934/1935 (CLAUDE-3)
Co-Authored-By: Claude Opus 4.8 (1M context) <noreply@anthropic.com>
</commit_message>
<xml_diff>
--- a/docs/export/fixed.docx
+++ b/docs/export/fixed.docx
@@ -34,7 +34,7 @@
         <w:t xml:space="preserve"> </w:t>
       </w:r>
       <w:r>
-        <w:t xml:space="preserve">230</w:t>
+        <w:t xml:space="preserve">231</w:t>
       </w:r>
       <w:r>
         <w:t xml:space="preserve"> </w:t>
@@ -50,7 +50,7 @@
         <w:t xml:space="preserve"> </w:t>
       </w:r>
       <w:r>
-        <w:t xml:space="preserve">2026-06-16T21:59:50Z</w:t>
+        <w:t xml:space="preserve">2026-06-16T22:11:21Z</w:t>
       </w:r>
       <w:r>
         <w:t xml:space="preserve"> </w:t>
@@ -116,7 +116,7 @@
           <w:b/>
           <w:bCs/>
         </w:rPr>
-        <w:t xml:space="preserve">826</w:t>
+        <w:t xml:space="preserve">829</w:t>
       </w:r>
       <w:r>
         <w:t xml:space="preserve">.</w:t>
@@ -42661,6 +42661,168 @@
             </w:pPr>
             <w:r>
               <w:t xml:space="preserve">Adversarial coverage: cmd/raftkv-demo KV (no bug; sink-side fidelity + determinism pinned)</w:t>
+            </w:r>
+          </w:p>
+        </w:tc>
+        <w:tc>
+          <w:tcPr/>
+          <w:p>
+            <w:pPr>
+              <w:pStyle w:val="Compact"/>
+            </w:pPr>
+          </w:p>
+        </w:tc>
+      </w:tr>
+      <w:tr>
+        <w:tc>
+          <w:tcPr/>
+          <w:p>
+            <w:pPr>
+              <w:pStyle w:val="Compact"/>
+            </w:pPr>
+            <w:r>
+              <w:t xml:space="preserve">HXC-1933</w:t>
+            </w:r>
+          </w:p>
+        </w:tc>
+        <w:tc>
+          <w:tcPr/>
+          <w:p>
+            <w:pPr>
+              <w:pStyle w:val="Compact"/>
+            </w:pPr>
+            <w:r>
+              <w:t xml:space="preserve">Bug</w:t>
+            </w:r>
+          </w:p>
+        </w:tc>
+        <w:tc>
+          <w:tcPr/>
+          <w:p>
+            <w:pPr>
+              <w:pStyle w:val="Compact"/>
+            </w:pPr>
+            <w:r>
+              <w:t xml:space="preserve">P0</w:t>
+            </w:r>
+          </w:p>
+        </w:tc>
+        <w:tc>
+          <w:tcPr/>
+          <w:p>
+            <w:pPr>
+              <w:pStyle w:val="Compact"/>
+            </w:pPr>
+            <w:r>
+              <w:t xml:space="preserve">internal/scheduler: PreemptJob drops the lock before resource-restore -&gt; double-placement / capacity over-commit (race)</w:t>
+            </w:r>
+          </w:p>
+        </w:tc>
+        <w:tc>
+          <w:tcPr/>
+          <w:p>
+            <w:pPr>
+              <w:pStyle w:val="Compact"/>
+            </w:pPr>
+          </w:p>
+        </w:tc>
+      </w:tr>
+      <w:tr>
+        <w:tc>
+          <w:tcPr/>
+          <w:p>
+            <w:pPr>
+              <w:pStyle w:val="Compact"/>
+            </w:pPr>
+            <w:r>
+              <w:t xml:space="preserve">HXC-1934</w:t>
+            </w:r>
+          </w:p>
+        </w:tc>
+        <w:tc>
+          <w:tcPr/>
+          <w:p>
+            <w:pPr>
+              <w:pStyle w:val="Compact"/>
+            </w:pPr>
+            <w:r>
+              <w:t xml:space="preserve">Bug</w:t>
+            </w:r>
+          </w:p>
+        </w:tc>
+        <w:tc>
+          <w:tcPr/>
+          <w:p>
+            <w:pPr>
+              <w:pStyle w:val="Compact"/>
+            </w:pPr>
+            <w:r>
+              <w:t xml:space="preserve">P1</w:t>
+            </w:r>
+          </w:p>
+        </w:tc>
+        <w:tc>
+          <w:tcPr/>
+          <w:p>
+            <w:pPr>
+              <w:pStyle w:val="Compact"/>
+            </w:pPr>
+            <w:r>
+              <w:t xml:space="preserve">pkg/raft: Command.Encode (json.Marshal) silently corrupts invalid-UTF-8 values to U+FFFD on every replica</w:t>
+            </w:r>
+          </w:p>
+        </w:tc>
+        <w:tc>
+          <w:tcPr/>
+          <w:p>
+            <w:pPr>
+              <w:pStyle w:val="Compact"/>
+            </w:pPr>
+          </w:p>
+        </w:tc>
+      </w:tr>
+      <w:tr>
+        <w:tc>
+          <w:tcPr/>
+          <w:p>
+            <w:pPr>
+              <w:pStyle w:val="Compact"/>
+            </w:pPr>
+            <w:r>
+              <w:t xml:space="preserve">HXC-1935</w:t>
+            </w:r>
+          </w:p>
+        </w:tc>
+        <w:tc>
+          <w:tcPr/>
+          <w:p>
+            <w:pPr>
+              <w:pStyle w:val="Compact"/>
+            </w:pPr>
+            <w:r>
+              <w:t xml:space="preserve">Bug</w:t>
+            </w:r>
+          </w:p>
+        </w:tc>
+        <w:tc>
+          <w:tcPr/>
+          <w:p>
+            <w:pPr>
+              <w:pStyle w:val="Compact"/>
+            </w:pPr>
+            <w:r>
+              <w:t xml:space="preserve">P0</w:t>
+            </w:r>
+          </w:p>
+        </w:tc>
+        <w:tc>
+          <w:tcPr/>
+          <w:p>
+            <w:pPr>
+              <w:pStyle w:val="Compact"/>
+            </w:pPr>
+            <w:r>
+              <w:t xml:space="preserve">internal/security: EnforcePolicy authz FAIL-OPEN — grants the empty operation (action==’’ &amp;&amp; resource==’’) at the live gRPC sink</w:t>
             </w:r>
           </w:p>
         </w:tc>

</xml_diff>

<commit_message>
docs: docs_chain export sync for HXC-1936/1937/1938 (CLAUDE-3)
Co-Authored-By: Claude Opus 4.8 (1M context) <noreply@anthropic.com>
</commit_message>
<xml_diff>
--- a/docs/export/fixed.docx
+++ b/docs/export/fixed.docx
@@ -34,7 +34,7 @@
         <w:t xml:space="preserve"> </w:t>
       </w:r>
       <w:r>
-        <w:t xml:space="preserve">231</w:t>
+        <w:t xml:space="preserve">232</w:t>
       </w:r>
       <w:r>
         <w:t xml:space="preserve"> </w:t>
@@ -50,7 +50,7 @@
         <w:t xml:space="preserve"> </w:t>
       </w:r>
       <w:r>
-        <w:t xml:space="preserve">2026-06-16T22:11:21Z</w:t>
+        <w:t xml:space="preserve">2026-06-16T22:18:47Z</w:t>
       </w:r>
       <w:r>
         <w:t xml:space="preserve"> </w:t>
@@ -116,7 +116,7 @@
           <w:b/>
           <w:bCs/>
         </w:rPr>
-        <w:t xml:space="preserve">829</w:t>
+        <w:t xml:space="preserve">832</w:t>
       </w:r>
       <w:r>
         <w:t xml:space="preserve">.</w:t>
@@ -42823,6 +42823,168 @@
             </w:pPr>
             <w:r>
               <w:t xml:space="preserve">internal/security: EnforcePolicy authz FAIL-OPEN — grants the empty operation (action==’’ &amp;&amp; resource==’’) at the live gRPC sink</w:t>
+            </w:r>
+          </w:p>
+        </w:tc>
+        <w:tc>
+          <w:tcPr/>
+          <w:p>
+            <w:pPr>
+              <w:pStyle w:val="Compact"/>
+            </w:pPr>
+          </w:p>
+        </w:tc>
+      </w:tr>
+      <w:tr>
+        <w:tc>
+          <w:tcPr/>
+          <w:p>
+            <w:pPr>
+              <w:pStyle w:val="Compact"/>
+            </w:pPr>
+            <w:r>
+              <w:t xml:space="preserve">HXC-1936</w:t>
+            </w:r>
+          </w:p>
+        </w:tc>
+        <w:tc>
+          <w:tcPr/>
+          <w:p>
+            <w:pPr>
+              <w:pStyle w:val="Compact"/>
+            </w:pPr>
+            <w:r>
+              <w:t xml:space="preserve">Bug</w:t>
+            </w:r>
+          </w:p>
+        </w:tc>
+        <w:tc>
+          <w:tcPr/>
+          <w:p>
+            <w:pPr>
+              <w:pStyle w:val="Compact"/>
+            </w:pPr>
+            <w:r>
+              <w:t xml:space="preserve">P1</w:t>
+            </w:r>
+          </w:p>
+        </w:tc>
+        <w:tc>
+          <w:tcPr/>
+          <w:p>
+            <w:pPr>
+              <w:pStyle w:val="Compact"/>
+            </w:pPr>
+            <w:r>
+              <w:t xml:space="preserve">pkg/scheduler: runBindLocked leaks node capacity on a partial multi-plugin Bind failure (no rollback)</w:t>
+            </w:r>
+          </w:p>
+        </w:tc>
+        <w:tc>
+          <w:tcPr/>
+          <w:p>
+            <w:pPr>
+              <w:pStyle w:val="Compact"/>
+            </w:pPr>
+          </w:p>
+        </w:tc>
+      </w:tr>
+      <w:tr>
+        <w:tc>
+          <w:tcPr/>
+          <w:p>
+            <w:pPr>
+              <w:pStyle w:val="Compact"/>
+            </w:pPr>
+            <w:r>
+              <w:t xml:space="preserve">HXC-1937</w:t>
+            </w:r>
+          </w:p>
+        </w:tc>
+        <w:tc>
+          <w:tcPr/>
+          <w:p>
+            <w:pPr>
+              <w:pStyle w:val="Compact"/>
+            </w:pPr>
+            <w:r>
+              <w:t xml:space="preserve">Bug</w:t>
+            </w:r>
+          </w:p>
+        </w:tc>
+        <w:tc>
+          <w:tcPr/>
+          <w:p>
+            <w:pPr>
+              <w:pStyle w:val="Compact"/>
+            </w:pPr>
+            <w:r>
+              <w:t xml:space="preserve">P1</w:t>
+            </w:r>
+          </w:p>
+        </w:tc>
+        <w:tc>
+          <w:tcPr/>
+          <w:p>
+            <w:pPr>
+              <w:pStyle w:val="Compact"/>
+            </w:pPr>
+            <w:r>
+              <w:t xml:space="preserve">pkg/swim: handleAlive refutes the failure detector unconditionally -&gt; a replayed stale Alive defeats death detection</w:t>
+            </w:r>
+          </w:p>
+        </w:tc>
+        <w:tc>
+          <w:tcPr/>
+          <w:p>
+            <w:pPr>
+              <w:pStyle w:val="Compact"/>
+            </w:pPr>
+          </w:p>
+        </w:tc>
+      </w:tr>
+      <w:tr>
+        <w:tc>
+          <w:tcPr/>
+          <w:p>
+            <w:pPr>
+              <w:pStyle w:val="Compact"/>
+            </w:pPr>
+            <w:r>
+              <w:t xml:space="preserve">HXC-1938</w:t>
+            </w:r>
+          </w:p>
+        </w:tc>
+        <w:tc>
+          <w:tcPr/>
+          <w:p>
+            <w:pPr>
+              <w:pStyle w:val="Compact"/>
+            </w:pPr>
+            <w:r>
+              <w:t xml:space="preserve">Task</w:t>
+            </w:r>
+          </w:p>
+        </w:tc>
+        <w:tc>
+          <w:tcPr/>
+          <w:p>
+            <w:pPr>
+              <w:pStyle w:val="Compact"/>
+            </w:pPr>
+            <w:r>
+              <w:t xml:space="preserve">P2</w:t>
+            </w:r>
+          </w:p>
+        </w:tc>
+        <w:tc>
+          <w:tcPr/>
+          <w:p>
+            <w:pPr>
+              <w:pStyle w:val="Compact"/>
+            </w:pPr>
+            <w:r>
+              <w:t xml:space="preserve">Deep re-audit: pkg/raftleader (no bug; 7 adapter-layer contract pins mutation-proven)</w:t>
             </w:r>
           </w:p>
         </w:tc>

</xml_diff>

<commit_message>
docs: docs_chain export sync for HXC-1939/1940/1941 (CLAUDE-3)
Co-Authored-By: Claude Opus 4.8 (1M context) <noreply@anthropic.com>
</commit_message>
<xml_diff>
--- a/docs/export/fixed.docx
+++ b/docs/export/fixed.docx
@@ -34,7 +34,7 @@
         <w:t xml:space="preserve"> </w:t>
       </w:r>
       <w:r>
-        <w:t xml:space="preserve">232</w:t>
+        <w:t xml:space="preserve">233</w:t>
       </w:r>
       <w:r>
         <w:t xml:space="preserve"> </w:t>
@@ -50,7 +50,7 @@
         <w:t xml:space="preserve"> </w:t>
       </w:r>
       <w:r>
-        <w:t xml:space="preserve">2026-06-16T22:18:47Z</w:t>
+        <w:t xml:space="preserve">2026-06-16T22:26:36Z</w:t>
       </w:r>
       <w:r>
         <w:t xml:space="preserve"> </w:t>
@@ -116,7 +116,7 @@
           <w:b/>
           <w:bCs/>
         </w:rPr>
-        <w:t xml:space="preserve">832</w:t>
+        <w:t xml:space="preserve">835</w:t>
       </w:r>
       <w:r>
         <w:t xml:space="preserve">.</w:t>
@@ -42985,6 +42985,168 @@
             </w:pPr>
             <w:r>
               <w:t xml:space="preserve">Deep re-audit: pkg/raftleader (no bug; 7 adapter-layer contract pins mutation-proven)</w:t>
+            </w:r>
+          </w:p>
+        </w:tc>
+        <w:tc>
+          <w:tcPr/>
+          <w:p>
+            <w:pPr>
+              <w:pStyle w:val="Compact"/>
+            </w:pPr>
+          </w:p>
+        </w:tc>
+      </w:tr>
+      <w:tr>
+        <w:tc>
+          <w:tcPr/>
+          <w:p>
+            <w:pPr>
+              <w:pStyle w:val="Compact"/>
+            </w:pPr>
+            <w:r>
+              <w:t xml:space="preserve">HXC-1939</w:t>
+            </w:r>
+          </w:p>
+        </w:tc>
+        <w:tc>
+          <w:tcPr/>
+          <w:p>
+            <w:pPr>
+              <w:pStyle w:val="Compact"/>
+            </w:pPr>
+            <w:r>
+              <w:t xml:space="preserve">Bug</w:t>
+            </w:r>
+          </w:p>
+        </w:tc>
+        <w:tc>
+          <w:tcPr/>
+          <w:p>
+            <w:pPr>
+              <w:pStyle w:val="Compact"/>
+            </w:pPr>
+            <w:r>
+              <w:t xml:space="preserve">P1</w:t>
+            </w:r>
+          </w:p>
+        </w:tc>
+        <w:tc>
+          <w:tcPr/>
+          <w:p>
+            <w:pPr>
+              <w:pStyle w:val="Compact"/>
+            </w:pPr>
+            <w:r>
+              <w:t xml:space="preserve">internal/gpu: health Monitor flipping a held GPU to Unhealthy causes double-allocation + permanent leak</w:t>
+            </w:r>
+          </w:p>
+        </w:tc>
+        <w:tc>
+          <w:tcPr/>
+          <w:p>
+            <w:pPr>
+              <w:pStyle w:val="Compact"/>
+            </w:pPr>
+          </w:p>
+        </w:tc>
+      </w:tr>
+      <w:tr>
+        <w:tc>
+          <w:tcPr/>
+          <w:p>
+            <w:pPr>
+              <w:pStyle w:val="Compact"/>
+            </w:pPr>
+            <w:r>
+              <w:t xml:space="preserve">HXC-1940</w:t>
+            </w:r>
+          </w:p>
+        </w:tc>
+        <w:tc>
+          <w:tcPr/>
+          <w:p>
+            <w:pPr>
+              <w:pStyle w:val="Compact"/>
+            </w:pPr>
+            <w:r>
+              <w:t xml:space="preserve">Bug</w:t>
+            </w:r>
+          </w:p>
+        </w:tc>
+        <w:tc>
+          <w:tcPr/>
+          <w:p>
+            <w:pPr>
+              <w:pStyle w:val="Compact"/>
+            </w:pPr>
+            <w:r>
+              <w:t xml:space="preserve">P0</w:t>
+            </w:r>
+          </w:p>
+        </w:tc>
+        <w:tc>
+          <w:tcPr/>
+          <w:p>
+            <w:pPr>
+              <w:pStyle w:val="Compact"/>
+            </w:pPr>
+            <w:r>
+              <w:t xml:space="preserve">pkg/storage: FileStore key path traversal — Put/Get/Delete escape the store root (arbitrary file write/read/delete)</w:t>
+            </w:r>
+          </w:p>
+        </w:tc>
+        <w:tc>
+          <w:tcPr/>
+          <w:p>
+            <w:pPr>
+              <w:pStyle w:val="Compact"/>
+            </w:pPr>
+          </w:p>
+        </w:tc>
+      </w:tr>
+      <w:tr>
+        <w:tc>
+          <w:tcPr/>
+          <w:p>
+            <w:pPr>
+              <w:pStyle w:val="Compact"/>
+            </w:pPr>
+            <w:r>
+              <w:t xml:space="preserve">HXC-1941</w:t>
+            </w:r>
+          </w:p>
+        </w:tc>
+        <w:tc>
+          <w:tcPr/>
+          <w:p>
+            <w:pPr>
+              <w:pStyle w:val="Compact"/>
+            </w:pPr>
+            <w:r>
+              <w:t xml:space="preserve">Bug</w:t>
+            </w:r>
+          </w:p>
+        </w:tc>
+        <w:tc>
+          <w:tcPr/>
+          <w:p>
+            <w:pPr>
+              <w:pStyle w:val="Compact"/>
+            </w:pPr>
+            <w:r>
+              <w:t xml:space="preserve">P1</w:t>
+            </w:r>
+          </w:p>
+        </w:tc>
+        <w:tc>
+          <w:tcPr/>
+          <w:p>
+            <w:pPr>
+              <w:pStyle w:val="Compact"/>
+            </w:pPr>
+            <w:r>
+              <w:t xml:space="preserve">internal/federation: cell-selection trust gate FAILS OPEN on unknown/empty liveness (default-allow admission)</w:t>
             </w:r>
           </w:p>
         </w:tc>

</xml_diff>

<commit_message>
docs: docs_chain export sync for HXC-1942/1943/1944 + handoff refresh (CLAUDE-3)
Co-Authored-By: Claude Opus 4.8 (1M context) <noreply@anthropic.com>
</commit_message>
<xml_diff>
--- a/docs/export/fixed.docx
+++ b/docs/export/fixed.docx
@@ -34,7 +34,7 @@
         <w:t xml:space="preserve"> </w:t>
       </w:r>
       <w:r>
-        <w:t xml:space="preserve">233</w:t>
+        <w:t xml:space="preserve">234</w:t>
       </w:r>
       <w:r>
         <w:t xml:space="preserve"> </w:t>
@@ -50,7 +50,7 @@
         <w:t xml:space="preserve"> </w:t>
       </w:r>
       <w:r>
-        <w:t xml:space="preserve">2026-06-16T22:26:36Z</w:t>
+        <w:t xml:space="preserve">2026-06-16T22:33:13Z</w:t>
       </w:r>
       <w:r>
         <w:t xml:space="preserve"> </w:t>
@@ -116,7 +116,7 @@
           <w:b/>
           <w:bCs/>
         </w:rPr>
-        <w:t xml:space="preserve">835</w:t>
+        <w:t xml:space="preserve">838</w:t>
       </w:r>
       <w:r>
         <w:t xml:space="preserve">.</w:t>
@@ -43147,6 +43147,168 @@
             </w:pPr>
             <w:r>
               <w:t xml:space="preserve">internal/federation: cell-selection trust gate FAILS OPEN on unknown/empty liveness (default-allow admission)</w:t>
+            </w:r>
+          </w:p>
+        </w:tc>
+        <w:tc>
+          <w:tcPr/>
+          <w:p>
+            <w:pPr>
+              <w:pStyle w:val="Compact"/>
+            </w:pPr>
+          </w:p>
+        </w:tc>
+      </w:tr>
+      <w:tr>
+        <w:tc>
+          <w:tcPr/>
+          <w:p>
+            <w:pPr>
+              <w:pStyle w:val="Compact"/>
+            </w:pPr>
+            <w:r>
+              <w:t xml:space="preserve">HXC-1942</w:t>
+            </w:r>
+          </w:p>
+        </w:tc>
+        <w:tc>
+          <w:tcPr/>
+          <w:p>
+            <w:pPr>
+              <w:pStyle w:val="Compact"/>
+            </w:pPr>
+            <w:r>
+              <w:t xml:space="preserve">Bug</w:t>
+            </w:r>
+          </w:p>
+        </w:tc>
+        <w:tc>
+          <w:tcPr/>
+          <w:p>
+            <w:pPr>
+              <w:pStyle w:val="Compact"/>
+            </w:pPr>
+            <w:r>
+              <w:t xml:space="preserve">P1</w:t>
+            </w:r>
+          </w:p>
+        </w:tc>
+        <w:tc>
+          <w:tcPr/>
+          <w:p>
+            <w:pPr>
+              <w:pStyle w:val="Compact"/>
+            </w:pPr>
+            <w:r>
+              <w:t xml:space="preserve">internal/messaging: a panicking subscriber handler crashes the whole bus process (no recover) + Publish sink-side bluff</w:t>
+            </w:r>
+          </w:p>
+        </w:tc>
+        <w:tc>
+          <w:tcPr/>
+          <w:p>
+            <w:pPr>
+              <w:pStyle w:val="Compact"/>
+            </w:pPr>
+          </w:p>
+        </w:tc>
+      </w:tr>
+      <w:tr>
+        <w:tc>
+          <w:tcPr/>
+          <w:p>
+            <w:pPr>
+              <w:pStyle w:val="Compact"/>
+            </w:pPr>
+            <w:r>
+              <w:t xml:space="preserve">HXC-1943</w:t>
+            </w:r>
+          </w:p>
+        </w:tc>
+        <w:tc>
+          <w:tcPr/>
+          <w:p>
+            <w:pPr>
+              <w:pStyle w:val="Compact"/>
+            </w:pPr>
+            <w:r>
+              <w:t xml:space="preserve">Bug</w:t>
+            </w:r>
+          </w:p>
+        </w:tc>
+        <w:tc>
+          <w:tcPr/>
+          <w:p>
+            <w:pPr>
+              <w:pStyle w:val="Compact"/>
+            </w:pPr>
+            <w:r>
+              <w:t xml:space="preserve">P2</w:t>
+            </w:r>
+          </w:p>
+        </w:tc>
+        <w:tc>
+          <w:tcPr/>
+          <w:p>
+            <w:pPr>
+              <w:pStyle w:val="Compact"/>
+            </w:pPr>
+            <w:r>
+              <w:t xml:space="preserve">internal/policy: buildReason fabricates scheduling health rationale for non-scheduling policies (forensic audit reason-bluff)</w:t>
+            </w:r>
+          </w:p>
+        </w:tc>
+        <w:tc>
+          <w:tcPr/>
+          <w:p>
+            <w:pPr>
+              <w:pStyle w:val="Compact"/>
+            </w:pPr>
+          </w:p>
+        </w:tc>
+      </w:tr>
+      <w:tr>
+        <w:tc>
+          <w:tcPr/>
+          <w:p>
+            <w:pPr>
+              <w:pStyle w:val="Compact"/>
+            </w:pPr>
+            <w:r>
+              <w:t xml:space="preserve">HXC-1944</w:t>
+            </w:r>
+          </w:p>
+        </w:tc>
+        <w:tc>
+          <w:tcPr/>
+          <w:p>
+            <w:pPr>
+              <w:pStyle w:val="Compact"/>
+            </w:pPr>
+            <w:r>
+              <w:t xml:space="preserve">Bug</w:t>
+            </w:r>
+          </w:p>
+        </w:tc>
+        <w:tc>
+          <w:tcPr/>
+          <w:p>
+            <w:pPr>
+              <w:pStyle w:val="Compact"/>
+            </w:pPr>
+            <w:r>
+              <w:t xml:space="preserve">P2</w:t>
+            </w:r>
+          </w:p>
+        </w:tc>
+        <w:tc>
+          <w:tcPr/>
+          <w:p>
+            <w:pPr>
+              <w:pStyle w:val="Compact"/>
+            </w:pPr>
+            <w:r>
+              <w:t xml:space="preserve">pkg/admissioncontrol: zero-capacity request wrongly rejected when reserve&gt;free (contract violation, fail-closed)</w:t>
             </w:r>
           </w:p>
         </w:tc>

</xml_diff>

<commit_message>
docs: docs_chain export sync for HXC-1945/1946/1947 (CLAUDE-3)
Co-Authored-By: Claude Opus 4.8 (1M context) <noreply@anthropic.com>
</commit_message>
<xml_diff>
--- a/docs/export/fixed.docx
+++ b/docs/export/fixed.docx
@@ -34,7 +34,7 @@
         <w:t xml:space="preserve"> </w:t>
       </w:r>
       <w:r>
-        <w:t xml:space="preserve">234</w:t>
+        <w:t xml:space="preserve">235</w:t>
       </w:r>
       <w:r>
         <w:t xml:space="preserve"> </w:t>
@@ -50,7 +50,7 @@
         <w:t xml:space="preserve"> </w:t>
       </w:r>
       <w:r>
-        <w:t xml:space="preserve">2026-06-16T22:33:13Z</w:t>
+        <w:t xml:space="preserve">2026-06-16T22:43:11Z</w:t>
       </w:r>
       <w:r>
         <w:t xml:space="preserve"> </w:t>
@@ -116,7 +116,7 @@
           <w:b/>
           <w:bCs/>
         </w:rPr>
-        <w:t xml:space="preserve">838</w:t>
+        <w:t xml:space="preserve">841</w:t>
       </w:r>
       <w:r>
         <w:t xml:space="preserve">.</w:t>
@@ -43309,6 +43309,168 @@
             </w:pPr>
             <w:r>
               <w:t xml:space="preserve">pkg/admissioncontrol: zero-capacity request wrongly rejected when reserve&gt;free (contract violation, fail-closed)</w:t>
+            </w:r>
+          </w:p>
+        </w:tc>
+        <w:tc>
+          <w:tcPr/>
+          <w:p>
+            <w:pPr>
+              <w:pStyle w:val="Compact"/>
+            </w:pPr>
+          </w:p>
+        </w:tc>
+      </w:tr>
+      <w:tr>
+        <w:tc>
+          <w:tcPr/>
+          <w:p>
+            <w:pPr>
+              <w:pStyle w:val="Compact"/>
+            </w:pPr>
+            <w:r>
+              <w:t xml:space="preserve">HXC-1945</w:t>
+            </w:r>
+          </w:p>
+        </w:tc>
+        <w:tc>
+          <w:tcPr/>
+          <w:p>
+            <w:pPr>
+              <w:pStyle w:val="Compact"/>
+            </w:pPr>
+            <w:r>
+              <w:t xml:space="preserve">Bug</w:t>
+            </w:r>
+          </w:p>
+        </w:tc>
+        <w:tc>
+          <w:tcPr/>
+          <w:p>
+            <w:pPr>
+              <w:pStyle w:val="Compact"/>
+            </w:pPr>
+            <w:r>
+              <w:t xml:space="preserve">P1</w:t>
+            </w:r>
+          </w:p>
+        </w:tc>
+        <w:tc>
+          <w:tcPr/>
+          <w:p>
+            <w:pPr>
+              <w:pStyle w:val="Compact"/>
+            </w:pPr>
+            <w:r>
+              <w:t xml:space="preserve">internal/console: cluster-join readiness gate FAILS OPEN via substring match (helix.cluster=readyx admitted)</w:t>
+            </w:r>
+          </w:p>
+        </w:tc>
+        <w:tc>
+          <w:tcPr/>
+          <w:p>
+            <w:pPr>
+              <w:pStyle w:val="Compact"/>
+            </w:pPr>
+          </w:p>
+        </w:tc>
+      </w:tr>
+      <w:tr>
+        <w:tc>
+          <w:tcPr/>
+          <w:p>
+            <w:pPr>
+              <w:pStyle w:val="Compact"/>
+            </w:pPr>
+            <w:r>
+              <w:t xml:space="preserve">HXC-1946</w:t>
+            </w:r>
+          </w:p>
+        </w:tc>
+        <w:tc>
+          <w:tcPr/>
+          <w:p>
+            <w:pPr>
+              <w:pStyle w:val="Compact"/>
+            </w:pPr>
+            <w:r>
+              <w:t xml:space="preserve">Bug</w:t>
+            </w:r>
+          </w:p>
+        </w:tc>
+        <w:tc>
+          <w:tcPr/>
+          <w:p>
+            <w:pPr>
+              <w:pStyle w:val="Compact"/>
+            </w:pPr>
+            <w:r>
+              <w:t xml:space="preserve">P1</w:t>
+            </w:r>
+          </w:p>
+        </w:tc>
+        <w:tc>
+          <w:tcPr/>
+          <w:p>
+            <w:pPr>
+              <w:pStyle w:val="Compact"/>
+            </w:pPr>
+            <w:r>
+              <w:t xml:space="preserve">internal/wireguard: LocalConfig.Validate fails open on duplicate peer public keys (collapses to one device peer)</w:t>
+            </w:r>
+          </w:p>
+        </w:tc>
+        <w:tc>
+          <w:tcPr/>
+          <w:p>
+            <w:pPr>
+              <w:pStyle w:val="Compact"/>
+            </w:pPr>
+          </w:p>
+        </w:tc>
+      </w:tr>
+      <w:tr>
+        <w:tc>
+          <w:tcPr/>
+          <w:p>
+            <w:pPr>
+              <w:pStyle w:val="Compact"/>
+            </w:pPr>
+            <w:r>
+              <w:t xml:space="preserve">HXC-1947</w:t>
+            </w:r>
+          </w:p>
+        </w:tc>
+        <w:tc>
+          <w:tcPr/>
+          <w:p>
+            <w:pPr>
+              <w:pStyle w:val="Compact"/>
+            </w:pPr>
+            <w:r>
+              <w:t xml:space="preserve">Bug</w:t>
+            </w:r>
+          </w:p>
+        </w:tc>
+        <w:tc>
+          <w:tcPr/>
+          <w:p>
+            <w:pPr>
+              <w:pStyle w:val="Compact"/>
+            </w:pPr>
+            <w:r>
+              <w:t xml:space="preserve">P2</w:t>
+            </w:r>
+          </w:p>
+        </w:tc>
+        <w:tc>
+          <w:tcPr/>
+          <w:p>
+            <w:pPr>
+              <w:pStyle w:val="Compact"/>
+            </w:pPr>
+            <w:r>
+              <w:t xml:space="preserve">pkg/offlinesync: reconcile tiebreak (Seq,Output) is not a total order -&gt; replicas diverge on CompletedAt</w:t>
             </w:r>
           </w:p>
         </w:tc>

</xml_diff>

<commit_message>
docs: docs_chain export sync for HXC-1948/1949/1950 (CLAUDE-3)
Co-Authored-By: Claude Opus 4.8 (1M context) <noreply@anthropic.com>
</commit_message>
<xml_diff>
--- a/docs/export/fixed.docx
+++ b/docs/export/fixed.docx
@@ -34,7 +34,7 @@
         <w:t xml:space="preserve"> </w:t>
       </w:r>
       <w:r>
-        <w:t xml:space="preserve">235</w:t>
+        <w:t xml:space="preserve">236</w:t>
       </w:r>
       <w:r>
         <w:t xml:space="preserve"> </w:t>
@@ -50,7 +50,7 @@
         <w:t xml:space="preserve"> </w:t>
       </w:r>
       <w:r>
-        <w:t xml:space="preserve">2026-06-16T22:43:11Z</w:t>
+        <w:t xml:space="preserve">2026-06-16T22:55:13Z</w:t>
       </w:r>
       <w:r>
         <w:t xml:space="preserve"> </w:t>
@@ -116,7 +116,7 @@
           <w:b/>
           <w:bCs/>
         </w:rPr>
-        <w:t xml:space="preserve">841</w:t>
+        <w:t xml:space="preserve">844</w:t>
       </w:r>
       <w:r>
         <w:t xml:space="preserve">.</w:t>
@@ -43471,6 +43471,168 @@
             </w:pPr>
             <w:r>
               <w:t xml:space="preserve">pkg/offlinesync: reconcile tiebreak (Seq,Output) is not a total order -&gt; replicas diverge on CompletedAt</w:t>
+            </w:r>
+          </w:p>
+        </w:tc>
+        <w:tc>
+          <w:tcPr/>
+          <w:p>
+            <w:pPr>
+              <w:pStyle w:val="Compact"/>
+            </w:pPr>
+          </w:p>
+        </w:tc>
+      </w:tr>
+      <w:tr>
+        <w:tc>
+          <w:tcPr/>
+          <w:p>
+            <w:pPr>
+              <w:pStyle w:val="Compact"/>
+            </w:pPr>
+            <w:r>
+              <w:t xml:space="preserve">HXC-1948</w:t>
+            </w:r>
+          </w:p>
+        </w:tc>
+        <w:tc>
+          <w:tcPr/>
+          <w:p>
+            <w:pPr>
+              <w:pStyle w:val="Compact"/>
+            </w:pPr>
+            <w:r>
+              <w:t xml:space="preserve">Bug</w:t>
+            </w:r>
+          </w:p>
+        </w:tc>
+        <w:tc>
+          <w:tcPr/>
+          <w:p>
+            <w:pPr>
+              <w:pStyle w:val="Compact"/>
+            </w:pPr>
+            <w:r>
+              <w:t xml:space="preserve">P2</w:t>
+            </w:r>
+          </w:p>
+        </w:tc>
+        <w:tc>
+          <w:tcPr/>
+          <w:p>
+            <w:pPr>
+              <w:pStyle w:val="Compact"/>
+            </w:pPr>
+            <w:r>
+              <w:t xml:space="preserve">internal/build: orchestrator worker pool unbounded -&gt; HELIX_BUILD_WORKERS=1e9 spawns ~1e9 goroutines (DoS)</w:t>
+            </w:r>
+          </w:p>
+        </w:tc>
+        <w:tc>
+          <w:tcPr/>
+          <w:p>
+            <w:pPr>
+              <w:pStyle w:val="Compact"/>
+            </w:pPr>
+          </w:p>
+        </w:tc>
+      </w:tr>
+      <w:tr>
+        <w:tc>
+          <w:tcPr/>
+          <w:p>
+            <w:pPr>
+              <w:pStyle w:val="Compact"/>
+            </w:pPr>
+            <w:r>
+              <w:t xml:space="preserve">HXC-1949</w:t>
+            </w:r>
+          </w:p>
+        </w:tc>
+        <w:tc>
+          <w:tcPr/>
+          <w:p>
+            <w:pPr>
+              <w:pStyle w:val="Compact"/>
+            </w:pPr>
+            <w:r>
+              <w:t xml:space="preserve">Bug</w:t>
+            </w:r>
+          </w:p>
+        </w:tc>
+        <w:tc>
+          <w:tcPr/>
+          <w:p>
+            <w:pPr>
+              <w:pStyle w:val="Compact"/>
+            </w:pPr>
+            <w:r>
+              <w:t xml:space="preserve">P1</w:t>
+            </w:r>
+          </w:p>
+        </w:tc>
+        <w:tc>
+          <w:tcPr/>
+          <w:p>
+            <w:pPr>
+              <w:pStyle w:val="Compact"/>
+            </w:pPr>
+            <w:r>
+              <w:t xml:space="preserve">internal/node: memRegistry aliases the caller’s *Node pointer -&gt; a mutation by any holder corrupts the stored node + all readers</w:t>
+            </w:r>
+          </w:p>
+        </w:tc>
+        <w:tc>
+          <w:tcPr/>
+          <w:p>
+            <w:pPr>
+              <w:pStyle w:val="Compact"/>
+            </w:pPr>
+          </w:p>
+        </w:tc>
+      </w:tr>
+      <w:tr>
+        <w:tc>
+          <w:tcPr/>
+          <w:p>
+            <w:pPr>
+              <w:pStyle w:val="Compact"/>
+            </w:pPr>
+            <w:r>
+              <w:t xml:space="preserve">HXC-1950</w:t>
+            </w:r>
+          </w:p>
+        </w:tc>
+        <w:tc>
+          <w:tcPr/>
+          <w:p>
+            <w:pPr>
+              <w:pStyle w:val="Compact"/>
+            </w:pPr>
+            <w:r>
+              <w:t xml:space="preserve">Task</w:t>
+            </w:r>
+          </w:p>
+        </w:tc>
+        <w:tc>
+          <w:tcPr/>
+          <w:p>
+            <w:pPr>
+              <w:pStyle w:val="Compact"/>
+            </w:pPr>
+            <w:r>
+              <w:t xml:space="preserve">P2</w:t>
+            </w:r>
+          </w:p>
+        </w:tc>
+        <w:tc>
+          <w:tcPr/>
+          <w:p>
+            <w:pPr>
+              <w:pStyle w:val="Compact"/>
+            </w:pPr>
+            <w:r>
+              <w:t xml:space="preserve">Deep re-audit: internal/health (no new bug; aggregation fail-closed confirmed, 8 pins)</w:t>
             </w:r>
           </w:p>
         </w:tc>

</xml_diff>

<commit_message>
docs: docs_chain export sync for HXC-1951 (CLAUDE-3)
Co-Authored-By: Claude Opus 4.8 (1M context) <noreply@anthropic.com>
</commit_message>
<xml_diff>
--- a/docs/export/fixed.docx
+++ b/docs/export/fixed.docx
@@ -34,7 +34,7 @@
         <w:t xml:space="preserve"> </w:t>
       </w:r>
       <w:r>
-        <w:t xml:space="preserve">236</w:t>
+        <w:t xml:space="preserve">237</w:t>
       </w:r>
       <w:r>
         <w:t xml:space="preserve"> </w:t>
@@ -50,7 +50,7 @@
         <w:t xml:space="preserve"> </w:t>
       </w:r>
       <w:r>
-        <w:t xml:space="preserve">2026-06-16T22:55:13Z</w:t>
+        <w:t xml:space="preserve">2026-06-16T23:00:11Z</w:t>
       </w:r>
       <w:r>
         <w:t xml:space="preserve"> </w:t>
@@ -116,7 +116,7 @@
           <w:b/>
           <w:bCs/>
         </w:rPr>
-        <w:t xml:space="preserve">844</w:t>
+        <w:t xml:space="preserve">845</w:t>
       </w:r>
       <w:r>
         <w:t xml:space="preserve">.</w:t>
@@ -43633,6 +43633,60 @@
             </w:pPr>
             <w:r>
               <w:t xml:space="preserve">Deep re-audit: internal/health (no new bug; aggregation fail-closed confirmed, 8 pins)</w:t>
+            </w:r>
+          </w:p>
+        </w:tc>
+        <w:tc>
+          <w:tcPr/>
+          <w:p>
+            <w:pPr>
+              <w:pStyle w:val="Compact"/>
+            </w:pPr>
+          </w:p>
+        </w:tc>
+      </w:tr>
+      <w:tr>
+        <w:tc>
+          <w:tcPr/>
+          <w:p>
+            <w:pPr>
+              <w:pStyle w:val="Compact"/>
+            </w:pPr>
+            <w:r>
+              <w:t xml:space="preserve">HXC-1951</w:t>
+            </w:r>
+          </w:p>
+        </w:tc>
+        <w:tc>
+          <w:tcPr/>
+          <w:p>
+            <w:pPr>
+              <w:pStyle w:val="Compact"/>
+            </w:pPr>
+            <w:r>
+              <w:t xml:space="preserve">Bug</w:t>
+            </w:r>
+          </w:p>
+        </w:tc>
+        <w:tc>
+          <w:tcPr/>
+          <w:p>
+            <w:pPr>
+              <w:pStyle w:val="Compact"/>
+            </w:pPr>
+            <w:r>
+              <w:t xml:space="preserve">P2</w:t>
+            </w:r>
+          </w:p>
+        </w:tc>
+        <w:tc>
+          <w:tcPr/>
+          <w:p>
+            <w:pPr>
+              <w:pStyle w:val="Compact"/>
+            </w:pPr>
+            <w:r>
+              <w:t xml:space="preserve">internal/build: runViaSeam test helper 5s Eventually deadline too tight -&gt; RealGoBuild flakes under -race</w:t>
             </w:r>
           </w:p>
         </w:tc>

</xml_diff>

<commit_message>
docs: docs_chain export sync for HXC-1956/1957/1958 (CLAUDE-3)
Co-Authored-By: Claude Opus 4.8 (1M context) <noreply@anthropic.com>
</commit_message>
<xml_diff>
--- a/docs/export/fixed.docx
+++ b/docs/export/fixed.docx
@@ -34,7 +34,7 @@
         <w:t xml:space="preserve"> </w:t>
       </w:r>
       <w:r>
-        <w:t xml:space="preserve">237</w:t>
+        <w:t xml:space="preserve">240</w:t>
       </w:r>
       <w:r>
         <w:t xml:space="preserve"> </w:t>
@@ -50,7 +50,7 @@
         <w:t xml:space="preserve"> </w:t>
       </w:r>
       <w:r>
-        <w:t xml:space="preserve">2026-06-16T23:00:11Z</w:t>
+        <w:t xml:space="preserve">2026-06-16T23:32:53Z</w:t>
       </w:r>
       <w:r>
         <w:t xml:space="preserve"> </w:t>
@@ -116,7 +116,7 @@
           <w:b/>
           <w:bCs/>
         </w:rPr>
-        <w:t xml:space="preserve">845</w:t>
+        <w:t xml:space="preserve">852</w:t>
       </w:r>
       <w:r>
         <w:t xml:space="preserve">.</w:t>
@@ -43687,6 +43687,384 @@
             </w:pPr>
             <w:r>
               <w:t xml:space="preserve">internal/build: runViaSeam test helper 5s Eventually deadline too tight -&gt; RealGoBuild flakes under -race</w:t>
+            </w:r>
+          </w:p>
+        </w:tc>
+        <w:tc>
+          <w:tcPr/>
+          <w:p>
+            <w:pPr>
+              <w:pStyle w:val="Compact"/>
+            </w:pPr>
+          </w:p>
+        </w:tc>
+      </w:tr>
+      <w:tr>
+        <w:tc>
+          <w:tcPr/>
+          <w:p>
+            <w:pPr>
+              <w:pStyle w:val="Compact"/>
+            </w:pPr>
+            <w:r>
+              <w:t xml:space="preserve">HXC-1952</w:t>
+            </w:r>
+          </w:p>
+        </w:tc>
+        <w:tc>
+          <w:tcPr/>
+          <w:p>
+            <w:pPr>
+              <w:pStyle w:val="Compact"/>
+            </w:pPr>
+            <w:r>
+              <w:t xml:space="preserve">Bug</w:t>
+            </w:r>
+          </w:p>
+        </w:tc>
+        <w:tc>
+          <w:tcPr/>
+          <w:p>
+            <w:pPr>
+              <w:pStyle w:val="Compact"/>
+            </w:pPr>
+            <w:r>
+              <w:t xml:space="preserve">P1</w:t>
+            </w:r>
+          </w:p>
+        </w:tc>
+        <w:tc>
+          <w:tcPr/>
+          <w:p>
+            <w:pPr>
+              <w:pStyle w:val="Compact"/>
+            </w:pPr>
+            <w:r>
+              <w:t xml:space="preserve">internal/llm: Route comparator (score &gt; best) lets a NaN routing metric seize the pick -&gt; non-deterministic mis-route</w:t>
+            </w:r>
+          </w:p>
+        </w:tc>
+        <w:tc>
+          <w:tcPr/>
+          <w:p>
+            <w:pPr>
+              <w:pStyle w:val="Compact"/>
+            </w:pPr>
+          </w:p>
+        </w:tc>
+      </w:tr>
+      <w:tr>
+        <w:tc>
+          <w:tcPr/>
+          <w:p>
+            <w:pPr>
+              <w:pStyle w:val="Compact"/>
+            </w:pPr>
+            <w:r>
+              <w:t xml:space="preserve">HXC-1953</w:t>
+            </w:r>
+          </w:p>
+        </w:tc>
+        <w:tc>
+          <w:tcPr/>
+          <w:p>
+            <w:pPr>
+              <w:pStyle w:val="Compact"/>
+            </w:pPr>
+            <w:r>
+              <w:t xml:space="preserve">Task</w:t>
+            </w:r>
+          </w:p>
+        </w:tc>
+        <w:tc>
+          <w:tcPr/>
+          <w:p>
+            <w:pPr>
+              <w:pStyle w:val="Compact"/>
+            </w:pPr>
+            <w:r>
+              <w:t xml:space="preserve">P2</w:t>
+            </w:r>
+          </w:p>
+        </w:tc>
+        <w:tc>
+          <w:tcPr/>
+          <w:p>
+            <w:pPr>
+              <w:pStyle w:val="Compact"/>
+            </w:pPr>
+            <w:r>
+              <w:t xml:space="preserve">Deep re-audit: pkg/jobadmit + pkg/antientropy (no new bug; prior fixes hold; pins + 1 latent risk)</w:t>
+            </w:r>
+          </w:p>
+        </w:tc>
+        <w:tc>
+          <w:tcPr/>
+          <w:p>
+            <w:pPr>
+              <w:pStyle w:val="Compact"/>
+            </w:pPr>
+          </w:p>
+        </w:tc>
+      </w:tr>
+      <w:tr>
+        <w:tc>
+          <w:tcPr/>
+          <w:p>
+            <w:pPr>
+              <w:pStyle w:val="Compact"/>
+            </w:pPr>
+            <w:r>
+              <w:t xml:space="preserve">HXC-1954</w:t>
+            </w:r>
+          </w:p>
+        </w:tc>
+        <w:tc>
+          <w:tcPr/>
+          <w:p>
+            <w:pPr>
+              <w:pStyle w:val="Compact"/>
+            </w:pPr>
+            <w:r>
+              <w:t xml:space="preserve">Bug</w:t>
+            </w:r>
+          </w:p>
+        </w:tc>
+        <w:tc>
+          <w:tcPr/>
+          <w:p>
+            <w:pPr>
+              <w:pStyle w:val="Compact"/>
+            </w:pPr>
+            <w:r>
+              <w:t xml:space="preserve">P1</w:t>
+            </w:r>
+          </w:p>
+        </w:tc>
+        <w:tc>
+          <w:tcPr/>
+          <w:p>
+            <w:pPr>
+              <w:pStyle w:val="Compact"/>
+            </w:pPr>
+            <w:r>
+              <w:t xml:space="preserve">internal/gpu: Reservation.AvailableFor(Batch) over-reports headroom that Admit denies (anti-starvation breach)</w:t>
+            </w:r>
+          </w:p>
+        </w:tc>
+        <w:tc>
+          <w:tcPr/>
+          <w:p>
+            <w:pPr>
+              <w:pStyle w:val="Compact"/>
+            </w:pPr>
+          </w:p>
+        </w:tc>
+      </w:tr>
+      <w:tr>
+        <w:tc>
+          <w:tcPr/>
+          <w:p>
+            <w:pPr>
+              <w:pStyle w:val="Compact"/>
+            </w:pPr>
+            <w:r>
+              <w:t xml:space="preserve">HXC-1955</w:t>
+            </w:r>
+          </w:p>
+        </w:tc>
+        <w:tc>
+          <w:tcPr/>
+          <w:p>
+            <w:pPr>
+              <w:pStyle w:val="Compact"/>
+            </w:pPr>
+            <w:r>
+              <w:t xml:space="preserve">Task</w:t>
+            </w:r>
+          </w:p>
+        </w:tc>
+        <w:tc>
+          <w:tcPr/>
+          <w:p>
+            <w:pPr>
+              <w:pStyle w:val="Compact"/>
+            </w:pPr>
+            <w:r>
+              <w:t xml:space="preserve">P2</w:t>
+            </w:r>
+          </w:p>
+        </w:tc>
+        <w:tc>
+          <w:tcPr/>
+          <w:p>
+            <w:pPr>
+              <w:pStyle w:val="Compact"/>
+            </w:pPr>
+            <w:r>
+              <w:t xml:space="preserve">Deep re-audit: internal/trust + internal/verifier (no bug; security gates fail-closed, mutation-proven)</w:t>
+            </w:r>
+          </w:p>
+        </w:tc>
+        <w:tc>
+          <w:tcPr/>
+          <w:p>
+            <w:pPr>
+              <w:pStyle w:val="Compact"/>
+            </w:pPr>
+          </w:p>
+        </w:tc>
+      </w:tr>
+      <w:tr>
+        <w:tc>
+          <w:tcPr/>
+          <w:p>
+            <w:pPr>
+              <w:pStyle w:val="Compact"/>
+            </w:pPr>
+            <w:r>
+              <w:t xml:space="preserve">HXC-1956</w:t>
+            </w:r>
+          </w:p>
+        </w:tc>
+        <w:tc>
+          <w:tcPr/>
+          <w:p>
+            <w:pPr>
+              <w:pStyle w:val="Compact"/>
+            </w:pPr>
+            <w:r>
+              <w:t xml:space="preserve">Bug</w:t>
+            </w:r>
+          </w:p>
+        </w:tc>
+        <w:tc>
+          <w:tcPr/>
+          <w:p>
+            <w:pPr>
+              <w:pStyle w:val="Compact"/>
+            </w:pPr>
+            <w:r>
+              <w:t xml:space="preserve">P0</w:t>
+            </w:r>
+          </w:p>
+        </w:tc>
+        <w:tc>
+          <w:tcPr/>
+          <w:p>
+            <w:pPr>
+              <w:pStyle w:val="Compact"/>
+            </w:pPr>
+            <w:r>
+              <w:t xml:space="preserve">internal/gateway: path-traversal auth-scope bypass — un-normalized path lets a weak-scope token reach an admin endpoint</w:t>
+            </w:r>
+          </w:p>
+        </w:tc>
+        <w:tc>
+          <w:tcPr/>
+          <w:p>
+            <w:pPr>
+              <w:pStyle w:val="Compact"/>
+            </w:pPr>
+          </w:p>
+        </w:tc>
+      </w:tr>
+      <w:tr>
+        <w:tc>
+          <w:tcPr/>
+          <w:p>
+            <w:pPr>
+              <w:pStyle w:val="Compact"/>
+            </w:pPr>
+            <w:r>
+              <w:t xml:space="preserve">HXC-1957</w:t>
+            </w:r>
+          </w:p>
+        </w:tc>
+        <w:tc>
+          <w:tcPr/>
+          <w:p>
+            <w:pPr>
+              <w:pStyle w:val="Compact"/>
+            </w:pPr>
+            <w:r>
+              <w:t xml:space="preserve">Bug</w:t>
+            </w:r>
+          </w:p>
+        </w:tc>
+        <w:tc>
+          <w:tcPr/>
+          <w:p>
+            <w:pPr>
+              <w:pStyle w:val="Compact"/>
+            </w:pPr>
+            <w:r>
+              <w:t xml:space="preserve">P1</w:t>
+            </w:r>
+          </w:p>
+        </w:tc>
+        <w:tc>
+          <w:tcPr/>
+          <w:p>
+            <w:pPr>
+              <w:pStyle w:val="Compact"/>
+            </w:pPr>
+            <w:r>
+              <w:t xml:space="preserve">pkg/discovery: Lookup returns TTL-expired instances as healthy (stale-&gt;dead node) + Metadata map aliasing corrupts the registry</w:t>
+            </w:r>
+          </w:p>
+        </w:tc>
+        <w:tc>
+          <w:tcPr/>
+          <w:p>
+            <w:pPr>
+              <w:pStyle w:val="Compact"/>
+            </w:pPr>
+          </w:p>
+        </w:tc>
+      </w:tr>
+      <w:tr>
+        <w:tc>
+          <w:tcPr/>
+          <w:p>
+            <w:pPr>
+              <w:pStyle w:val="Compact"/>
+            </w:pPr>
+            <w:r>
+              <w:t xml:space="preserve">HXC-1958</w:t>
+            </w:r>
+          </w:p>
+        </w:tc>
+        <w:tc>
+          <w:tcPr/>
+          <w:p>
+            <w:pPr>
+              <w:pStyle w:val="Compact"/>
+            </w:pPr>
+            <w:r>
+              <w:t xml:space="preserve">Bug</w:t>
+            </w:r>
+          </w:p>
+        </w:tc>
+        <w:tc>
+          <w:tcPr/>
+          <w:p>
+            <w:pPr>
+              <w:pStyle w:val="Compact"/>
+            </w:pPr>
+            <w:r>
+              <w:t xml:space="preserve">P1</w:t>
+            </w:r>
+          </w:p>
+        </w:tc>
+        <w:tc>
+          <w:tcPr/>
+          <w:p>
+            <w:pPr>
+              <w:pStyle w:val="Compact"/>
+            </w:pPr>
+            <w:r>
+              <w:t xml:space="preserve">internal/costbroker: NaN/Inf/negative LatencyMs or Reliability bypasses selection -&gt; pins min-search + overcharges</w:t>
             </w:r>
           </w:p>
         </w:tc>

</xml_diff>

<commit_message>
docs: docs_chain export sync for HXC-1959 (CLAUDE-3)
Co-Authored-By: Claude Opus 4.8 (1M context) <noreply@anthropic.com>
</commit_message>
<xml_diff>
--- a/docs/export/fixed.docx
+++ b/docs/export/fixed.docx
@@ -34,7 +34,7 @@
         <w:t xml:space="preserve"> </w:t>
       </w:r>
       <w:r>
-        <w:t xml:space="preserve">240</w:t>
+        <w:t xml:space="preserve">241</w:t>
       </w:r>
       <w:r>
         <w:t xml:space="preserve"> </w:t>
@@ -50,7 +50,7 @@
         <w:t xml:space="preserve"> </w:t>
       </w:r>
       <w:r>
-        <w:t xml:space="preserve">2026-06-16T23:32:53Z</w:t>
+        <w:t xml:space="preserve">2026-06-16T23:42:27Z</w:t>
       </w:r>
       <w:r>
         <w:t xml:space="preserve"> </w:t>
@@ -116,7 +116,7 @@
           <w:b/>
           <w:bCs/>
         </w:rPr>
-        <w:t xml:space="preserve">852</w:t>
+        <w:t xml:space="preserve">853</w:t>
       </w:r>
       <w:r>
         <w:t xml:space="preserve">.</w:t>
@@ -44065,6 +44065,60 @@
             </w:pPr>
             <w:r>
               <w:t xml:space="preserve">internal/costbroker: NaN/Inf/negative LatencyMs or Reliability bypasses selection -&gt; pins min-search + overcharges</w:t>
+            </w:r>
+          </w:p>
+        </w:tc>
+        <w:tc>
+          <w:tcPr/>
+          <w:p>
+            <w:pPr>
+              <w:pStyle w:val="Compact"/>
+            </w:pPr>
+          </w:p>
+        </w:tc>
+      </w:tr>
+      <w:tr>
+        <w:tc>
+          <w:tcPr/>
+          <w:p>
+            <w:pPr>
+              <w:pStyle w:val="Compact"/>
+            </w:pPr>
+            <w:r>
+              <w:t xml:space="preserve">HXC-1959</w:t>
+            </w:r>
+          </w:p>
+        </w:tc>
+        <w:tc>
+          <w:tcPr/>
+          <w:p>
+            <w:pPr>
+              <w:pStyle w:val="Compact"/>
+            </w:pPr>
+            <w:r>
+              <w:t xml:space="preserve">Task</w:t>
+            </w:r>
+          </w:p>
+        </w:tc>
+        <w:tc>
+          <w:tcPr/>
+          <w:p>
+            <w:pPr>
+              <w:pStyle w:val="Compact"/>
+            </w:pPr>
+            <w:r>
+              <w:t xml:space="preserve">P2</w:t>
+            </w:r>
+          </w:p>
+        </w:tc>
+        <w:tc>
+          <w:tcPr/>
+          <w:p>
+            <w:pPr>
+              <w:pStyle w:val="Compact"/>
+            </w:pPr>
+            <w:r>
+              <w:t xml:space="preserve">Deep re-audit: pkg/{jwt,security,smartrouter} (no bug; security PRIMITIVES fail-closed, mutation-proven)</w:t>
             </w:r>
           </w:p>
         </w:tc>

</xml_diff>

<commit_message>
docs: docs_chain export sync for HXC-1964/1965/1966 (CLAUDE-3)
Co-Authored-By: Claude Opus 4.8 (1M context) <noreply@anthropic.com>
</commit_message>
<xml_diff>
--- a/docs/export/fixed.docx
+++ b/docs/export/fixed.docx
@@ -34,7 +34,7 @@
         <w:t xml:space="preserve"> </w:t>
       </w:r>
       <w:r>
-        <w:t xml:space="preserve">241</w:t>
+        <w:t xml:space="preserve">243</w:t>
       </w:r>
       <w:r>
         <w:t xml:space="preserve"> </w:t>
@@ -50,7 +50,7 @@
         <w:t xml:space="preserve"> </w:t>
       </w:r>
       <w:r>
-        <w:t xml:space="preserve">2026-06-16T23:42:27Z</w:t>
+        <w:t xml:space="preserve">2026-06-17T04:38:16Z</w:t>
       </w:r>
       <w:r>
         <w:t xml:space="preserve"> </w:t>
@@ -116,7 +116,7 @@
           <w:b/>
           <w:bCs/>
         </w:rPr>
-        <w:t xml:space="preserve">853</w:t>
+        <w:t xml:space="preserve">860</w:t>
       </w:r>
       <w:r>
         <w:t xml:space="preserve">.</w:t>
@@ -44119,6 +44119,399 @@
             </w:pPr>
             <w:r>
               <w:t xml:space="preserve">Deep re-audit: pkg/{jwt,security,smartrouter} (no bug; security PRIMITIVES fail-closed, mutation-proven)</w:t>
+            </w:r>
+          </w:p>
+        </w:tc>
+        <w:tc>
+          <w:tcPr/>
+          <w:p>
+            <w:pPr>
+              <w:pStyle w:val="Compact"/>
+            </w:pPr>
+          </w:p>
+        </w:tc>
+      </w:tr>
+      <w:tr>
+        <w:tc>
+          <w:tcPr/>
+          <w:p>
+            <w:pPr>
+              <w:pStyle w:val="Compact"/>
+            </w:pPr>
+            <w:r>
+              <w:t xml:space="preserve">HXC-1960</w:t>
+            </w:r>
+          </w:p>
+        </w:tc>
+        <w:tc>
+          <w:tcPr/>
+          <w:p>
+            <w:pPr>
+              <w:pStyle w:val="Compact"/>
+            </w:pPr>
+            <w:r>
+              <w:t xml:space="preserve">Bug</w:t>
+            </w:r>
+          </w:p>
+        </w:tc>
+        <w:tc>
+          <w:tcPr/>
+          <w:p>
+            <w:pPr>
+              <w:pStyle w:val="Compact"/>
+            </w:pPr>
+            <w:r>
+              <w:t xml:space="preserve">P1</w:t>
+            </w:r>
+          </w:p>
+        </w:tc>
+        <w:tc>
+          <w:tcPr/>
+          <w:p>
+            <w:pPr>
+              <w:pStyle w:val="Compact"/>
+            </w:pPr>
+            <w:r>
+              <w:t xml:space="preserve">pkg/budgetcap: NewBudgetCap stores a NaN cap verbatim -&gt; committed&gt;NaN always false -&gt; total cap bypass</w:t>
+            </w:r>
+          </w:p>
+        </w:tc>
+        <w:tc>
+          <w:tcPr/>
+          <w:p>
+            <w:pPr>
+              <w:pStyle w:val="Compact"/>
+            </w:pPr>
+          </w:p>
+        </w:tc>
+      </w:tr>
+      <w:tr>
+        <w:tc>
+          <w:tcPr/>
+          <w:p>
+            <w:pPr>
+              <w:pStyle w:val="Compact"/>
+            </w:pPr>
+            <w:r>
+              <w:t xml:space="preserve">HXC-1961</w:t>
+            </w:r>
+          </w:p>
+        </w:tc>
+        <w:tc>
+          <w:tcPr/>
+          <w:p>
+            <w:pPr>
+              <w:pStyle w:val="Compact"/>
+            </w:pPr>
+            <w:r>
+              <w:t xml:space="preserve">Bug</w:t>
+            </w:r>
+          </w:p>
+        </w:tc>
+        <w:tc>
+          <w:tcPr/>
+          <w:p>
+            <w:pPr>
+              <w:pStyle w:val="Compact"/>
+            </w:pPr>
+            <w:r>
+              <w:t xml:space="preserve">P1</w:t>
+            </w:r>
+          </w:p>
+        </w:tc>
+        <w:tc>
+          <w:tcPr/>
+          <w:p>
+            <w:pPr>
+              <w:pStyle w:val="Compact"/>
+            </w:pPr>
+            <w:r>
+              <w:t xml:space="preserve">pkg/costtracker: Record clamp guards only &lt;0 -&gt; a NaN/Inf input poisons the whole cost report (non-conservation)</w:t>
+            </w:r>
+          </w:p>
+        </w:tc>
+        <w:tc>
+          <w:tcPr/>
+          <w:p>
+            <w:pPr>
+              <w:pStyle w:val="Compact"/>
+            </w:pPr>
+          </w:p>
+        </w:tc>
+      </w:tr>
+      <w:tr>
+        <w:tc>
+          <w:tcPr/>
+          <w:p>
+            <w:pPr>
+              <w:pStyle w:val="Compact"/>
+            </w:pPr>
+            <w:r>
+              <w:t xml:space="preserve">HXC-1962</w:t>
+            </w:r>
+          </w:p>
+        </w:tc>
+        <w:tc>
+          <w:tcPr/>
+          <w:p>
+            <w:pPr>
+              <w:pStyle w:val="Compact"/>
+            </w:pPr>
+            <w:r>
+              <w:t xml:space="preserve">Bug</w:t>
+            </w:r>
+          </w:p>
+        </w:tc>
+        <w:tc>
+          <w:tcPr/>
+          <w:p>
+            <w:pPr>
+              <w:pStyle w:val="Compact"/>
+            </w:pPr>
+            <w:r>
+              <w:t xml:space="preserve">P0</w:t>
+            </w:r>
+          </w:p>
+        </w:tc>
+        <w:tc>
+          <w:tcPr/>
+          <w:p>
+            <w:pPr>
+              <w:pStyle w:val="Compact"/>
+            </w:pPr>
+            <w:r>
+              <w:t xml:space="preserve">pkg/tiersec: egress allowlist over-match -&gt; a wide CIDR target (10.0.0.0/4) lets allowlist-tier exfiltrate to public Internet</w:t>
+            </w:r>
+          </w:p>
+        </w:tc>
+        <w:tc>
+          <w:tcPr/>
+          <w:p>
+            <w:pPr>
+              <w:pStyle w:val="Compact"/>
+            </w:pPr>
+          </w:p>
+        </w:tc>
+      </w:tr>
+      <w:tr>
+        <w:tc>
+          <w:tcPr/>
+          <w:p>
+            <w:pPr>
+              <w:pStyle w:val="Compact"/>
+            </w:pPr>
+            <w:r>
+              <w:t xml:space="preserve">HXC-1963</w:t>
+            </w:r>
+          </w:p>
+        </w:tc>
+        <w:tc>
+          <w:tcPr/>
+          <w:p>
+            <w:pPr>
+              <w:pStyle w:val="Compact"/>
+            </w:pPr>
+            <w:r>
+              <w:t xml:space="preserve">Bug</w:t>
+            </w:r>
+          </w:p>
+        </w:tc>
+        <w:tc>
+          <w:tcPr/>
+          <w:p>
+            <w:pPr>
+              <w:pStyle w:val="Compact"/>
+            </w:pPr>
+            <w:r>
+              <w:t xml:space="preserve">P1</w:t>
+            </w:r>
+          </w:p>
+        </w:tc>
+        <w:tc>
+          <w:tcPr/>
+          <w:p>
+            <w:pPr>
+              <w:pStyle w:val="Compact"/>
+            </w:pPr>
+            <w:r>
+              <w:t xml:space="preserve">pkg/validator: a nil-pointer field stringifies to</w:t>
+            </w:r>
+            <w:r>
+              <w:t xml:space="preserve"> </w:t>
+            </w:r>
+            <w:r>
+              <w:t xml:space="preserve">‘</w:t>
+            </w:r>
+            <w:r>
+              <w:t xml:space="preserve">’</w:t>
+            </w:r>
+            <w:r>
+              <w:t xml:space="preserve"> </w:t>
+            </w:r>
+            <w:r>
+              <w:t xml:space="preserve">-&gt; required/min= fail open (missing field reported present)</w:t>
+            </w:r>
+          </w:p>
+        </w:tc>
+        <w:tc>
+          <w:tcPr/>
+          <w:p>
+            <w:pPr>
+              <w:pStyle w:val="Compact"/>
+            </w:pPr>
+          </w:p>
+        </w:tc>
+      </w:tr>
+      <w:tr>
+        <w:tc>
+          <w:tcPr/>
+          <w:p>
+            <w:pPr>
+              <w:pStyle w:val="Compact"/>
+            </w:pPr>
+            <w:r>
+              <w:t xml:space="preserve">HXC-1964</w:t>
+            </w:r>
+          </w:p>
+        </w:tc>
+        <w:tc>
+          <w:tcPr/>
+          <w:p>
+            <w:pPr>
+              <w:pStyle w:val="Compact"/>
+            </w:pPr>
+            <w:r>
+              <w:t xml:space="preserve">Bug</w:t>
+            </w:r>
+          </w:p>
+        </w:tc>
+        <w:tc>
+          <w:tcPr/>
+          <w:p>
+            <w:pPr>
+              <w:pStyle w:val="Compact"/>
+            </w:pPr>
+            <w:r>
+              <w:t xml:space="preserve">P1</w:t>
+            </w:r>
+          </w:p>
+        </w:tc>
+        <w:tc>
+          <w:tcPr/>
+          <w:p>
+            <w:pPr>
+              <w:pStyle w:val="Compact"/>
+            </w:pPr>
+            <w:r>
+              <w:t xml:space="preserve">pkg/costrouter: NaN/Inf objective poisons Route min-selection -&gt; mis-route (NaN seizes cheapest, -Inf bypass)</w:t>
+            </w:r>
+          </w:p>
+        </w:tc>
+        <w:tc>
+          <w:tcPr/>
+          <w:p>
+            <w:pPr>
+              <w:pStyle w:val="Compact"/>
+            </w:pPr>
+          </w:p>
+        </w:tc>
+      </w:tr>
+      <w:tr>
+        <w:tc>
+          <w:tcPr/>
+          <w:p>
+            <w:pPr>
+              <w:pStyle w:val="Compact"/>
+            </w:pPr>
+            <w:r>
+              <w:t xml:space="preserve">HXC-1965</w:t>
+            </w:r>
+          </w:p>
+        </w:tc>
+        <w:tc>
+          <w:tcPr/>
+          <w:p>
+            <w:pPr>
+              <w:pStyle w:val="Compact"/>
+            </w:pPr>
+            <w:r>
+              <w:t xml:space="preserve">Bug</w:t>
+            </w:r>
+          </w:p>
+        </w:tc>
+        <w:tc>
+          <w:tcPr/>
+          <w:p>
+            <w:pPr>
+              <w:pStyle w:val="Compact"/>
+            </w:pPr>
+            <w:r>
+              <w:t xml:space="preserve">P1</w:t>
+            </w:r>
+          </w:p>
+        </w:tc>
+        <w:tc>
+          <w:tcPr/>
+          <w:p>
+            <w:pPr>
+              <w:pStyle w:val="Compact"/>
+            </w:pPr>
+            <w:r>
+              <w:t xml:space="preserve">pkg/workloadrouter: NaN/Inf score breaks sort comparator (strict-weak-ordering) -&gt; poisoned offer seizes winner</w:t>
+            </w:r>
+          </w:p>
+        </w:tc>
+        <w:tc>
+          <w:tcPr/>
+          <w:p>
+            <w:pPr>
+              <w:pStyle w:val="Compact"/>
+            </w:pPr>
+          </w:p>
+        </w:tc>
+      </w:tr>
+      <w:tr>
+        <w:tc>
+          <w:tcPr/>
+          <w:p>
+            <w:pPr>
+              <w:pStyle w:val="Compact"/>
+            </w:pPr>
+            <w:r>
+              <w:t xml:space="preserve">HXC-1966</w:t>
+            </w:r>
+          </w:p>
+        </w:tc>
+        <w:tc>
+          <w:tcPr/>
+          <w:p>
+            <w:pPr>
+              <w:pStyle w:val="Compact"/>
+            </w:pPr>
+            <w:r>
+              <w:t xml:space="preserve">Task</w:t>
+            </w:r>
+          </w:p>
+        </w:tc>
+        <w:tc>
+          <w:tcPr/>
+          <w:p>
+            <w:pPr>
+              <w:pStyle w:val="Compact"/>
+            </w:pPr>
+            <w:r>
+              <w:t xml:space="preserve">P3</w:t>
+            </w:r>
+          </w:p>
+        </w:tc>
+        <w:tc>
+          <w:tcPr/>
+          <w:p>
+            <w:pPr>
+              <w:pStyle w:val="Compact"/>
+            </w:pPr>
+            <w:r>
+              <w:t xml:space="preserve">NaN-poison scan: pkg/gpucatalog + pkg/gravalverify (false positives; no caller float / uint ratio finite)</w:t>
             </w:r>
           </w:p>
         </w:tc>

</xml_diff>

<commit_message>
docs: docs_chain export sync for HXC-1971/1972 (CLAUDE-3)
Co-Authored-By: Claude Opus 4.8 (1M context) <noreply@anthropic.com>
</commit_message>
<xml_diff>
--- a/docs/export/fixed.docx
+++ b/docs/export/fixed.docx
@@ -34,7 +34,7 @@
         <w:t xml:space="preserve"> </w:t>
       </w:r>
       <w:r>
-        <w:t xml:space="preserve">243</w:t>
+        <w:t xml:space="preserve">246</w:t>
       </w:r>
       <w:r>
         <w:t xml:space="preserve"> </w:t>
@@ -50,7 +50,7 @@
         <w:t xml:space="preserve"> </w:t>
       </w:r>
       <w:r>
-        <w:t xml:space="preserve">2026-06-17T04:38:16Z</w:t>
+        <w:t xml:space="preserve">2026-06-17T04:57:41Z</w:t>
       </w:r>
       <w:r>
         <w:t xml:space="preserve"> </w:t>
@@ -116,7 +116,7 @@
           <w:b/>
           <w:bCs/>
         </w:rPr>
-        <w:t xml:space="preserve">860</w:t>
+        <w:t xml:space="preserve">866</w:t>
       </w:r>
       <w:r>
         <w:t xml:space="preserve">.</w:t>
@@ -44512,6 +44512,330 @@
             </w:pPr>
             <w:r>
               <w:t xml:space="preserve">NaN-poison scan: pkg/gpucatalog + pkg/gravalverify (false positives; no caller float / uint ratio finite)</w:t>
+            </w:r>
+          </w:p>
+        </w:tc>
+        <w:tc>
+          <w:tcPr/>
+          <w:p>
+            <w:pPr>
+              <w:pStyle w:val="Compact"/>
+            </w:pPr>
+          </w:p>
+        </w:tc>
+      </w:tr>
+      <w:tr>
+        <w:tc>
+          <w:tcPr/>
+          <w:p>
+            <w:pPr>
+              <w:pStyle w:val="Compact"/>
+            </w:pPr>
+            <w:r>
+              <w:t xml:space="preserve">HXC-1967</w:t>
+            </w:r>
+          </w:p>
+        </w:tc>
+        <w:tc>
+          <w:tcPr/>
+          <w:p>
+            <w:pPr>
+              <w:pStyle w:val="Compact"/>
+            </w:pPr>
+            <w:r>
+              <w:t xml:space="preserve">Task</w:t>
+            </w:r>
+          </w:p>
+        </w:tc>
+        <w:tc>
+          <w:tcPr/>
+          <w:p>
+            <w:pPr>
+              <w:pStyle w:val="Compact"/>
+            </w:pPr>
+            <w:r>
+              <w:t xml:space="preserve">P3</w:t>
+            </w:r>
+          </w:p>
+        </w:tc>
+        <w:tc>
+          <w:tcPr/>
+          <w:p>
+            <w:pPr>
+              <w:pStyle w:val="Compact"/>
+            </w:pPr>
+            <w:r>
+              <w:t xml:space="preserve">Path-traversal scan: internal/schema, internal/build/exec_builder, pkg/phase7matrix (false positives; defense-in-depth pinned)</w:t>
+            </w:r>
+          </w:p>
+        </w:tc>
+        <w:tc>
+          <w:tcPr/>
+          <w:p>
+            <w:pPr>
+              <w:pStyle w:val="Compact"/>
+            </w:pPr>
+          </w:p>
+        </w:tc>
+      </w:tr>
+      <w:tr>
+        <w:tc>
+          <w:tcPr/>
+          <w:p>
+            <w:pPr>
+              <w:pStyle w:val="Compact"/>
+            </w:pPr>
+            <w:r>
+              <w:t xml:space="preserve">HXC-1968</w:t>
+            </w:r>
+          </w:p>
+        </w:tc>
+        <w:tc>
+          <w:tcPr/>
+          <w:p>
+            <w:pPr>
+              <w:pStyle w:val="Compact"/>
+            </w:pPr>
+            <w:r>
+              <w:t xml:space="preserve">Bug</w:t>
+            </w:r>
+          </w:p>
+        </w:tc>
+        <w:tc>
+          <w:tcPr/>
+          <w:p>
+            <w:pPr>
+              <w:pStyle w:val="Compact"/>
+            </w:pPr>
+            <w:r>
+              <w:t xml:space="preserve">P1</w:t>
+            </w:r>
+          </w:p>
+        </w:tc>
+        <w:tc>
+          <w:tcPr/>
+          <w:p>
+            <w:pPr>
+              <w:pStyle w:val="Compact"/>
+            </w:pPr>
+            <w:r>
+              <w:t xml:space="preserve">pkg/session: Manager Create stores caller maps by reference + copySession shallow-copies Windows -&gt; caller mutation corrupts the store</w:t>
+            </w:r>
+          </w:p>
+        </w:tc>
+        <w:tc>
+          <w:tcPr/>
+          <w:p>
+            <w:pPr>
+              <w:pStyle w:val="Compact"/>
+            </w:pPr>
+          </w:p>
+        </w:tc>
+      </w:tr>
+      <w:tr>
+        <w:tc>
+          <w:tcPr/>
+          <w:p>
+            <w:pPr>
+              <w:pStyle w:val="Compact"/>
+            </w:pPr>
+            <w:r>
+              <w:t xml:space="preserve">HXC-1969</w:t>
+            </w:r>
+          </w:p>
+        </w:tc>
+        <w:tc>
+          <w:tcPr/>
+          <w:p>
+            <w:pPr>
+              <w:pStyle w:val="Compact"/>
+            </w:pPr>
+            <w:r>
+              <w:t xml:space="preserve">Bug</w:t>
+            </w:r>
+          </w:p>
+        </w:tc>
+        <w:tc>
+          <w:tcPr/>
+          <w:p>
+            <w:pPr>
+              <w:pStyle w:val="Compact"/>
+            </w:pPr>
+            <w:r>
+              <w:t xml:space="preserve">P1</w:t>
+            </w:r>
+          </w:p>
+        </w:tc>
+        <w:tc>
+          <w:tcPr/>
+          <w:p>
+            <w:pPr>
+              <w:pStyle w:val="Compact"/>
+            </w:pPr>
+            <w:r>
+              <w:t xml:space="preserve">internal/session: UpdateSession has no FSM guard -&gt; a terminated session can be resurrected to running (status bluff)</w:t>
+            </w:r>
+          </w:p>
+        </w:tc>
+        <w:tc>
+          <w:tcPr/>
+          <w:p>
+            <w:pPr>
+              <w:pStyle w:val="Compact"/>
+            </w:pPr>
+          </w:p>
+        </w:tc>
+      </w:tr>
+      <w:tr>
+        <w:tc>
+          <w:tcPr/>
+          <w:p>
+            <w:pPr>
+              <w:pStyle w:val="Compact"/>
+            </w:pPr>
+            <w:r>
+              <w:t xml:space="preserve">HXC-1970</w:t>
+            </w:r>
+          </w:p>
+        </w:tc>
+        <w:tc>
+          <w:tcPr/>
+          <w:p>
+            <w:pPr>
+              <w:pStyle w:val="Compact"/>
+            </w:pPr>
+            <w:r>
+              <w:t xml:space="preserve">Bug</w:t>
+            </w:r>
+          </w:p>
+        </w:tc>
+        <w:tc>
+          <w:tcPr/>
+          <w:p>
+            <w:pPr>
+              <w:pStyle w:val="Compact"/>
+            </w:pPr>
+            <w:r>
+              <w:t xml:space="preserve">P2</w:t>
+            </w:r>
+          </w:p>
+        </w:tc>
+        <w:tc>
+          <w:tcPr/>
+          <w:p>
+            <w:pPr>
+              <w:pStyle w:val="Compact"/>
+            </w:pPr>
+            <w:r>
+              <w:t xml:space="preserve">pkg/gpupool: deviceLess NaN breaks Select strict-weak-ordering -&gt; non-deterministic winner (violates deterministic-selection)</w:t>
+            </w:r>
+          </w:p>
+        </w:tc>
+        <w:tc>
+          <w:tcPr/>
+          <w:p>
+            <w:pPr>
+              <w:pStyle w:val="Compact"/>
+            </w:pPr>
+          </w:p>
+        </w:tc>
+      </w:tr>
+      <w:tr>
+        <w:tc>
+          <w:tcPr/>
+          <w:p>
+            <w:pPr>
+              <w:pStyle w:val="Compact"/>
+            </w:pPr>
+            <w:r>
+              <w:t xml:space="preserve">HXC-1971</w:t>
+            </w:r>
+          </w:p>
+        </w:tc>
+        <w:tc>
+          <w:tcPr/>
+          <w:p>
+            <w:pPr>
+              <w:pStyle w:val="Compact"/>
+            </w:pPr>
+            <w:r>
+              <w:t xml:space="preserve">Bug</w:t>
+            </w:r>
+          </w:p>
+        </w:tc>
+        <w:tc>
+          <w:tcPr/>
+          <w:p>
+            <w:pPr>
+              <w:pStyle w:val="Compact"/>
+            </w:pPr>
+            <w:r>
+              <w:t xml:space="preserve">P1</w:t>
+            </w:r>
+          </w:p>
+        </w:tc>
+        <w:tc>
+          <w:tcPr/>
+          <w:p>
+            <w:pPr>
+              <w:pStyle w:val="Compact"/>
+            </w:pPr>
+            <w:r>
+              <w:t xml:space="preserve">pkg/backfill: timeline end-time overflow (start+duration wraps negative) -&gt; fits() MISADMIT over a full region + timeline corruption</w:t>
+            </w:r>
+          </w:p>
+        </w:tc>
+        <w:tc>
+          <w:tcPr/>
+          <w:p>
+            <w:pPr>
+              <w:pStyle w:val="Compact"/>
+            </w:pPr>
+          </w:p>
+        </w:tc>
+      </w:tr>
+      <w:tr>
+        <w:tc>
+          <w:tcPr/>
+          <w:p>
+            <w:pPr>
+              <w:pStyle w:val="Compact"/>
+            </w:pPr>
+            <w:r>
+              <w:t xml:space="preserve">HXC-1972</w:t>
+            </w:r>
+          </w:p>
+        </w:tc>
+        <w:tc>
+          <w:tcPr/>
+          <w:p>
+            <w:pPr>
+              <w:pStyle w:val="Compact"/>
+            </w:pPr>
+            <w:r>
+              <w:t xml:space="preserve">Task</w:t>
+            </w:r>
+          </w:p>
+        </w:tc>
+        <w:tc>
+          <w:tcPr/>
+          <w:p>
+            <w:pPr>
+              <w:pStyle w:val="Compact"/>
+            </w:pPr>
+            <w:r>
+              <w:t xml:space="preserve">P3</w:t>
+            </w:r>
+          </w:p>
+        </w:tc>
+        <w:tc>
+          <w:tcPr/>
+          <w:p>
+            <w:pPr>
+              <w:pStyle w:val="Compact"/>
+            </w:pPr>
+            <w:r>
+              <w:t xml:space="preserve">Aliasing/correctness sweep: pkg/metering + pkg/cloudspot (no bug; value-return + drain-handler)</w:t>
             </w:r>
           </w:p>
         </w:tc>

</xml_diff>

<commit_message>
docs: docs_chain export sync for HXC-1977/1978/1979 (CLAUDE-3)
Co-Authored-By: Claude Opus 4.8 (1M context) <noreply@anthropic.com>
</commit_message>
<xml_diff>
--- a/docs/export/fixed.docx
+++ b/docs/export/fixed.docx
@@ -34,7 +34,7 @@
         <w:t xml:space="preserve"> </w:t>
       </w:r>
       <w:r>
-        <w:t xml:space="preserve">246</w:t>
+        <w:t xml:space="preserve">249</w:t>
       </w:r>
       <w:r>
         <w:t xml:space="preserve"> </w:t>
@@ -50,7 +50,7 @@
         <w:t xml:space="preserve"> </w:t>
       </w:r>
       <w:r>
-        <w:t xml:space="preserve">2026-06-17T04:57:41Z</w:t>
+        <w:t xml:space="preserve">2026-06-17T05:20:22Z</w:t>
       </w:r>
       <w:r>
         <w:t xml:space="preserve"> </w:t>
@@ -116,7 +116,7 @@
           <w:b/>
           <w:bCs/>
         </w:rPr>
-        <w:t xml:space="preserve">866</w:t>
+        <w:t xml:space="preserve">873</w:t>
       </w:r>
       <w:r>
         <w:t xml:space="preserve">.</w:t>
@@ -44836,6 +44836,384 @@
             </w:pPr>
             <w:r>
               <w:t xml:space="preserve">Aliasing/correctness sweep: pkg/metering + pkg/cloudspot (no bug; value-return + drain-handler)</w:t>
+            </w:r>
+          </w:p>
+        </w:tc>
+        <w:tc>
+          <w:tcPr/>
+          <w:p>
+            <w:pPr>
+              <w:pStyle w:val="Compact"/>
+            </w:pPr>
+          </w:p>
+        </w:tc>
+      </w:tr>
+      <w:tr>
+        <w:tc>
+          <w:tcPr/>
+          <w:p>
+            <w:pPr>
+              <w:pStyle w:val="Compact"/>
+            </w:pPr>
+            <w:r>
+              <w:t xml:space="preserve">HXC-1973</w:t>
+            </w:r>
+          </w:p>
+        </w:tc>
+        <w:tc>
+          <w:tcPr/>
+          <w:p>
+            <w:pPr>
+              <w:pStyle w:val="Compact"/>
+            </w:pPr>
+            <w:r>
+              <w:t xml:space="preserve">Task</w:t>
+            </w:r>
+          </w:p>
+        </w:tc>
+        <w:tc>
+          <w:tcPr/>
+          <w:p>
+            <w:pPr>
+              <w:pStyle w:val="Compact"/>
+            </w:pPr>
+            <w:r>
+              <w:t xml:space="preserve">P2</w:t>
+            </w:r>
+          </w:p>
+        </w:tc>
+        <w:tc>
+          <w:tcPr/>
+          <w:p>
+            <w:pPr>
+              <w:pStyle w:val="Compact"/>
+            </w:pPr>
+            <w:r>
+              <w:t xml:space="preserve">Re-audit: pkg/inferenceproxy + internal/advisory + pkg/auctionplace (no bug; mutex/value-return correct)</w:t>
+            </w:r>
+          </w:p>
+        </w:tc>
+        <w:tc>
+          <w:tcPr/>
+          <w:p>
+            <w:pPr>
+              <w:pStyle w:val="Compact"/>
+            </w:pPr>
+          </w:p>
+        </w:tc>
+      </w:tr>
+      <w:tr>
+        <w:tc>
+          <w:tcPr/>
+          <w:p>
+            <w:pPr>
+              <w:pStyle w:val="Compact"/>
+            </w:pPr>
+            <w:r>
+              <w:t xml:space="preserve">HXC-1974</w:t>
+            </w:r>
+          </w:p>
+        </w:tc>
+        <w:tc>
+          <w:tcPr/>
+          <w:p>
+            <w:pPr>
+              <w:pStyle w:val="Compact"/>
+            </w:pPr>
+            <w:r>
+              <w:t xml:space="preserve">Bug</w:t>
+            </w:r>
+          </w:p>
+        </w:tc>
+        <w:tc>
+          <w:tcPr/>
+          <w:p>
+            <w:pPr>
+              <w:pStyle w:val="Compact"/>
+            </w:pPr>
+            <w:r>
+              <w:t xml:space="preserve">P1</w:t>
+            </w:r>
+          </w:p>
+        </w:tc>
+        <w:tc>
+          <w:tcPr/>
+          <w:p>
+            <w:pPr>
+              <w:pStyle w:val="Compact"/>
+            </w:pPr>
+            <w:r>
+              <w:t xml:space="preserve">pkg/flowcontrol: duplicate-live-ID seat leak (mislabeled latent) -&gt; capacity permanently shrinks -&gt; starvation</w:t>
+            </w:r>
+          </w:p>
+        </w:tc>
+        <w:tc>
+          <w:tcPr/>
+          <w:p>
+            <w:pPr>
+              <w:pStyle w:val="Compact"/>
+            </w:pPr>
+          </w:p>
+        </w:tc>
+      </w:tr>
+      <w:tr>
+        <w:tc>
+          <w:tcPr/>
+          <w:p>
+            <w:pPr>
+              <w:pStyle w:val="Compact"/>
+            </w:pPr>
+            <w:r>
+              <w:t xml:space="preserve">HXC-1975</w:t>
+            </w:r>
+          </w:p>
+        </w:tc>
+        <w:tc>
+          <w:tcPr/>
+          <w:p>
+            <w:pPr>
+              <w:pStyle w:val="Compact"/>
+            </w:pPr>
+            <w:r>
+              <w:t xml:space="preserve">Bug</w:t>
+            </w:r>
+          </w:p>
+        </w:tc>
+        <w:tc>
+          <w:tcPr/>
+          <w:p>
+            <w:pPr>
+              <w:pStyle w:val="Compact"/>
+            </w:pPr>
+            <w:r>
+              <w:t xml:space="preserve">P1</w:t>
+            </w:r>
+          </w:p>
+        </w:tc>
+        <w:tc>
+          <w:tcPr/>
+          <w:p>
+            <w:pPr>
+              <w:pStyle w:val="Compact"/>
+            </w:pPr>
+            <w:r>
+              <w:t xml:space="preserve">pkg/constraints: score+bonus int overflow wraps negative -&gt; silent WRONG-NODE pick (err=nil), not just clean error</w:t>
+            </w:r>
+          </w:p>
+        </w:tc>
+        <w:tc>
+          <w:tcPr/>
+          <w:p>
+            <w:pPr>
+              <w:pStyle w:val="Compact"/>
+            </w:pPr>
+          </w:p>
+        </w:tc>
+      </w:tr>
+      <w:tr>
+        <w:tc>
+          <w:tcPr/>
+          <w:p>
+            <w:pPr>
+              <w:pStyle w:val="Compact"/>
+            </w:pPr>
+            <w:r>
+              <w:t xml:space="preserve">HXC-1976</w:t>
+            </w:r>
+          </w:p>
+        </w:tc>
+        <w:tc>
+          <w:tcPr/>
+          <w:p>
+            <w:pPr>
+              <w:pStyle w:val="Compact"/>
+            </w:pPr>
+            <w:r>
+              <w:t xml:space="preserve">Task</w:t>
+            </w:r>
+          </w:p>
+        </w:tc>
+        <w:tc>
+          <w:tcPr/>
+          <w:p>
+            <w:pPr>
+              <w:pStyle w:val="Compact"/>
+            </w:pPr>
+            <w:r>
+              <w:t xml:space="preserve">P3</w:t>
+            </w:r>
+          </w:p>
+        </w:tc>
+        <w:tc>
+          <w:tcPr/>
+          <w:p>
+            <w:pPr>
+              <w:pStyle w:val="Compact"/>
+            </w:pPr>
+            <w:r>
+              <w:t xml:space="preserve">Latent-risk verify: pkg/federation relay-after-unlock reorder CONFIRMED benign (receiver monotonic)</w:t>
+            </w:r>
+          </w:p>
+        </w:tc>
+        <w:tc>
+          <w:tcPr/>
+          <w:p>
+            <w:pPr>
+              <w:pStyle w:val="Compact"/>
+            </w:pPr>
+          </w:p>
+        </w:tc>
+      </w:tr>
+      <w:tr>
+        <w:tc>
+          <w:tcPr/>
+          <w:p>
+            <w:pPr>
+              <w:pStyle w:val="Compact"/>
+            </w:pPr>
+            <w:r>
+              <w:t xml:space="preserve">HXC-1977</w:t>
+            </w:r>
+          </w:p>
+        </w:tc>
+        <w:tc>
+          <w:tcPr/>
+          <w:p>
+            <w:pPr>
+              <w:pStyle w:val="Compact"/>
+            </w:pPr>
+            <w:r>
+              <w:t xml:space="preserve">Bug</w:t>
+            </w:r>
+          </w:p>
+        </w:tc>
+        <w:tc>
+          <w:tcPr/>
+          <w:p>
+            <w:pPr>
+              <w:pStyle w:val="Compact"/>
+            </w:pPr>
+            <w:r>
+              <w:t xml:space="preserve">P1</w:t>
+            </w:r>
+          </w:p>
+        </w:tc>
+        <w:tc>
+          <w:tcPr/>
+          <w:p>
+            <w:pPr>
+              <w:pStyle w:val="Compact"/>
+            </w:pPr>
+            <w:r>
+              <w:t xml:space="preserve">pkg/redundantexec: duplicate-WorkerID Sybil quorum forgery (mislabeled latent; existing test was a PASS-bluff)</w:t>
+            </w:r>
+          </w:p>
+        </w:tc>
+        <w:tc>
+          <w:tcPr/>
+          <w:p>
+            <w:pPr>
+              <w:pStyle w:val="Compact"/>
+            </w:pPr>
+          </w:p>
+        </w:tc>
+      </w:tr>
+      <w:tr>
+        <w:tc>
+          <w:tcPr/>
+          <w:p>
+            <w:pPr>
+              <w:pStyle w:val="Compact"/>
+            </w:pPr>
+            <w:r>
+              <w:t xml:space="preserve">HXC-1978</w:t>
+            </w:r>
+          </w:p>
+        </w:tc>
+        <w:tc>
+          <w:tcPr/>
+          <w:p>
+            <w:pPr>
+              <w:pStyle w:val="Compact"/>
+            </w:pPr>
+            <w:r>
+              <w:t xml:space="preserve">Bug</w:t>
+            </w:r>
+          </w:p>
+        </w:tc>
+        <w:tc>
+          <w:tcPr/>
+          <w:p>
+            <w:pPr>
+              <w:pStyle w:val="Compact"/>
+            </w:pPr>
+            <w:r>
+              <w:t xml:space="preserve">P1</w:t>
+            </w:r>
+          </w:p>
+        </w:tc>
+        <w:tc>
+          <w:tcPr/>
+          <w:p>
+            <w:pPr>
+              <w:pStyle w:val="Compact"/>
+            </w:pPr>
+            <w:r>
+              <w:t xml:space="preserve">pkg/idempotent: watermark lastSeq+1 int overflow at MaxInt -&gt; retry misclassified as GAP + phantom MinInt commit (exactly-once breach)</w:t>
+            </w:r>
+          </w:p>
+        </w:tc>
+        <w:tc>
+          <w:tcPr/>
+          <w:p>
+            <w:pPr>
+              <w:pStyle w:val="Compact"/>
+            </w:pPr>
+          </w:p>
+        </w:tc>
+      </w:tr>
+      <w:tr>
+        <w:tc>
+          <w:tcPr/>
+          <w:p>
+            <w:pPr>
+              <w:pStyle w:val="Compact"/>
+            </w:pPr>
+            <w:r>
+              <w:t xml:space="preserve">HXC-1979</w:t>
+            </w:r>
+          </w:p>
+        </w:tc>
+        <w:tc>
+          <w:tcPr/>
+          <w:p>
+            <w:pPr>
+              <w:pStyle w:val="Compact"/>
+            </w:pPr>
+            <w:r>
+              <w:t xml:space="preserve">Task</w:t>
+            </w:r>
+          </w:p>
+        </w:tc>
+        <w:tc>
+          <w:tcPr/>
+          <w:p>
+            <w:pPr>
+              <w:pStyle w:val="Compact"/>
+            </w:pPr>
+            <w:r>
+              <w:t xml:space="preserve">P3</w:t>
+            </w:r>
+          </w:p>
+        </w:tc>
+        <w:tc>
+          <w:tcPr/>
+          <w:p>
+            <w:pPr>
+              <w:pStyle w:val="Compact"/>
+            </w:pPr>
+            <w:r>
+              <w:t xml:space="preserve">Re-audit: pkg/gravaladmit (no bug; HMAC attestation gate fail-closed)</w:t>
             </w:r>
           </w:p>
         </w:tc>

</xml_diff>

<commit_message>
docs: docs_chain export sync for HXC-1987/1988 (CLAUDE-3)
Co-Authored-By: Claude Opus 4.8 (1M context) <noreply@anthropic.com>
</commit_message>
<xml_diff>
--- a/docs/export/fixed.docx
+++ b/docs/export/fixed.docx
@@ -34,7 +34,7 @@
         <w:t xml:space="preserve"> </w:t>
       </w:r>
       <w:r>
-        <w:t xml:space="preserve">249</w:t>
+        <w:t xml:space="preserve">253</w:t>
       </w:r>
       <w:r>
         <w:t xml:space="preserve"> </w:t>
@@ -50,7 +50,7 @@
         <w:t xml:space="preserve"> </w:t>
       </w:r>
       <w:r>
-        <w:t xml:space="preserve">2026-06-17T05:20:22Z</w:t>
+        <w:t xml:space="preserve">2026-06-17T05:49:22Z</w:t>
       </w:r>
       <w:r>
         <w:t xml:space="preserve"> </w:t>
@@ -116,7 +116,7 @@
           <w:b/>
           <w:bCs/>
         </w:rPr>
-        <w:t xml:space="preserve">873</w:t>
+        <w:t xml:space="preserve">882</w:t>
       </w:r>
       <w:r>
         <w:t xml:space="preserve">.</w:t>
@@ -45214,6 +45214,492 @@
             </w:pPr>
             <w:r>
               <w:t xml:space="preserve">Re-audit: pkg/gravaladmit (no bug; HMAC attestation gate fail-closed)</w:t>
+            </w:r>
+          </w:p>
+        </w:tc>
+        <w:tc>
+          <w:tcPr/>
+          <w:p>
+            <w:pPr>
+              <w:pStyle w:val="Compact"/>
+            </w:pPr>
+          </w:p>
+        </w:tc>
+      </w:tr>
+      <w:tr>
+        <w:tc>
+          <w:tcPr/>
+          <w:p>
+            <w:pPr>
+              <w:pStyle w:val="Compact"/>
+            </w:pPr>
+            <w:r>
+              <w:t xml:space="preserve">HXC-1980</w:t>
+            </w:r>
+          </w:p>
+        </w:tc>
+        <w:tc>
+          <w:tcPr/>
+          <w:p>
+            <w:pPr>
+              <w:pStyle w:val="Compact"/>
+            </w:pPr>
+            <w:r>
+              <w:t xml:space="preserve">Task</w:t>
+            </w:r>
+          </w:p>
+        </w:tc>
+        <w:tc>
+          <w:tcPr/>
+          <w:p>
+            <w:pPr>
+              <w:pStyle w:val="Compact"/>
+            </w:pPr>
+            <w:r>
+              <w:t xml:space="preserve">P3</w:t>
+            </w:r>
+          </w:p>
+        </w:tc>
+        <w:tc>
+          <w:tcPr/>
+          <w:p>
+            <w:pPr>
+              <w:pStyle w:val="Compact"/>
+            </w:pPr>
+            <w:r>
+              <w:t xml:space="preserve">Caller audit: netutil.IsPrivateIP / computeproto unsafe-decode / grpcutil demo interceptors — 3 latent risks CLEARED (zero prod callers)</w:t>
+            </w:r>
+          </w:p>
+        </w:tc>
+        <w:tc>
+          <w:tcPr/>
+          <w:p>
+            <w:pPr>
+              <w:pStyle w:val="Compact"/>
+            </w:pPr>
+          </w:p>
+        </w:tc>
+      </w:tr>
+      <w:tr>
+        <w:tc>
+          <w:tcPr/>
+          <w:p>
+            <w:pPr>
+              <w:pStyle w:val="Compact"/>
+            </w:pPr>
+            <w:r>
+              <w:t xml:space="preserve">HXC-1981</w:t>
+            </w:r>
+          </w:p>
+        </w:tc>
+        <w:tc>
+          <w:tcPr/>
+          <w:p>
+            <w:pPr>
+              <w:pStyle w:val="Compact"/>
+            </w:pPr>
+            <w:r>
+              <w:t xml:space="preserve">Bug</w:t>
+            </w:r>
+          </w:p>
+        </w:tc>
+        <w:tc>
+          <w:tcPr/>
+          <w:p>
+            <w:pPr>
+              <w:pStyle w:val="Compact"/>
+            </w:pPr>
+            <w:r>
+              <w:t xml:space="preserve">P1</w:t>
+            </w:r>
+          </w:p>
+        </w:tc>
+        <w:tc>
+          <w:tcPr/>
+          <w:p>
+            <w:pPr>
+              <w:pStyle w:val="Compact"/>
+            </w:pPr>
+            <w:r>
+              <w:t xml:space="preserve">pkg/forecast: OLS slope uncentered normal-equation form -&gt; catastrophic cancellation at large ticks flips sign -&gt; PreWarm suppressed on rising load</w:t>
+            </w:r>
+          </w:p>
+        </w:tc>
+        <w:tc>
+          <w:tcPr/>
+          <w:p>
+            <w:pPr>
+              <w:pStyle w:val="Compact"/>
+            </w:pPr>
+          </w:p>
+        </w:tc>
+      </w:tr>
+      <w:tr>
+        <w:tc>
+          <w:tcPr/>
+          <w:p>
+            <w:pPr>
+              <w:pStyle w:val="Compact"/>
+            </w:pPr>
+            <w:r>
+              <w:t xml:space="preserve">HXC-1982</w:t>
+            </w:r>
+          </w:p>
+        </w:tc>
+        <w:tc>
+          <w:tcPr/>
+          <w:p>
+            <w:pPr>
+              <w:pStyle w:val="Compact"/>
+            </w:pPr>
+            <w:r>
+              <w:t xml:space="preserve">Bug</w:t>
+            </w:r>
+          </w:p>
+        </w:tc>
+        <w:tc>
+          <w:tcPr/>
+          <w:p>
+            <w:pPr>
+              <w:pStyle w:val="Compact"/>
+            </w:pPr>
+            <w:r>
+              <w:t xml:space="preserve">P1</w:t>
+            </w:r>
+          </w:p>
+        </w:tc>
+        <w:tc>
+          <w:tcPr/>
+          <w:p>
+            <w:pPr>
+              <w:pStyle w:val="Compact"/>
+            </w:pPr>
+            <w:r>
+              <w:t xml:space="preserve">pkg/carbonsched: NaN latency bypasses the latency-eligibility filter (symmetric hole the carbon-NaN fix missed)</w:t>
+            </w:r>
+          </w:p>
+        </w:tc>
+        <w:tc>
+          <w:tcPr/>
+          <w:p>
+            <w:pPr>
+              <w:pStyle w:val="Compact"/>
+            </w:pPr>
+          </w:p>
+        </w:tc>
+      </w:tr>
+      <w:tr>
+        <w:tc>
+          <w:tcPr/>
+          <w:p>
+            <w:pPr>
+              <w:pStyle w:val="Compact"/>
+            </w:pPr>
+            <w:r>
+              <w:t xml:space="preserve">HXC-1983</w:t>
+            </w:r>
+          </w:p>
+        </w:tc>
+        <w:tc>
+          <w:tcPr/>
+          <w:p>
+            <w:pPr>
+              <w:pStyle w:val="Compact"/>
+            </w:pPr>
+            <w:r>
+              <w:t xml:space="preserve">Task</w:t>
+            </w:r>
+          </w:p>
+        </w:tc>
+        <w:tc>
+          <w:tcPr/>
+          <w:p>
+            <w:pPr>
+              <w:pStyle w:val="Compact"/>
+            </w:pPr>
+            <w:r>
+              <w:t xml:space="preserve">P3</w:t>
+            </w:r>
+          </w:p>
+        </w:tc>
+        <w:tc>
+          <w:tcPr/>
+          <w:p>
+            <w:pPr>
+              <w:pStyle w:val="Compact"/>
+            </w:pPr>
+            <w:r>
+              <w:t xml:space="preserve">Deep re-audit: pkg/balancemonitor (no bug; billing-balance poller, total_available fallback pinned)</w:t>
+            </w:r>
+          </w:p>
+        </w:tc>
+        <w:tc>
+          <w:tcPr/>
+          <w:p>
+            <w:pPr>
+              <w:pStyle w:val="Compact"/>
+            </w:pPr>
+          </w:p>
+        </w:tc>
+      </w:tr>
+      <w:tr>
+        <w:tc>
+          <w:tcPr/>
+          <w:p>
+            <w:pPr>
+              <w:pStyle w:val="Compact"/>
+            </w:pPr>
+            <w:r>
+              <w:t xml:space="preserve">HXC-1984</w:t>
+            </w:r>
+          </w:p>
+        </w:tc>
+        <w:tc>
+          <w:tcPr/>
+          <w:p>
+            <w:pPr>
+              <w:pStyle w:val="Compact"/>
+            </w:pPr>
+            <w:r>
+              <w:t xml:space="preserve">Bug</w:t>
+            </w:r>
+          </w:p>
+        </w:tc>
+        <w:tc>
+          <w:tcPr/>
+          <w:p>
+            <w:pPr>
+              <w:pStyle w:val="Compact"/>
+            </w:pPr>
+            <w:r>
+              <w:t xml:space="preserve">P1</w:t>
+            </w:r>
+          </w:p>
+        </w:tc>
+        <w:tc>
+          <w:tcPr/>
+          <w:p>
+            <w:pPr>
+              <w:pStyle w:val="Compact"/>
+            </w:pPr>
+            <w:r>
+              <w:t xml:space="preserve">pkg/ewmarank: New(alpha) clamp lets a NaN alpha through (symmetric hole the NaN-sample fix missed) -&gt; poisons EWMA on 2nd sample -&gt; mis-rank</w:t>
+            </w:r>
+          </w:p>
+        </w:tc>
+        <w:tc>
+          <w:tcPr/>
+          <w:p>
+            <w:pPr>
+              <w:pStyle w:val="Compact"/>
+            </w:pPr>
+          </w:p>
+        </w:tc>
+      </w:tr>
+      <w:tr>
+        <w:tc>
+          <w:tcPr/>
+          <w:p>
+            <w:pPr>
+              <w:pStyle w:val="Compact"/>
+            </w:pPr>
+            <w:r>
+              <w:t xml:space="preserve">HXC-1985</w:t>
+            </w:r>
+          </w:p>
+        </w:tc>
+        <w:tc>
+          <w:tcPr/>
+          <w:p>
+            <w:pPr>
+              <w:pStyle w:val="Compact"/>
+            </w:pPr>
+            <w:r>
+              <w:t xml:space="preserve">Bug</w:t>
+            </w:r>
+          </w:p>
+        </w:tc>
+        <w:tc>
+          <w:tcPr/>
+          <w:p>
+            <w:pPr>
+              <w:pStyle w:val="Compact"/>
+            </w:pPr>
+            <w:r>
+              <w:t xml:space="preserve">P1</w:t>
+            </w:r>
+          </w:p>
+        </w:tc>
+        <w:tc>
+          <w:tcPr/>
+          <w:p>
+            <w:pPr>
+              <w:pStyle w:val="Compact"/>
+            </w:pPr>
+            <w:r>
+              <w:t xml:space="preserve">pkg/rescorer: NaN-price sentinel (-Inf) COLLIDES with a legit +Inf-priced provider -&gt; tie -&gt; insertion-order-dependent rank</w:t>
+            </w:r>
+          </w:p>
+        </w:tc>
+        <w:tc>
+          <w:tcPr/>
+          <w:p>
+            <w:pPr>
+              <w:pStyle w:val="Compact"/>
+            </w:pPr>
+          </w:p>
+        </w:tc>
+      </w:tr>
+      <w:tr>
+        <w:tc>
+          <w:tcPr/>
+          <w:p>
+            <w:pPr>
+              <w:pStyle w:val="Compact"/>
+            </w:pPr>
+            <w:r>
+              <w:t xml:space="preserve">HXC-1986</w:t>
+            </w:r>
+          </w:p>
+        </w:tc>
+        <w:tc>
+          <w:tcPr/>
+          <w:p>
+            <w:pPr>
+              <w:pStyle w:val="Compact"/>
+            </w:pPr>
+            <w:r>
+              <w:t xml:space="preserve">Bug</w:t>
+            </w:r>
+          </w:p>
+        </w:tc>
+        <w:tc>
+          <w:tcPr/>
+          <w:p>
+            <w:pPr>
+              <w:pStyle w:val="Compact"/>
+            </w:pPr>
+            <w:r>
+              <w:t xml:space="preserve">P1</w:t>
+            </w:r>
+          </w:p>
+        </w:tc>
+        <w:tc>
+          <w:tcPr/>
+          <w:p>
+            <w:pPr>
+              <w:pStyle w:val="Compact"/>
+            </w:pPr>
+            <w:r>
+              <w:t xml:space="preserve">pkg/hlc: bumpLogical carry never guards physical==MaxInt64 -&gt; saturated remote wraps physical to MinInt64 -&gt; ~2^63ns backward clock jump (monotonicity violation)</w:t>
+            </w:r>
+          </w:p>
+        </w:tc>
+        <w:tc>
+          <w:tcPr/>
+          <w:p>
+            <w:pPr>
+              <w:pStyle w:val="Compact"/>
+            </w:pPr>
+          </w:p>
+        </w:tc>
+      </w:tr>
+      <w:tr>
+        <w:tc>
+          <w:tcPr/>
+          <w:p>
+            <w:pPr>
+              <w:pStyle w:val="Compact"/>
+            </w:pPr>
+            <w:r>
+              <w:t xml:space="preserve">HXC-1987</w:t>
+            </w:r>
+          </w:p>
+        </w:tc>
+        <w:tc>
+          <w:tcPr/>
+          <w:p>
+            <w:pPr>
+              <w:pStyle w:val="Compact"/>
+            </w:pPr>
+            <w:r>
+              <w:t xml:space="preserve">Bug</w:t>
+            </w:r>
+          </w:p>
+        </w:tc>
+        <w:tc>
+          <w:tcPr/>
+          <w:p>
+            <w:pPr>
+              <w:pStyle w:val="Compact"/>
+            </w:pPr>
+            <w:r>
+              <w:t xml:space="preserve">P1</w:t>
+            </w:r>
+          </w:p>
+        </w:tc>
+        <w:tc>
+          <w:tcPr/>
+          <w:p>
+            <w:pPr>
+              <w:pStyle w:val="Compact"/>
+            </w:pPr>
+            <w:r>
+              <w:t xml:space="preserve">pkg/retry: jitter add overflows int64 negative when MaxDelay==0 (second overflow the backoff-cap fix missed) -&gt; hot retry loop</w:t>
+            </w:r>
+          </w:p>
+        </w:tc>
+        <w:tc>
+          <w:tcPr/>
+          <w:p>
+            <w:pPr>
+              <w:pStyle w:val="Compact"/>
+            </w:pPr>
+          </w:p>
+        </w:tc>
+      </w:tr>
+      <w:tr>
+        <w:tc>
+          <w:tcPr/>
+          <w:p>
+            <w:pPr>
+              <w:pStyle w:val="Compact"/>
+            </w:pPr>
+            <w:r>
+              <w:t xml:space="preserve">HXC-1988</w:t>
+            </w:r>
+          </w:p>
+        </w:tc>
+        <w:tc>
+          <w:tcPr/>
+          <w:p>
+            <w:pPr>
+              <w:pStyle w:val="Compact"/>
+            </w:pPr>
+            <w:r>
+              <w:t xml:space="preserve">Task</w:t>
+            </w:r>
+          </w:p>
+        </w:tc>
+        <w:tc>
+          <w:tcPr/>
+          <w:p>
+            <w:pPr>
+              <w:pStyle w:val="Compact"/>
+            </w:pPr>
+            <w:r>
+              <w:t xml:space="preserve">P3</w:t>
+            </w:r>
+          </w:p>
+        </w:tc>
+        <w:tc>
+          <w:tcPr/>
+          <w:p>
+            <w:pPr>
+              <w:pStyle w:val="Compact"/>
+            </w:pPr>
+            <w:r>
+              <w:t xml:space="preserve">Incomplete-fix hunt: pkg/edge (latent symmetric fail-open, no caller) + pkg/classads (depth-cap COMPLETE)</w:t>
             </w:r>
           </w:p>
         </w:tc>

</xml_diff>

<commit_message>
docs: docs_chain export sync for HXC-1992/1993 (CLAUDE-3)
Co-Authored-By: Claude Opus 4.8 (1M context) <noreply@anthropic.com>
</commit_message>
<xml_diff>
--- a/docs/export/fixed.docx
+++ b/docs/export/fixed.docx
@@ -34,7 +34,7 @@
         <w:t xml:space="preserve"> </w:t>
       </w:r>
       <w:r>
-        <w:t xml:space="preserve">253</w:t>
+        <w:t xml:space="preserve">255</w:t>
       </w:r>
       <w:r>
         <w:t xml:space="preserve"> </w:t>
@@ -50,7 +50,7 @@
         <w:t xml:space="preserve"> </w:t>
       </w:r>
       <w:r>
-        <w:t xml:space="preserve">2026-06-17T05:49:22Z</w:t>
+        <w:t xml:space="preserve">2026-06-17T06:04:38Z</w:t>
       </w:r>
       <w:r>
         <w:t xml:space="preserve"> </w:t>
@@ -116,7 +116,7 @@
           <w:b/>
           <w:bCs/>
         </w:rPr>
-        <w:t xml:space="preserve">882</w:t>
+        <w:t xml:space="preserve">887</w:t>
       </w:r>
       <w:r>
         <w:t xml:space="preserve">.</w:t>
@@ -45700,6 +45700,276 @@
             </w:pPr>
             <w:r>
               <w:t xml:space="preserve">Incomplete-fix hunt: pkg/edge (latent symmetric fail-open, no caller) + pkg/classads (depth-cap COMPLETE)</w:t>
+            </w:r>
+          </w:p>
+        </w:tc>
+        <w:tc>
+          <w:tcPr/>
+          <w:p>
+            <w:pPr>
+              <w:pStyle w:val="Compact"/>
+            </w:pPr>
+          </w:p>
+        </w:tc>
+      </w:tr>
+      <w:tr>
+        <w:tc>
+          <w:tcPr/>
+          <w:p>
+            <w:pPr>
+              <w:pStyle w:val="Compact"/>
+            </w:pPr>
+            <w:r>
+              <w:t xml:space="preserve">HXC-1989</w:t>
+            </w:r>
+          </w:p>
+        </w:tc>
+        <w:tc>
+          <w:tcPr/>
+          <w:p>
+            <w:pPr>
+              <w:pStyle w:val="Compact"/>
+            </w:pPr>
+            <w:r>
+              <w:t xml:space="preserve">Bug</w:t>
+            </w:r>
+          </w:p>
+        </w:tc>
+        <w:tc>
+          <w:tcPr/>
+          <w:p>
+            <w:pPr>
+              <w:pStyle w:val="Compact"/>
+            </w:pPr>
+            <w:r>
+              <w:t xml:space="preserve">P1</w:t>
+            </w:r>
+          </w:p>
+        </w:tc>
+        <w:tc>
+          <w:tcPr/>
+          <w:p>
+            <w:pPr>
+              <w:pStyle w:val="Compact"/>
+            </w:pPr>
+            <w:r>
+              <w:t xml:space="preserve">pkg/helixnet: ProdNetwork.Receive select races a ready timer against a buffered message -&gt; already-arrived msg reported ErrTimeout ~50%</w:t>
+            </w:r>
+          </w:p>
+        </w:tc>
+        <w:tc>
+          <w:tcPr/>
+          <w:p>
+            <w:pPr>
+              <w:pStyle w:val="Compact"/>
+            </w:pPr>
+          </w:p>
+        </w:tc>
+      </w:tr>
+      <w:tr>
+        <w:tc>
+          <w:tcPr/>
+          <w:p>
+            <w:pPr>
+              <w:pStyle w:val="Compact"/>
+            </w:pPr>
+            <w:r>
+              <w:t xml:space="preserve">HXC-1990</w:t>
+            </w:r>
+          </w:p>
+        </w:tc>
+        <w:tc>
+          <w:tcPr/>
+          <w:p>
+            <w:pPr>
+              <w:pStyle w:val="Compact"/>
+            </w:pPr>
+            <w:r>
+              <w:t xml:space="preserve">Bug</w:t>
+            </w:r>
+          </w:p>
+        </w:tc>
+        <w:tc>
+          <w:tcPr/>
+          <w:p>
+            <w:pPr>
+              <w:pStyle w:val="Compact"/>
+            </w:pPr>
+            <w:r>
+              <w:t xml:space="preserve">P1</w:t>
+            </w:r>
+          </w:p>
+        </w:tc>
+        <w:tc>
+          <w:tcPr/>
+          <w:p>
+            <w:pPr>
+              <w:pStyle w:val="Compact"/>
+            </w:pPr>
+            <w:r>
+              <w:t xml:space="preserve">pkg/hxcregistry: Reconcile runs two autocommit UPDATEs (not in a tx) -&gt; a mid-way error leaves the registry half-reconciled</w:t>
+            </w:r>
+          </w:p>
+        </w:tc>
+        <w:tc>
+          <w:tcPr/>
+          <w:p>
+            <w:pPr>
+              <w:pStyle w:val="Compact"/>
+            </w:pPr>
+          </w:p>
+        </w:tc>
+      </w:tr>
+      <w:tr>
+        <w:tc>
+          <w:tcPr/>
+          <w:p>
+            <w:pPr>
+              <w:pStyle w:val="Compact"/>
+            </w:pPr>
+            <w:r>
+              <w:t xml:space="preserve">HXC-1991</w:t>
+            </w:r>
+          </w:p>
+        </w:tc>
+        <w:tc>
+          <w:tcPr/>
+          <w:p>
+            <w:pPr>
+              <w:pStyle w:val="Compact"/>
+            </w:pPr>
+            <w:r>
+              <w:t xml:space="preserve">Task</w:t>
+            </w:r>
+          </w:p>
+        </w:tc>
+        <w:tc>
+          <w:tcPr/>
+          <w:p>
+            <w:pPr>
+              <w:pStyle w:val="Compact"/>
+            </w:pPr>
+            <w:r>
+              <w:t xml:space="preserve">P3</w:t>
+            </w:r>
+          </w:p>
+        </w:tc>
+        <w:tc>
+          <w:tcPr/>
+          <w:p>
+            <w:pPr>
+              <w:pStyle w:val="Compact"/>
+            </w:pPr>
+            <w:r>
+              <w:t xml:space="preserve">Incomplete-fix hunt: pkg/gitops PlanRollingSync (dropped-apps fix COMPLETE; conservation/ordering/isolation verified)</w:t>
+            </w:r>
+          </w:p>
+        </w:tc>
+        <w:tc>
+          <w:tcPr/>
+          <w:p>
+            <w:pPr>
+              <w:pStyle w:val="Compact"/>
+            </w:pPr>
+          </w:p>
+        </w:tc>
+      </w:tr>
+      <w:tr>
+        <w:tc>
+          <w:tcPr/>
+          <w:p>
+            <w:pPr>
+              <w:pStyle w:val="Compact"/>
+            </w:pPr>
+            <w:r>
+              <w:t xml:space="preserve">HXC-1992</w:t>
+            </w:r>
+          </w:p>
+        </w:tc>
+        <w:tc>
+          <w:tcPr/>
+          <w:p>
+            <w:pPr>
+              <w:pStyle w:val="Compact"/>
+            </w:pPr>
+            <w:r>
+              <w:t xml:space="preserve">Bug</w:t>
+            </w:r>
+          </w:p>
+        </w:tc>
+        <w:tc>
+          <w:tcPr/>
+          <w:p>
+            <w:pPr>
+              <w:pStyle w:val="Compact"/>
+            </w:pPr>
+            <w:r>
+              <w:t xml:space="preserve">P1</w:t>
+            </w:r>
+          </w:p>
+        </w:tc>
+        <w:tc>
+          <w:tcPr/>
+          <w:p>
+            <w:pPr>
+              <w:pStyle w:val="Compact"/>
+            </w:pPr>
+            <w:r>
+              <w:t xml:space="preserve">pkg/deviceplugin: Device.Capabilities slice aliased between registry and callers -&gt; caller mutation corrupts committed inventory</w:t>
+            </w:r>
+          </w:p>
+        </w:tc>
+        <w:tc>
+          <w:tcPr/>
+          <w:p>
+            <w:pPr>
+              <w:pStyle w:val="Compact"/>
+            </w:pPr>
+          </w:p>
+        </w:tc>
+      </w:tr>
+      <w:tr>
+        <w:tc>
+          <w:tcPr/>
+          <w:p>
+            <w:pPr>
+              <w:pStyle w:val="Compact"/>
+            </w:pPr>
+            <w:r>
+              <w:t xml:space="preserve">HXC-1993</w:t>
+            </w:r>
+          </w:p>
+        </w:tc>
+        <w:tc>
+          <w:tcPr/>
+          <w:p>
+            <w:pPr>
+              <w:pStyle w:val="Compact"/>
+            </w:pPr>
+            <w:r>
+              <w:t xml:space="preserve">Task</w:t>
+            </w:r>
+          </w:p>
+        </w:tc>
+        <w:tc>
+          <w:tcPr/>
+          <w:p>
+            <w:pPr>
+              <w:pStyle w:val="Compact"/>
+            </w:pPr>
+            <w:r>
+              <w:t xml:space="preserve">P3</w:t>
+            </w:r>
+          </w:p>
+        </w:tc>
+        <w:tc>
+          <w:tcPr/>
+          <w:p>
+            <w:pPr>
+              <w:pStyle w:val="Compact"/>
+            </w:pPr>
+            <w:r>
+              <w:t xml:space="preserve">Re-audit: pkg/fedtrust + pkg/anticheat (no bug; fail-closed precedence + HMAC token binding)</w:t>
             </w:r>
           </w:p>
         </w:tc>

</xml_diff>